<commit_message>
Ekonomický vplyv akciových trhov
</commit_message>
<xml_diff>
--- a/Volatilita_Trhov_Luzak.docx
+++ b/Volatilita_Trhov_Luzak.docx
@@ -1722,9 +1722,6 @@
     <w:p>
       <w:pPr>
         <w:ind w:firstLine="0"/>
-        <w:rPr>
-          <w:color w:val="000000"/>
-        </w:rPr>
       </w:pPr>
     </w:p>
     <w:p>
@@ -1732,282 +1729,13 @@
         <w:pStyle w:val="Nadpis3"/>
       </w:pPr>
       <w:r>
-        <w:t>1.1.2</w:t>
-      </w:r>
-      <w:r>
-        <w:tab/>
-        <w:t>Analýza akciových trhov</w:t>
-      </w:r>
-    </w:p>
-    <w:p>
-      <w:pPr>
-        <w:ind w:firstLine="0"/>
-        <w:rPr>
-          <w:color w:val="000000"/>
-        </w:rPr>
-      </w:pPr>
-      <w:r>
-        <w:rPr>
-          <w:color w:val="000000"/>
-        </w:rPr>
-        <w:tab/>
-        <w:t xml:space="preserve">Analýza akciových trhov a cenového vývoja je veľmi náročná, keďže trhy majú dynamickú a nelineárnu povahu. </w:t>
-      </w:r>
-      <w:r>
-        <w:rPr>
-          <w:color w:val="000000"/>
-        </w:rPr>
-        <w:t>V analýze ide hlavne o tri základné aspekty</w:t>
-      </w:r>
-      <w:r>
-        <w:rPr>
-          <w:color w:val="000000"/>
-        </w:rPr>
-        <w:t xml:space="preserve"> </w:t>
-      </w:r>
-      <w:sdt>
-        <w:sdtPr>
-          <w:rPr>
-            <w:color w:val="000000"/>
-          </w:rPr>
-          <w:tag w:val="MENDELEY_CITATION_v3_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"/>
-          <w:id w:val="1364324382"/>
-          <w:placeholder>
-            <w:docPart w:val="DefaultPlaceholder_-1854013440"/>
-          </w:placeholder>
-        </w:sdtPr>
-        <w:sdtContent>
-          <w:r>
-            <w:rPr>
-              <w:color w:val="000000"/>
-            </w:rPr>
-            <w:t>(</w:t>
-          </w:r>
-          <w:proofErr w:type="spellStart"/>
-          <w:r>
-            <w:rPr>
-              <w:color w:val="000000"/>
-            </w:rPr>
-            <w:t>Shah</w:t>
-          </w:r>
-          <w:proofErr w:type="spellEnd"/>
-          <w:r>
-            <w:rPr>
-              <w:color w:val="000000"/>
-            </w:rPr>
-            <w:t xml:space="preserve"> et al., 2019)</w:t>
-          </w:r>
-        </w:sdtContent>
-      </w:sdt>
-      <w:r>
-        <w:rPr>
-          <w:color w:val="000000"/>
-        </w:rPr>
-        <w:t>:</w:t>
-      </w:r>
-    </w:p>
-    <w:p>
-      <w:pPr>
-        <w:pStyle w:val="Odsekzoznamu"/>
-      </w:pPr>
-      <w:r>
-        <w:t>Makroekonomická analýza (hrubý domáci produkt a index spotrebiteľských cien),</w:t>
-      </w:r>
-    </w:p>
-    <w:p>
-      <w:pPr>
-        <w:pStyle w:val="Odsekzoznamu"/>
-      </w:pPr>
-      <w:r>
-        <w:t>a</w:t>
-      </w:r>
-      <w:r>
-        <w:t>nalýza odvetvia</w:t>
-      </w:r>
-      <w:r>
-        <w:t xml:space="preserve"> </w:t>
-      </w:r>
-      <w:r>
-        <w:rPr>
-          <w:lang w:val="en-US"/>
-        </w:rPr>
-        <w:t>(</w:t>
-      </w:r>
-      <w:proofErr w:type="spellStart"/>
-      <w:r>
-        <w:rPr>
-          <w:lang w:val="en-US"/>
-        </w:rPr>
-        <w:t>odhad</w:t>
-      </w:r>
-      <w:proofErr w:type="spellEnd"/>
-      <w:r>
-        <w:rPr>
-          <w:lang w:val="en-US"/>
-        </w:rPr>
-        <w:t xml:space="preserve"> </w:t>
-      </w:r>
-      <w:proofErr w:type="spellStart"/>
-      <w:r>
-        <w:rPr>
-          <w:lang w:val="en-US"/>
-        </w:rPr>
-        <w:t>hodnoty</w:t>
-      </w:r>
-      <w:proofErr w:type="spellEnd"/>
-      <w:r>
-        <w:rPr>
-          <w:lang w:val="en-US"/>
-        </w:rPr>
-        <w:t xml:space="preserve"> </w:t>
-      </w:r>
-      <w:proofErr w:type="spellStart"/>
-      <w:r>
-        <w:rPr>
-          <w:lang w:val="en-US"/>
-        </w:rPr>
-        <w:t>spolo</w:t>
-      </w:r>
-      <w:proofErr w:type="spellEnd"/>
-      <w:r>
-        <w:t>čnosti na základe aktuálneho stavu a budúcich p</w:t>
-      </w:r>
-      <w:r>
-        <w:t>rospektov</w:t>
-      </w:r>
-      <w:r>
-        <w:rPr>
-          <w:lang w:val="en-US"/>
-        </w:rPr>
-        <w:t>)</w:t>
-      </w:r>
-      <w:r>
-        <w:rPr>
-          <w:lang w:val="en-US"/>
-        </w:rPr>
-        <w:t>,</w:t>
-      </w:r>
-    </w:p>
-    <w:p>
-      <w:pPr>
-        <w:pStyle w:val="Odsekzoznamu"/>
-      </w:pPr>
-      <w:proofErr w:type="spellStart"/>
-      <w:r>
-        <w:rPr>
-          <w:lang w:val="en-US"/>
-        </w:rPr>
-        <w:t>analýza</w:t>
-      </w:r>
-      <w:proofErr w:type="spellEnd"/>
-      <w:r>
-        <w:rPr>
-          <w:lang w:val="en-US"/>
-        </w:rPr>
-        <w:t xml:space="preserve"> </w:t>
-      </w:r>
-      <w:proofErr w:type="spellStart"/>
-      <w:r>
-        <w:rPr>
-          <w:lang w:val="en-US"/>
-        </w:rPr>
-        <w:t>spoločnosti</w:t>
-      </w:r>
-      <w:proofErr w:type="spellEnd"/>
-      <w:r>
-        <w:rPr>
-          <w:lang w:val="en-US"/>
-        </w:rPr>
-        <w:t xml:space="preserve"> (s </w:t>
-      </w:r>
-      <w:proofErr w:type="spellStart"/>
-      <w:r>
-        <w:rPr>
-          <w:lang w:val="en-US"/>
-        </w:rPr>
-        <w:t>cie</w:t>
-      </w:r>
-      <w:r>
-        <w:t>ľom</w:t>
-      </w:r>
-      <w:proofErr w:type="spellEnd"/>
-      <w:r>
-        <w:t xml:space="preserve"> vyhodnotiť jej hodnotu</w:t>
-      </w:r>
-      <w:r>
-        <w:rPr>
-          <w:lang w:val="en-US"/>
-        </w:rPr>
-        <w:t>).</w:t>
-      </w:r>
-    </w:p>
-    <w:p>
-      <w:pPr>
-        <w:rPr>
-          <w:color w:val="000000"/>
-        </w:rPr>
-      </w:pPr>
-      <w:r>
-        <w:t xml:space="preserve">Existuje niekoľko teórii týkajúcich sa akciových trhov, ktoré sa snažia vysvetliť správanie trhov, alebo objasniť, či je trhy možné prekonať </w:t>
-      </w:r>
-      <w:sdt>
-        <w:sdtPr>
-          <w:rPr>
-            <w:color w:val="000000"/>
-          </w:rPr>
-          <w:tag w:val="MENDELEY_CITATION_v3_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"/>
-          <w:id w:val="-493875876"/>
-          <w:placeholder>
-            <w:docPart w:val="DefaultPlaceholder_-1854013440"/>
-          </w:placeholder>
-        </w:sdtPr>
-        <w:sdtContent>
-          <w:r>
-            <w:rPr>
-              <w:color w:val="000000"/>
-            </w:rPr>
-            <w:t>(</w:t>
-          </w:r>
-          <w:proofErr w:type="spellStart"/>
-          <w:r>
-            <w:rPr>
-              <w:color w:val="000000"/>
-            </w:rPr>
-            <w:t>Shah</w:t>
-          </w:r>
-          <w:proofErr w:type="spellEnd"/>
-          <w:r>
-            <w:rPr>
-              <w:color w:val="000000"/>
-            </w:rPr>
-            <w:t xml:space="preserve"> et al., 2019)</w:t>
-          </w:r>
-        </w:sdtContent>
-      </w:sdt>
-      <w:r>
-        <w:rPr>
-          <w:color w:val="000000"/>
-        </w:rPr>
-        <w:t>.</w:t>
-      </w:r>
-    </w:p>
-    <w:p>
-      <w:pPr>
-        <w:ind w:firstLine="0"/>
-      </w:pPr>
-    </w:p>
-    <w:p>
-      <w:pPr>
-        <w:pStyle w:val="Nadpis3"/>
-      </w:pPr>
-      <w:r>
         <w:t>1.</w:t>
       </w:r>
       <w:r>
         <w:t>1.</w:t>
       </w:r>
       <w:r>
-        <w:t>3</w:t>
+        <w:t>2</w:t>
       </w:r>
       <w:r>
         <w:tab/>
@@ -2094,6 +1822,9 @@
     <w:p>
       <w:pPr>
         <w:ind w:firstLine="0"/>
+        <w:rPr>
+          <w:color w:val="000000"/>
+        </w:rPr>
       </w:pPr>
       <w:r>
         <w:tab/>
@@ -2125,11 +1856,7 @@
       </w:r>
       <w:proofErr w:type="spellEnd"/>
       <w:r>
-        <w:t xml:space="preserve">“, ktorý charakterizuje cenový rad tak, že všetky cenové zmeny predstavujú náhodné odchýlky od </w:t>
-      </w:r>
-      <w:r>
-        <w:lastRenderedPageBreak/>
-        <w:t xml:space="preserve">predchádzajúcich cien. To znamená, že ak sú dostupné všetky informácie a okamžite sa odrážajú v cenách akcii, zajtrajšia zmena bude odrážať iba zajtrajšie správy a bude nezávislá od dnešných zmien. Keďže správy sú nepredvídateľné, výsledné zmeny cien sú rovnako nepredvídateľné a náhodné </w:t>
+        <w:t xml:space="preserve">“, ktorý charakterizuje cenový rad tak, že všetky cenové zmeny predstavujú náhodné odchýlky od predchádzajúcich cien. To znamená, že ak sú dostupné všetky informácie a okamžite sa odrážajú v cenách akcii, zajtrajšia zmena bude odrážať iba zajtrajšie správy a bude nezávislá od dnešných zmien. Keďže správy sú nepredvídateľné, výsledné zmeny cien sú rovnako nepredvídateľné a náhodné </w:t>
       </w:r>
       <w:sdt>
         <w:sdtPr>
@@ -2175,6 +1902,513 @@
     <w:p>
       <w:pPr>
         <w:ind w:firstLine="0"/>
+        <w:rPr>
+          <w:color w:val="000000"/>
+        </w:rPr>
+      </w:pPr>
+    </w:p>
+    <w:p>
+      <w:pPr>
+        <w:pStyle w:val="Nadpis3"/>
+      </w:pPr>
+      <w:r>
+        <w:t>1.1.</w:t>
+      </w:r>
+      <w:r>
+        <w:t>3</w:t>
+      </w:r>
+      <w:r>
+        <w:tab/>
+        <w:t>Ekonomický význam akciových trhov</w:t>
+      </w:r>
+    </w:p>
+    <w:p>
+      <w:pPr>
+        <w:ind w:firstLine="0"/>
+        <w:rPr>
+          <w:color w:val="000000"/>
+        </w:rPr>
+      </w:pPr>
+      <w:r>
+        <w:rPr>
+          <w:color w:val="000000"/>
+        </w:rPr>
+        <w:tab/>
+        <w:t>Podľa teoretickej literatúry akciové trhy hrajú ekonomickú rolu v týchto oblastiach:</w:t>
+      </w:r>
+    </w:p>
+    <w:p>
+      <w:pPr>
+        <w:pStyle w:val="Odsekzoznamu"/>
+      </w:pPr>
+      <w:r>
+        <w:t>Likvidita,</w:t>
+      </w:r>
+    </w:p>
+    <w:p>
+      <w:pPr>
+        <w:pStyle w:val="Odsekzoznamu"/>
+      </w:pPr>
+      <w:r>
+        <w:t>diverzifikácia rizika,</w:t>
+      </w:r>
+    </w:p>
+    <w:p>
+      <w:pPr>
+        <w:pStyle w:val="Odsekzoznamu"/>
+      </w:pPr>
+      <w:r>
+        <w:t>získavanie informácii o firmách,</w:t>
+      </w:r>
+    </w:p>
+    <w:p>
+      <w:pPr>
+        <w:pStyle w:val="Odsekzoznamu"/>
+      </w:pPr>
+      <w:r>
+        <w:t>kontrola nad spoločnosťami,</w:t>
+      </w:r>
+    </w:p>
+    <w:p>
+      <w:pPr>
+        <w:pStyle w:val="Odsekzoznamu"/>
+      </w:pPr>
+      <w:r>
+        <w:lastRenderedPageBreak/>
+        <w:t>mobilizácia úspor.</w:t>
+      </w:r>
+    </w:p>
+    <w:p>
+      <w:pPr>
+        <w:rPr>
+          <w:color w:val="000000"/>
+        </w:rPr>
+      </w:pPr>
+      <w:r>
+        <w:t xml:space="preserve">Niektoré modely naznačujú, že akciové trhy spomaľujú ekonomický rast, pričom iné modely poukazujú na pozitívny vzťah medzi ekonomickým rastom a akciovými trhmi </w:t>
+      </w:r>
+      <w:sdt>
+        <w:sdtPr>
+          <w:rPr>
+            <w:color w:val="000000"/>
+          </w:rPr>
+          <w:tag w:val="MENDELEY_CITATION_v3_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"/>
+          <w:id w:val="1457446129"/>
+          <w:placeholder>
+            <w:docPart w:val="DefaultPlaceholder_-1854013440"/>
+          </w:placeholder>
+        </w:sdtPr>
+        <w:sdtContent>
+          <w:r>
+            <w:rPr>
+              <w:color w:val="000000"/>
+            </w:rPr>
+            <w:t>(</w:t>
+          </w:r>
+          <w:proofErr w:type="spellStart"/>
+          <w:r>
+            <w:rPr>
+              <w:color w:val="000000"/>
+            </w:rPr>
+            <w:t>Levine</w:t>
+          </w:r>
+          <w:proofErr w:type="spellEnd"/>
+          <w:r>
+            <w:rPr>
+              <w:color w:val="000000"/>
+            </w:rPr>
+            <w:t xml:space="preserve"> &amp; </w:t>
+          </w:r>
+          <w:proofErr w:type="spellStart"/>
+          <w:r>
+            <w:rPr>
+              <w:color w:val="000000"/>
+            </w:rPr>
+            <w:t>Zervos</w:t>
+          </w:r>
+          <w:proofErr w:type="spellEnd"/>
+          <w:r>
+            <w:rPr>
+              <w:color w:val="000000"/>
+            </w:rPr>
+            <w:t>, 1996)</w:t>
+          </w:r>
+        </w:sdtContent>
+      </w:sdt>
+      <w:r>
+        <w:rPr>
+          <w:color w:val="000000"/>
+        </w:rPr>
+        <w:t>.</w:t>
+      </w:r>
+    </w:p>
+    <w:p>
+      <w:pPr>
+        <w:rPr>
+          <w:color w:val="000000"/>
+        </w:rPr>
+      </w:pPr>
+      <w:r>
+        <w:rPr>
+          <w:color w:val="000000"/>
+        </w:rPr>
+        <w:t xml:space="preserve">Autori článku </w:t>
+      </w:r>
+      <w:sdt>
+        <w:sdtPr>
+          <w:rPr>
+            <w:color w:val="000000"/>
+          </w:rPr>
+          <w:tag w:val="MENDELEY_CITATION_v3_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"/>
+          <w:id w:val="1718320412"/>
+          <w:placeholder>
+            <w:docPart w:val="DefaultPlaceholder_-1854013440"/>
+          </w:placeholder>
+        </w:sdtPr>
+        <w:sdtContent>
+          <w:r>
+            <w:rPr>
+              <w:color w:val="000000"/>
+            </w:rPr>
+            <w:t>(</w:t>
+          </w:r>
+          <w:proofErr w:type="spellStart"/>
+          <w:r>
+            <w:rPr>
+              <w:color w:val="000000"/>
+            </w:rPr>
+            <w:t>Levine</w:t>
+          </w:r>
+          <w:proofErr w:type="spellEnd"/>
+          <w:r>
+            <w:rPr>
+              <w:color w:val="000000"/>
+            </w:rPr>
+            <w:t xml:space="preserve"> &amp; </w:t>
+          </w:r>
+          <w:proofErr w:type="spellStart"/>
+          <w:r>
+            <w:rPr>
+              <w:color w:val="000000"/>
+            </w:rPr>
+            <w:t>Zervos</w:t>
+          </w:r>
+          <w:proofErr w:type="spellEnd"/>
+          <w:r>
+            <w:rPr>
+              <w:color w:val="000000"/>
+            </w:rPr>
+            <w:t>, 1996)</w:t>
+          </w:r>
+        </w:sdtContent>
+      </w:sdt>
+      <w:r>
+        <w:rPr>
+          <w:color w:val="000000"/>
+        </w:rPr>
+        <w:t xml:space="preserve"> metódami</w:t>
+      </w:r>
+      <w:r>
+        <w:rPr>
+          <w:color w:val="000000"/>
+        </w:rPr>
+        <w:t xml:space="preserve"> regresn</w:t>
+      </w:r>
+      <w:r>
+        <w:rPr>
+          <w:color w:val="000000"/>
+        </w:rPr>
+        <w:t>ej</w:t>
+      </w:r>
+      <w:r>
+        <w:rPr>
+          <w:color w:val="000000"/>
+        </w:rPr>
+        <w:t xml:space="preserve"> analýz</w:t>
+      </w:r>
+      <w:r>
+        <w:rPr>
+          <w:color w:val="000000"/>
+        </w:rPr>
+        <w:t>y</w:t>
+      </w:r>
+      <w:r>
+        <w:rPr>
+          <w:color w:val="000000"/>
+        </w:rPr>
+        <w:t xml:space="preserve"> empirických dát preukázali, že akciové trhy majú pozitívny vplyv na ekonomický rast. Taktiež metódy </w:t>
+      </w:r>
+      <w:r>
+        <w:rPr>
+          <w:color w:val="000000"/>
+        </w:rPr>
+        <w:t xml:space="preserve">založené na inštrumentálnych premenných poukazujú na silnú závislosť medzi vývojom akciového trhu a dlhodobým hospodárskym rastom. </w:t>
+      </w:r>
+    </w:p>
+    <w:p/>
+    <w:p>
+      <w:pPr>
+        <w:pStyle w:val="Nadpis3"/>
+      </w:pPr>
+      <w:r>
+        <w:t>1.1.4</w:t>
+      </w:r>
+      <w:r>
+        <w:tab/>
+        <w:t>Analýza akciových trhov</w:t>
+      </w:r>
+    </w:p>
+    <w:p>
+      <w:pPr>
+        <w:ind w:firstLine="0"/>
+        <w:rPr>
+          <w:color w:val="000000"/>
+        </w:rPr>
+      </w:pPr>
+      <w:r>
+        <w:rPr>
+          <w:color w:val="000000"/>
+        </w:rPr>
+        <w:tab/>
+        <w:t xml:space="preserve">Analýza akciových trhov a cenového vývoja je veľmi náročná, keďže trhy majú dynamickú a nelineárnu povahu. </w:t>
+      </w:r>
+      <w:r>
+        <w:rPr>
+          <w:color w:val="000000"/>
+        </w:rPr>
+        <w:t>V analýze ide hlavne o tri základné aspekty</w:t>
+      </w:r>
+      <w:r>
+        <w:rPr>
+          <w:color w:val="000000"/>
+        </w:rPr>
+        <w:t xml:space="preserve"> </w:t>
+      </w:r>
+      <w:sdt>
+        <w:sdtPr>
+          <w:rPr>
+            <w:color w:val="000000"/>
+          </w:rPr>
+          <w:tag w:val="MENDELEY_CITATION_v3_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"/>
+          <w:id w:val="1364324382"/>
+          <w:placeholder>
+            <w:docPart w:val="769F832CC28340CE891B17C23E204D23"/>
+          </w:placeholder>
+        </w:sdtPr>
+        <w:sdtContent>
+          <w:r>
+            <w:rPr>
+              <w:color w:val="000000"/>
+            </w:rPr>
+            <w:t>(</w:t>
+          </w:r>
+          <w:proofErr w:type="spellStart"/>
+          <w:r>
+            <w:rPr>
+              <w:color w:val="000000"/>
+            </w:rPr>
+            <w:t>Shah</w:t>
+          </w:r>
+          <w:proofErr w:type="spellEnd"/>
+          <w:r>
+            <w:rPr>
+              <w:color w:val="000000"/>
+            </w:rPr>
+            <w:t xml:space="preserve"> et al., 2019)</w:t>
+          </w:r>
+        </w:sdtContent>
+      </w:sdt>
+      <w:r>
+        <w:rPr>
+          <w:color w:val="000000"/>
+        </w:rPr>
+        <w:t>:</w:t>
+      </w:r>
+    </w:p>
+    <w:p>
+      <w:pPr>
+        <w:pStyle w:val="Odsekzoznamu"/>
+      </w:pPr>
+      <w:r>
+        <w:t>Makroekonomická analýza (hrubý domáci produkt a index spotrebiteľských cien),</w:t>
+      </w:r>
+    </w:p>
+    <w:p>
+      <w:pPr>
+        <w:pStyle w:val="Odsekzoznamu"/>
+      </w:pPr>
+      <w:r>
+        <w:t>a</w:t>
+      </w:r>
+      <w:r>
+        <w:t>nalýza odvetvia</w:t>
+      </w:r>
+      <w:r>
+        <w:t xml:space="preserve"> </w:t>
+      </w:r>
+      <w:r>
+        <w:rPr>
+          <w:lang w:val="en-US"/>
+        </w:rPr>
+        <w:t>(</w:t>
+      </w:r>
+      <w:proofErr w:type="spellStart"/>
+      <w:r>
+        <w:rPr>
+          <w:lang w:val="en-US"/>
+        </w:rPr>
+        <w:t>odhad</w:t>
+      </w:r>
+      <w:proofErr w:type="spellEnd"/>
+      <w:r>
+        <w:rPr>
+          <w:lang w:val="en-US"/>
+        </w:rPr>
+        <w:t xml:space="preserve"> </w:t>
+      </w:r>
+      <w:proofErr w:type="spellStart"/>
+      <w:r>
+        <w:rPr>
+          <w:lang w:val="en-US"/>
+        </w:rPr>
+        <w:t>hodnoty</w:t>
+      </w:r>
+      <w:proofErr w:type="spellEnd"/>
+      <w:r>
+        <w:rPr>
+          <w:lang w:val="en-US"/>
+        </w:rPr>
+        <w:t xml:space="preserve"> </w:t>
+      </w:r>
+      <w:proofErr w:type="spellStart"/>
+      <w:r>
+        <w:rPr>
+          <w:lang w:val="en-US"/>
+        </w:rPr>
+        <w:t>spolo</w:t>
+      </w:r>
+      <w:proofErr w:type="spellEnd"/>
+      <w:r>
+        <w:t>čnosti na základe aktuálneho stavu a budúcich prospektov</w:t>
+      </w:r>
+      <w:r>
+        <w:rPr>
+          <w:lang w:val="en-US"/>
+        </w:rPr>
+        <w:t>),</w:t>
+      </w:r>
+    </w:p>
+    <w:p>
+      <w:pPr>
+        <w:pStyle w:val="Odsekzoznamu"/>
+      </w:pPr>
+      <w:proofErr w:type="spellStart"/>
+      <w:r>
+        <w:rPr>
+          <w:lang w:val="en-US"/>
+        </w:rPr>
+        <w:t>analýza</w:t>
+      </w:r>
+      <w:proofErr w:type="spellEnd"/>
+      <w:r>
+        <w:rPr>
+          <w:lang w:val="en-US"/>
+        </w:rPr>
+        <w:t xml:space="preserve"> </w:t>
+      </w:r>
+      <w:proofErr w:type="spellStart"/>
+      <w:r>
+        <w:rPr>
+          <w:lang w:val="en-US"/>
+        </w:rPr>
+        <w:t>spoločnosti</w:t>
+      </w:r>
+      <w:proofErr w:type="spellEnd"/>
+      <w:r>
+        <w:rPr>
+          <w:lang w:val="en-US"/>
+        </w:rPr>
+        <w:t xml:space="preserve"> (s </w:t>
+      </w:r>
+      <w:proofErr w:type="spellStart"/>
+      <w:r>
+        <w:rPr>
+          <w:lang w:val="en-US"/>
+        </w:rPr>
+        <w:t>cie</w:t>
+      </w:r>
+      <w:r>
+        <w:t>ľom</w:t>
+      </w:r>
+      <w:proofErr w:type="spellEnd"/>
+      <w:r>
+        <w:t xml:space="preserve"> vyhodnotiť jej hodnotu</w:t>
+      </w:r>
+      <w:r>
+        <w:rPr>
+          <w:lang w:val="en-US"/>
+        </w:rPr>
+        <w:t>).</w:t>
+      </w:r>
+    </w:p>
+    <w:p>
+      <w:pPr>
+        <w:rPr>
+          <w:color w:val="000000"/>
+        </w:rPr>
+      </w:pPr>
+      <w:r>
+        <w:t xml:space="preserve">Existuje niekoľko teórii týkajúcich sa akciových trhov, ktoré sa snažia vysvetliť správanie trhov, alebo objasniť, či je trhy možné prekonať </w:t>
+      </w:r>
+      <w:sdt>
+        <w:sdtPr>
+          <w:rPr>
+            <w:color w:val="000000"/>
+          </w:rPr>
+          <w:tag w:val="MENDELEY_CITATION_v3_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"/>
+          <w:id w:val="-493875876"/>
+          <w:placeholder>
+            <w:docPart w:val="769F832CC28340CE891B17C23E204D23"/>
+          </w:placeholder>
+        </w:sdtPr>
+        <w:sdtContent>
+          <w:r>
+            <w:rPr>
+              <w:color w:val="000000"/>
+            </w:rPr>
+            <w:t>(</w:t>
+          </w:r>
+          <w:proofErr w:type="spellStart"/>
+          <w:r>
+            <w:rPr>
+              <w:color w:val="000000"/>
+            </w:rPr>
+            <w:t>Shah</w:t>
+          </w:r>
+          <w:proofErr w:type="spellEnd"/>
+          <w:r>
+            <w:rPr>
+              <w:color w:val="000000"/>
+            </w:rPr>
+            <w:t xml:space="preserve"> et al., 2019)</w:t>
+          </w:r>
+        </w:sdtContent>
+      </w:sdt>
+      <w:r>
+        <w:rPr>
+          <w:color w:val="000000"/>
+        </w:rPr>
+        <w:t>.</w:t>
+      </w:r>
+    </w:p>
+    <w:p>
+      <w:pPr>
+        <w:ind w:firstLine="0"/>
+      </w:pPr>
+    </w:p>
+    <w:p>
+      <w:pPr>
+        <w:ind w:firstLine="0"/>
       </w:pPr>
     </w:p>
     <w:p>
@@ -2330,7 +2564,6 @@
       <w:bookmarkStart w:id="105" w:name="_Toc339279017"/>
       <w:bookmarkStart w:id="106" w:name="_Toc227589987"/>
       <w:r>
-        <w:lastRenderedPageBreak/>
         <w:t>2</w:t>
       </w:r>
       <w:r>
@@ -2512,7 +2745,7 @@
             <w:autoSpaceDE w:val="0"/>
             <w:autoSpaceDN w:val="0"/>
             <w:ind w:hanging="480"/>
-            <w:divId w:val="140653990"/>
+            <w:divId w:val="756707911"/>
             <w:rPr>
               <w:color w:val="000000"/>
             </w:rPr>
@@ -2687,7 +2920,7 @@
             <w:autoSpaceDE w:val="0"/>
             <w:autoSpaceDN w:val="0"/>
             <w:ind w:hanging="480"/>
-            <w:divId w:val="888104091"/>
+            <w:divId w:val="1497378755"/>
             <w:rPr>
               <w:color w:val="000000"/>
             </w:rPr>
@@ -2890,7 +3123,7 @@
             <w:autoSpaceDE w:val="0"/>
             <w:autoSpaceDN w:val="0"/>
             <w:ind w:hanging="480"/>
-            <w:divId w:val="356736203"/>
+            <w:divId w:val="1808622196"/>
             <w:rPr>
               <w:color w:val="000000"/>
             </w:rPr>
@@ -2900,14 +3133,84 @@
             <w:rPr>
               <w:color w:val="000000"/>
             </w:rPr>
-            <w:t>Malkiel</w:t>
+            <w:t>Levine</w:t>
           </w:r>
           <w:proofErr w:type="spellEnd"/>
           <w:r>
             <w:rPr>
               <w:color w:val="000000"/>
             </w:rPr>
-            <w:t xml:space="preserve">, B. G. (2003). </w:t>
+            <w:t xml:space="preserve">, R., &amp; </w:t>
+          </w:r>
+          <w:proofErr w:type="spellStart"/>
+          <w:r>
+            <w:rPr>
+              <w:color w:val="000000"/>
+            </w:rPr>
+            <w:t>Zervos</w:t>
+          </w:r>
+          <w:proofErr w:type="spellEnd"/>
+          <w:r>
+            <w:rPr>
+              <w:color w:val="000000"/>
+            </w:rPr>
+            <w:t xml:space="preserve">, S. (1996). Stock </w:t>
+          </w:r>
+          <w:proofErr w:type="spellStart"/>
+          <w:r>
+            <w:rPr>
+              <w:color w:val="000000"/>
+            </w:rPr>
+            <w:t>Market</w:t>
+          </w:r>
+          <w:proofErr w:type="spellEnd"/>
+          <w:r>
+            <w:rPr>
+              <w:color w:val="000000"/>
+            </w:rPr>
+            <w:t xml:space="preserve"> </w:t>
+          </w:r>
+          <w:proofErr w:type="spellStart"/>
+          <w:r>
+            <w:rPr>
+              <w:color w:val="000000"/>
+            </w:rPr>
+            <w:t>Development</w:t>
+          </w:r>
+          <w:proofErr w:type="spellEnd"/>
+          <w:r>
+            <w:rPr>
+              <w:color w:val="000000"/>
+            </w:rPr>
+            <w:t xml:space="preserve"> and </w:t>
+          </w:r>
+          <w:proofErr w:type="spellStart"/>
+          <w:r>
+            <w:rPr>
+              <w:color w:val="000000"/>
+            </w:rPr>
+            <w:t>Long</w:t>
+          </w:r>
+          <w:proofErr w:type="spellEnd"/>
+          <w:r>
+            <w:rPr>
+              <w:color w:val="000000"/>
+            </w:rPr>
+            <w:t xml:space="preserve">-Run </w:t>
+          </w:r>
+          <w:proofErr w:type="spellStart"/>
+          <w:r>
+            <w:rPr>
+              <w:color w:val="000000"/>
+            </w:rPr>
+            <w:t>Growth</w:t>
+          </w:r>
+          <w:proofErr w:type="spellEnd"/>
+          <w:r>
+            <w:rPr>
+              <w:color w:val="000000"/>
+            </w:rPr>
+            <w:t xml:space="preserve">. </w:t>
           </w:r>
           <w:proofErr w:type="spellStart"/>
           <w:r>
@@ -2934,7 +3237,7 @@
               <w:iCs/>
               <w:color w:val="000000"/>
             </w:rPr>
-            <w:t>Efficient</w:t>
+            <w:t>World</w:t>
           </w:r>
           <w:proofErr w:type="spellEnd"/>
           <w:r>
@@ -2943,7 +3246,7 @@
               <w:iCs/>
               <w:color w:val="000000"/>
             </w:rPr>
-            <w:t xml:space="preserve"> </w:t>
+            <w:t xml:space="preserve"> Bank </w:t>
           </w:r>
           <w:proofErr w:type="spellStart"/>
           <w:r>
@@ -2952,7 +3255,7 @@
               <w:iCs/>
               <w:color w:val="000000"/>
             </w:rPr>
-            <w:t>Market</w:t>
+            <w:t>Economic</w:t>
           </w:r>
           <w:proofErr w:type="spellEnd"/>
           <w:r>
@@ -2970,50 +3273,28 @@
               <w:iCs/>
               <w:color w:val="000000"/>
             </w:rPr>
-            <w:t>Hypothesis</w:t>
+            <w:t>Review</w:t>
           </w:r>
           <w:proofErr w:type="spellEnd"/>
+          <w:r>
+            <w:rPr>
+              <w:color w:val="000000"/>
+            </w:rPr>
+            <w:t xml:space="preserve">, </w:t>
+          </w:r>
           <w:r>
             <w:rPr>
               <w:i/>
               <w:iCs/>
               <w:color w:val="000000"/>
             </w:rPr>
-            <w:t xml:space="preserve"> and </w:t>
-          </w:r>
-          <w:proofErr w:type="spellStart"/>
-          <w:r>
-            <w:rPr>
-              <w:i/>
-              <w:iCs/>
-              <w:color w:val="000000"/>
-            </w:rPr>
-            <w:t>Its</w:t>
-          </w:r>
-          <w:proofErr w:type="spellEnd"/>
-          <w:r>
-            <w:rPr>
-              <w:i/>
-              <w:iCs/>
-              <w:color w:val="000000"/>
-            </w:rPr>
-            <w:t xml:space="preserve"> </w:t>
-          </w:r>
-          <w:proofErr w:type="spellStart"/>
-          <w:r>
-            <w:rPr>
-              <w:i/>
-              <w:iCs/>
-              <w:color w:val="000000"/>
-            </w:rPr>
-            <w:t>Critics</w:t>
-          </w:r>
-          <w:proofErr w:type="spellEnd"/>
-          <w:r>
-            <w:rPr>
-              <w:color w:val="000000"/>
-            </w:rPr>
-            <w:t>.</w:t>
+            <w:t>10</w:t>
+          </w:r>
+          <w:r>
+            <w:rPr>
+              <w:color w:val="000000"/>
+            </w:rPr>
+            <w:t>(2), 323–339. https://doi.org/10.1093/WBER/10.2.323</w:t>
           </w:r>
         </w:p>
         <w:p>
@@ -3021,7 +3302,138 @@
             <w:autoSpaceDE w:val="0"/>
             <w:autoSpaceDN w:val="0"/>
             <w:ind w:hanging="480"/>
-            <w:divId w:val="948783661"/>
+            <w:divId w:val="640693487"/>
+            <w:rPr>
+              <w:color w:val="000000"/>
+            </w:rPr>
+          </w:pPr>
+          <w:proofErr w:type="spellStart"/>
+          <w:r>
+            <w:rPr>
+              <w:color w:val="000000"/>
+            </w:rPr>
+            <w:t>Malkiel</w:t>
+          </w:r>
+          <w:proofErr w:type="spellEnd"/>
+          <w:r>
+            <w:rPr>
+              <w:color w:val="000000"/>
+            </w:rPr>
+            <w:t xml:space="preserve">, B. G. (2003). </w:t>
+          </w:r>
+          <w:proofErr w:type="spellStart"/>
+          <w:r>
+            <w:rPr>
+              <w:i/>
+              <w:iCs/>
+              <w:color w:val="000000"/>
+            </w:rPr>
+            <w:t>The</w:t>
+          </w:r>
+          <w:proofErr w:type="spellEnd"/>
+          <w:r>
+            <w:rPr>
+              <w:i/>
+              <w:iCs/>
+              <w:color w:val="000000"/>
+            </w:rPr>
+            <w:t xml:space="preserve"> </w:t>
+          </w:r>
+          <w:proofErr w:type="spellStart"/>
+          <w:r>
+            <w:rPr>
+              <w:i/>
+              <w:iCs/>
+              <w:color w:val="000000"/>
+            </w:rPr>
+            <w:t>Efficient</w:t>
+          </w:r>
+          <w:proofErr w:type="spellEnd"/>
+          <w:r>
+            <w:rPr>
+              <w:i/>
+              <w:iCs/>
+              <w:color w:val="000000"/>
+            </w:rPr>
+            <w:t xml:space="preserve"> </w:t>
+          </w:r>
+          <w:proofErr w:type="spellStart"/>
+          <w:r>
+            <w:rPr>
+              <w:i/>
+              <w:iCs/>
+              <w:color w:val="000000"/>
+            </w:rPr>
+            <w:t>Market</w:t>
+          </w:r>
+          <w:proofErr w:type="spellEnd"/>
+          <w:r>
+            <w:rPr>
+              <w:i/>
+              <w:iCs/>
+              <w:color w:val="000000"/>
+            </w:rPr>
+            <w:t xml:space="preserve"> </w:t>
+          </w:r>
+          <w:proofErr w:type="spellStart"/>
+          <w:r>
+            <w:rPr>
+              <w:i/>
+              <w:iCs/>
+              <w:color w:val="000000"/>
+            </w:rPr>
+            <w:t>Hypothesis</w:t>
+          </w:r>
+          <w:proofErr w:type="spellEnd"/>
+          <w:r>
+            <w:rPr>
+              <w:i/>
+              <w:iCs/>
+              <w:color w:val="000000"/>
+            </w:rPr>
+            <w:t xml:space="preserve"> and </w:t>
+          </w:r>
+          <w:proofErr w:type="spellStart"/>
+          <w:r>
+            <w:rPr>
+              <w:i/>
+              <w:iCs/>
+              <w:color w:val="000000"/>
+            </w:rPr>
+            <w:t>Its</w:t>
+          </w:r>
+          <w:proofErr w:type="spellEnd"/>
+          <w:r>
+            <w:rPr>
+              <w:i/>
+              <w:iCs/>
+              <w:color w:val="000000"/>
+            </w:rPr>
+            <w:t xml:space="preserve"> </w:t>
+          </w:r>
+          <w:proofErr w:type="spellStart"/>
+          <w:r>
+            <w:rPr>
+              <w:i/>
+              <w:iCs/>
+              <w:color w:val="000000"/>
+            </w:rPr>
+            <w:t>Critics</w:t>
+          </w:r>
+          <w:proofErr w:type="spellEnd"/>
+          <w:r>
+            <w:rPr>
+              <w:color w:val="000000"/>
+            </w:rPr>
+            <w:t>.</w:t>
+          </w:r>
+        </w:p>
+        <w:p>
+          <w:pPr>
+            <w:autoSpaceDE w:val="0"/>
+            <w:autoSpaceDN w:val="0"/>
+            <w:ind w:hanging="480"/>
+            <w:divId w:val="2118017804"/>
             <w:rPr>
               <w:color w:val="000000"/>
             </w:rPr>
@@ -4020,7 +4432,6 @@
     <w:lvl w:ilvl="0" w:tplc="C83676A2">
       <w:start w:val="1"/>
       <w:numFmt w:val="bullet"/>
-      <w:pStyle w:val="Odsekzoznamu"/>
       <w:lvlText w:val=""/>
       <w:lvlJc w:val="left"/>
       <w:pPr>
@@ -4214,6 +4625,119 @@
     </w:lvl>
   </w:abstractNum>
   <w:abstractNum w:abstractNumId="4" w15:restartNumberingAfterBreak="0">
+    <w:nsid w:val="04782A90"/>
+    <w:multiLevelType w:val="hybridMultilevel"/>
+    <w:tmpl w:val="45F09660"/>
+    <w:lvl w:ilvl="0" w:tplc="041B0005">
+      <w:start w:val="1"/>
+      <w:numFmt w:val="bullet"/>
+      <w:lvlText w:val=""/>
+      <w:lvlJc w:val="left"/>
+      <w:pPr>
+        <w:ind w:left="720" w:hanging="360"/>
+      </w:pPr>
+      <w:rPr>
+        <w:rFonts w:ascii="Wingdings" w:hAnsi="Wingdings" w:hint="default"/>
+      </w:rPr>
+    </w:lvl>
+    <w:lvl w:ilvl="1" w:tplc="041B0003" w:tentative="1">
+      <w:start w:val="1"/>
+      <w:numFmt w:val="bullet"/>
+      <w:lvlText w:val="o"/>
+      <w:lvlJc w:val="left"/>
+      <w:pPr>
+        <w:ind w:left="1440" w:hanging="360"/>
+      </w:pPr>
+      <w:rPr>
+        <w:rFonts w:ascii="Courier New" w:hAnsi="Courier New" w:cs="Courier New" w:hint="default"/>
+      </w:rPr>
+    </w:lvl>
+    <w:lvl w:ilvl="2" w:tplc="041B0005" w:tentative="1">
+      <w:start w:val="1"/>
+      <w:numFmt w:val="bullet"/>
+      <w:lvlText w:val=""/>
+      <w:lvlJc w:val="left"/>
+      <w:pPr>
+        <w:ind w:left="2160" w:hanging="360"/>
+      </w:pPr>
+      <w:rPr>
+        <w:rFonts w:ascii="Wingdings" w:hAnsi="Wingdings" w:hint="default"/>
+      </w:rPr>
+    </w:lvl>
+    <w:lvl w:ilvl="3" w:tplc="041B0001" w:tentative="1">
+      <w:start w:val="1"/>
+      <w:numFmt w:val="bullet"/>
+      <w:lvlText w:val=""/>
+      <w:lvlJc w:val="left"/>
+      <w:pPr>
+        <w:ind w:left="2880" w:hanging="360"/>
+      </w:pPr>
+      <w:rPr>
+        <w:rFonts w:ascii="Symbol" w:hAnsi="Symbol" w:hint="default"/>
+      </w:rPr>
+    </w:lvl>
+    <w:lvl w:ilvl="4" w:tplc="041B0003" w:tentative="1">
+      <w:start w:val="1"/>
+      <w:numFmt w:val="bullet"/>
+      <w:lvlText w:val="o"/>
+      <w:lvlJc w:val="left"/>
+      <w:pPr>
+        <w:ind w:left="3600" w:hanging="360"/>
+      </w:pPr>
+      <w:rPr>
+        <w:rFonts w:ascii="Courier New" w:hAnsi="Courier New" w:cs="Courier New" w:hint="default"/>
+      </w:rPr>
+    </w:lvl>
+    <w:lvl w:ilvl="5" w:tplc="041B0005" w:tentative="1">
+      <w:start w:val="1"/>
+      <w:numFmt w:val="bullet"/>
+      <w:lvlText w:val=""/>
+      <w:lvlJc w:val="left"/>
+      <w:pPr>
+        <w:ind w:left="4320" w:hanging="360"/>
+      </w:pPr>
+      <w:rPr>
+        <w:rFonts w:ascii="Wingdings" w:hAnsi="Wingdings" w:hint="default"/>
+      </w:rPr>
+    </w:lvl>
+    <w:lvl w:ilvl="6" w:tplc="041B0001" w:tentative="1">
+      <w:start w:val="1"/>
+      <w:numFmt w:val="bullet"/>
+      <w:lvlText w:val=""/>
+      <w:lvlJc w:val="left"/>
+      <w:pPr>
+        <w:ind w:left="5040" w:hanging="360"/>
+      </w:pPr>
+      <w:rPr>
+        <w:rFonts w:ascii="Symbol" w:hAnsi="Symbol" w:hint="default"/>
+      </w:rPr>
+    </w:lvl>
+    <w:lvl w:ilvl="7" w:tplc="041B0003" w:tentative="1">
+      <w:start w:val="1"/>
+      <w:numFmt w:val="bullet"/>
+      <w:lvlText w:val="o"/>
+      <w:lvlJc w:val="left"/>
+      <w:pPr>
+        <w:ind w:left="5760" w:hanging="360"/>
+      </w:pPr>
+      <w:rPr>
+        <w:rFonts w:ascii="Courier New" w:hAnsi="Courier New" w:cs="Courier New" w:hint="default"/>
+      </w:rPr>
+    </w:lvl>
+    <w:lvl w:ilvl="8" w:tplc="041B0005" w:tentative="1">
+      <w:start w:val="1"/>
+      <w:numFmt w:val="bullet"/>
+      <w:lvlText w:val=""/>
+      <w:lvlJc w:val="left"/>
+      <w:pPr>
+        <w:ind w:left="6480" w:hanging="360"/>
+      </w:pPr>
+      <w:rPr>
+        <w:rFonts w:ascii="Wingdings" w:hAnsi="Wingdings" w:hint="default"/>
+      </w:rPr>
+    </w:lvl>
+  </w:abstractNum>
+  <w:abstractNum w:abstractNumId="5" w15:restartNumberingAfterBreak="0">
     <w:nsid w:val="06F76E47"/>
     <w:multiLevelType w:val="hybridMultilevel"/>
     <w:tmpl w:val="6C4C3D58"/>
@@ -4326,7 +4850,7 @@
       </w:rPr>
     </w:lvl>
   </w:abstractNum>
-  <w:abstractNum w:abstractNumId="5" w15:restartNumberingAfterBreak="0">
+  <w:abstractNum w:abstractNumId="6" w15:restartNumberingAfterBreak="0">
     <w:nsid w:val="14E678B2"/>
     <w:multiLevelType w:val="hybridMultilevel"/>
     <w:tmpl w:val="2E9221A4"/>
@@ -4439,7 +4963,7 @@
       </w:rPr>
     </w:lvl>
   </w:abstractNum>
-  <w:abstractNum w:abstractNumId="6" w15:restartNumberingAfterBreak="0">
+  <w:abstractNum w:abstractNumId="7" w15:restartNumberingAfterBreak="0">
     <w:nsid w:val="18EC3F29"/>
     <w:multiLevelType w:val="hybridMultilevel"/>
     <w:tmpl w:val="79DC5558"/>
@@ -4553,7 +5077,7 @@
       </w:rPr>
     </w:lvl>
   </w:abstractNum>
-  <w:abstractNum w:abstractNumId="7" w15:restartNumberingAfterBreak="0">
+  <w:abstractNum w:abstractNumId="8" w15:restartNumberingAfterBreak="0">
     <w:nsid w:val="1BB77527"/>
     <w:multiLevelType w:val="multilevel"/>
     <w:tmpl w:val="0310F356"/>
@@ -4702,7 +5226,7 @@
       </w:rPr>
     </w:lvl>
   </w:abstractNum>
-  <w:abstractNum w:abstractNumId="8" w15:restartNumberingAfterBreak="0">
+  <w:abstractNum w:abstractNumId="9" w15:restartNumberingAfterBreak="0">
     <w:nsid w:val="1E5D10C7"/>
     <w:multiLevelType w:val="hybridMultilevel"/>
     <w:tmpl w:val="19E02992"/>
@@ -4815,7 +5339,7 @@
       </w:rPr>
     </w:lvl>
   </w:abstractNum>
-  <w:abstractNum w:abstractNumId="9" w15:restartNumberingAfterBreak="0">
+  <w:abstractNum w:abstractNumId="10" w15:restartNumberingAfterBreak="0">
     <w:nsid w:val="218C3854"/>
     <w:multiLevelType w:val="multilevel"/>
     <w:tmpl w:val="C98234AE"/>
@@ -4936,7 +5460,7 @@
       </w:rPr>
     </w:lvl>
   </w:abstractNum>
-  <w:abstractNum w:abstractNumId="10" w15:restartNumberingAfterBreak="0">
+  <w:abstractNum w:abstractNumId="11" w15:restartNumberingAfterBreak="0">
     <w:nsid w:val="220608B5"/>
     <w:multiLevelType w:val="multilevel"/>
     <w:tmpl w:val="8CAAE064"/>
@@ -5049,7 +5573,7 @@
       </w:rPr>
     </w:lvl>
   </w:abstractNum>
-  <w:abstractNum w:abstractNumId="11" w15:restartNumberingAfterBreak="0">
+  <w:abstractNum w:abstractNumId="12" w15:restartNumberingAfterBreak="0">
     <w:nsid w:val="2AB227CD"/>
     <w:multiLevelType w:val="hybridMultilevel"/>
     <w:tmpl w:val="21761F8C"/>
@@ -5163,7 +5687,7 @@
       </w:rPr>
     </w:lvl>
   </w:abstractNum>
-  <w:abstractNum w:abstractNumId="12" w15:restartNumberingAfterBreak="0">
+  <w:abstractNum w:abstractNumId="13" w15:restartNumberingAfterBreak="0">
     <w:nsid w:val="2C852D87"/>
     <w:multiLevelType w:val="hybridMultilevel"/>
     <w:tmpl w:val="B37C0AA0"/>
@@ -5276,7 +5800,7 @@
       </w:rPr>
     </w:lvl>
   </w:abstractNum>
-  <w:abstractNum w:abstractNumId="13" w15:restartNumberingAfterBreak="0">
+  <w:abstractNum w:abstractNumId="14" w15:restartNumberingAfterBreak="0">
     <w:nsid w:val="36DC6506"/>
     <w:multiLevelType w:val="multilevel"/>
     <w:tmpl w:val="3140DC02"/>
@@ -5425,7 +5949,7 @@
       </w:rPr>
     </w:lvl>
   </w:abstractNum>
-  <w:abstractNum w:abstractNumId="14" w15:restartNumberingAfterBreak="0">
+  <w:abstractNum w:abstractNumId="15" w15:restartNumberingAfterBreak="0">
     <w:nsid w:val="4F2C0BD3"/>
     <w:multiLevelType w:val="hybridMultilevel"/>
     <w:tmpl w:val="4678C20E"/>
@@ -5538,7 +6062,7 @@
       </w:rPr>
     </w:lvl>
   </w:abstractNum>
-  <w:abstractNum w:abstractNumId="15" w15:restartNumberingAfterBreak="0">
+  <w:abstractNum w:abstractNumId="16" w15:restartNumberingAfterBreak="0">
     <w:nsid w:val="54952FEA"/>
     <w:multiLevelType w:val="hybridMultilevel"/>
     <w:tmpl w:val="F28EC24A"/>
@@ -5651,7 +6175,7 @@
       </w:rPr>
     </w:lvl>
   </w:abstractNum>
-  <w:abstractNum w:abstractNumId="16" w15:restartNumberingAfterBreak="0">
+  <w:abstractNum w:abstractNumId="17" w15:restartNumberingAfterBreak="0">
     <w:nsid w:val="5611167D"/>
     <w:multiLevelType w:val="hybridMultilevel"/>
     <w:tmpl w:val="D1EE56C2"/>
@@ -5764,7 +6288,7 @@
       </w:rPr>
     </w:lvl>
   </w:abstractNum>
-  <w:abstractNum w:abstractNumId="17" w15:restartNumberingAfterBreak="0">
+  <w:abstractNum w:abstractNumId="18" w15:restartNumberingAfterBreak="0">
     <w:nsid w:val="5C9927BD"/>
     <w:multiLevelType w:val="multilevel"/>
     <w:tmpl w:val="61020A4A"/>
@@ -5913,7 +6437,7 @@
       </w:rPr>
     </w:lvl>
   </w:abstractNum>
-  <w:abstractNum w:abstractNumId="18" w15:restartNumberingAfterBreak="0">
+  <w:abstractNum w:abstractNumId="19" w15:restartNumberingAfterBreak="0">
     <w:nsid w:val="63823A16"/>
     <w:multiLevelType w:val="hybridMultilevel"/>
     <w:tmpl w:val="4992FC38"/>
@@ -6026,7 +6550,7 @@
       </w:rPr>
     </w:lvl>
   </w:abstractNum>
-  <w:abstractNum w:abstractNumId="19" w15:restartNumberingAfterBreak="0">
+  <w:abstractNum w:abstractNumId="20" w15:restartNumberingAfterBreak="0">
     <w:nsid w:val="63CA04A6"/>
     <w:multiLevelType w:val="hybridMultilevel"/>
     <w:tmpl w:val="2780E26A"/>
@@ -6139,7 +6663,7 @@
       </w:rPr>
     </w:lvl>
   </w:abstractNum>
-  <w:abstractNum w:abstractNumId="20" w15:restartNumberingAfterBreak="0">
+  <w:abstractNum w:abstractNumId="21" w15:restartNumberingAfterBreak="0">
     <w:nsid w:val="64A31B80"/>
     <w:multiLevelType w:val="hybridMultilevel"/>
     <w:tmpl w:val="65FC01CC"/>
@@ -6253,7 +6777,7 @@
       </w:rPr>
     </w:lvl>
   </w:abstractNum>
-  <w:abstractNum w:abstractNumId="21" w15:restartNumberingAfterBreak="0">
+  <w:abstractNum w:abstractNumId="22" w15:restartNumberingAfterBreak="0">
     <w:nsid w:val="68B5360C"/>
     <w:multiLevelType w:val="hybridMultilevel"/>
     <w:tmpl w:val="674415AC"/>
@@ -6367,7 +6891,121 @@
       </w:rPr>
     </w:lvl>
   </w:abstractNum>
-  <w:abstractNum w:abstractNumId="22" w15:restartNumberingAfterBreak="0">
+  <w:abstractNum w:abstractNumId="23" w15:restartNumberingAfterBreak="0">
+    <w:nsid w:val="69E42B5C"/>
+    <w:multiLevelType w:val="hybridMultilevel"/>
+    <w:tmpl w:val="25CC4D82"/>
+    <w:lvl w:ilvl="0" w:tplc="EDFA48BC">
+      <w:start w:val="1"/>
+      <w:numFmt w:val="bullet"/>
+      <w:pStyle w:val="Odsekzoznamu"/>
+      <w:lvlText w:val=""/>
+      <w:lvlJc w:val="left"/>
+      <w:pPr>
+        <w:ind w:left="1440" w:hanging="360"/>
+      </w:pPr>
+      <w:rPr>
+        <w:rFonts w:ascii="Wingdings" w:hAnsi="Wingdings" w:hint="default"/>
+      </w:rPr>
+    </w:lvl>
+    <w:lvl w:ilvl="1" w:tplc="041B0003" w:tentative="1">
+      <w:start w:val="1"/>
+      <w:numFmt w:val="bullet"/>
+      <w:lvlText w:val="o"/>
+      <w:lvlJc w:val="left"/>
+      <w:pPr>
+        <w:ind w:left="2160" w:hanging="360"/>
+      </w:pPr>
+      <w:rPr>
+        <w:rFonts w:ascii="Courier New" w:hAnsi="Courier New" w:cs="Courier New" w:hint="default"/>
+      </w:rPr>
+    </w:lvl>
+    <w:lvl w:ilvl="2" w:tplc="041B0005" w:tentative="1">
+      <w:start w:val="1"/>
+      <w:numFmt w:val="bullet"/>
+      <w:lvlText w:val=""/>
+      <w:lvlJc w:val="left"/>
+      <w:pPr>
+        <w:ind w:left="2880" w:hanging="360"/>
+      </w:pPr>
+      <w:rPr>
+        <w:rFonts w:ascii="Wingdings" w:hAnsi="Wingdings" w:hint="default"/>
+      </w:rPr>
+    </w:lvl>
+    <w:lvl w:ilvl="3" w:tplc="041B0001" w:tentative="1">
+      <w:start w:val="1"/>
+      <w:numFmt w:val="bullet"/>
+      <w:lvlText w:val=""/>
+      <w:lvlJc w:val="left"/>
+      <w:pPr>
+        <w:ind w:left="3600" w:hanging="360"/>
+      </w:pPr>
+      <w:rPr>
+        <w:rFonts w:ascii="Symbol" w:hAnsi="Symbol" w:hint="default"/>
+      </w:rPr>
+    </w:lvl>
+    <w:lvl w:ilvl="4" w:tplc="041B0003" w:tentative="1">
+      <w:start w:val="1"/>
+      <w:numFmt w:val="bullet"/>
+      <w:lvlText w:val="o"/>
+      <w:lvlJc w:val="left"/>
+      <w:pPr>
+        <w:ind w:left="4320" w:hanging="360"/>
+      </w:pPr>
+      <w:rPr>
+        <w:rFonts w:ascii="Courier New" w:hAnsi="Courier New" w:cs="Courier New" w:hint="default"/>
+      </w:rPr>
+    </w:lvl>
+    <w:lvl w:ilvl="5" w:tplc="041B0005" w:tentative="1">
+      <w:start w:val="1"/>
+      <w:numFmt w:val="bullet"/>
+      <w:lvlText w:val=""/>
+      <w:lvlJc w:val="left"/>
+      <w:pPr>
+        <w:ind w:left="5040" w:hanging="360"/>
+      </w:pPr>
+      <w:rPr>
+        <w:rFonts w:ascii="Wingdings" w:hAnsi="Wingdings" w:hint="default"/>
+      </w:rPr>
+    </w:lvl>
+    <w:lvl w:ilvl="6" w:tplc="041B0001" w:tentative="1">
+      <w:start w:val="1"/>
+      <w:numFmt w:val="bullet"/>
+      <w:lvlText w:val=""/>
+      <w:lvlJc w:val="left"/>
+      <w:pPr>
+        <w:ind w:left="5760" w:hanging="360"/>
+      </w:pPr>
+      <w:rPr>
+        <w:rFonts w:ascii="Symbol" w:hAnsi="Symbol" w:hint="default"/>
+      </w:rPr>
+    </w:lvl>
+    <w:lvl w:ilvl="7" w:tplc="041B0003" w:tentative="1">
+      <w:start w:val="1"/>
+      <w:numFmt w:val="bullet"/>
+      <w:lvlText w:val="o"/>
+      <w:lvlJc w:val="left"/>
+      <w:pPr>
+        <w:ind w:left="6480" w:hanging="360"/>
+      </w:pPr>
+      <w:rPr>
+        <w:rFonts w:ascii="Courier New" w:hAnsi="Courier New" w:cs="Courier New" w:hint="default"/>
+      </w:rPr>
+    </w:lvl>
+    <w:lvl w:ilvl="8" w:tplc="041B0005" w:tentative="1">
+      <w:start w:val="1"/>
+      <w:numFmt w:val="bullet"/>
+      <w:lvlText w:val=""/>
+      <w:lvlJc w:val="left"/>
+      <w:pPr>
+        <w:ind w:left="7200" w:hanging="360"/>
+      </w:pPr>
+      <w:rPr>
+        <w:rFonts w:ascii="Wingdings" w:hAnsi="Wingdings" w:hint="default"/>
+      </w:rPr>
+    </w:lvl>
+  </w:abstractNum>
+  <w:abstractNum w:abstractNumId="24" w15:restartNumberingAfterBreak="0">
     <w:nsid w:val="6FD33CD2"/>
     <w:multiLevelType w:val="hybridMultilevel"/>
     <w:tmpl w:val="19147912"/>
@@ -6481,7 +7119,7 @@
       </w:rPr>
     </w:lvl>
   </w:abstractNum>
-  <w:abstractNum w:abstractNumId="23" w15:restartNumberingAfterBreak="0">
+  <w:abstractNum w:abstractNumId="25" w15:restartNumberingAfterBreak="0">
     <w:nsid w:val="74E5593F"/>
     <w:multiLevelType w:val="multilevel"/>
     <w:tmpl w:val="809AF0AC"/>
@@ -6630,7 +7268,7 @@
       </w:rPr>
     </w:lvl>
   </w:abstractNum>
-  <w:abstractNum w:abstractNumId="24" w15:restartNumberingAfterBreak="0">
+  <w:abstractNum w:abstractNumId="26" w15:restartNumberingAfterBreak="0">
     <w:nsid w:val="762528F2"/>
     <w:multiLevelType w:val="hybridMultilevel"/>
     <w:tmpl w:val="2E0022DA"/>
@@ -6750,73 +7388,79 @@
     <w:abstractNumId w:val="0"/>
   </w:num>
   <w:num w:numId="3" w16cid:durableId="1814104277">
+    <w:abstractNumId w:val="9"/>
+  </w:num>
+  <w:num w:numId="4" w16cid:durableId="762340787">
+    <w:abstractNumId w:val="22"/>
+  </w:num>
+  <w:num w:numId="5" w16cid:durableId="1073308230">
+    <w:abstractNumId w:val="18"/>
+  </w:num>
+  <w:num w:numId="6" w16cid:durableId="1816482116">
+    <w:abstractNumId w:val="6"/>
+  </w:num>
+  <w:num w:numId="7" w16cid:durableId="1736468726">
+    <w:abstractNumId w:val="25"/>
+  </w:num>
+  <w:num w:numId="8" w16cid:durableId="956566999">
+    <w:abstractNumId w:val="14"/>
+  </w:num>
+  <w:num w:numId="9" w16cid:durableId="956910653">
     <w:abstractNumId w:val="8"/>
   </w:num>
-  <w:num w:numId="4" w16cid:durableId="762340787">
-    <w:abstractNumId w:val="21"/>
+  <w:num w:numId="10" w16cid:durableId="1950508470">
+    <w:abstractNumId w:val="20"/>
   </w:num>
-  <w:num w:numId="5" w16cid:durableId="1073308230">
-    <w:abstractNumId w:val="17"/>
-  </w:num>
-  <w:num w:numId="6" w16cid:durableId="1816482116">
-    <w:abstractNumId w:val="5"/>
-  </w:num>
-  <w:num w:numId="7" w16cid:durableId="1736468726">
-    <w:abstractNumId w:val="23"/>
-  </w:num>
-  <w:num w:numId="8" w16cid:durableId="956566999">
+  <w:num w:numId="11" w16cid:durableId="45839240">
     <w:abstractNumId w:val="13"/>
   </w:num>
-  <w:num w:numId="9" w16cid:durableId="956910653">
-    <w:abstractNumId w:val="7"/>
-  </w:num>
-  <w:num w:numId="10" w16cid:durableId="1950508470">
+  <w:num w:numId="12" w16cid:durableId="1585261541">
     <w:abstractNumId w:val="19"/>
   </w:num>
-  <w:num w:numId="11" w16cid:durableId="45839240">
-    <w:abstractNumId w:val="12"/>
-  </w:num>
-  <w:num w:numId="12" w16cid:durableId="1585261541">
-    <w:abstractNumId w:val="18"/>
-  </w:num>
   <w:num w:numId="13" w16cid:durableId="1972444814">
-    <w:abstractNumId w:val="9"/>
+    <w:abstractNumId w:val="10"/>
   </w:num>
   <w:num w:numId="14" w16cid:durableId="545680652">
     <w:abstractNumId w:val="3"/>
   </w:num>
   <w:num w:numId="15" w16cid:durableId="1790271063">
-    <w:abstractNumId w:val="10"/>
+    <w:abstractNumId w:val="11"/>
   </w:num>
   <w:num w:numId="16" w16cid:durableId="1319315">
-    <w:abstractNumId w:val="6"/>
+    <w:abstractNumId w:val="7"/>
   </w:num>
   <w:num w:numId="17" w16cid:durableId="1960837576">
-    <w:abstractNumId w:val="11"/>
+    <w:abstractNumId w:val="12"/>
   </w:num>
   <w:num w:numId="18" w16cid:durableId="784928488">
-    <w:abstractNumId w:val="20"/>
+    <w:abstractNumId w:val="21"/>
   </w:num>
   <w:num w:numId="19" w16cid:durableId="767584246">
-    <w:abstractNumId w:val="22"/>
+    <w:abstractNumId w:val="24"/>
   </w:num>
   <w:num w:numId="20" w16cid:durableId="803691881">
-    <w:abstractNumId w:val="4"/>
+    <w:abstractNumId w:val="5"/>
   </w:num>
   <w:num w:numId="21" w16cid:durableId="533737280">
-    <w:abstractNumId w:val="24"/>
+    <w:abstractNumId w:val="26"/>
   </w:num>
   <w:num w:numId="22" w16cid:durableId="548423656">
-    <w:abstractNumId w:val="14"/>
+    <w:abstractNumId w:val="15"/>
   </w:num>
   <w:num w:numId="23" w16cid:durableId="1361320469">
-    <w:abstractNumId w:val="15"/>
+    <w:abstractNumId w:val="16"/>
   </w:num>
   <w:num w:numId="24" w16cid:durableId="2073310069">
-    <w:abstractNumId w:val="16"/>
+    <w:abstractNumId w:val="17"/>
   </w:num>
   <w:num w:numId="25" w16cid:durableId="56829220">
     <w:abstractNumId w:val="2"/>
+  </w:num>
+  <w:num w:numId="26" w16cid:durableId="1867064642">
+    <w:abstractNumId w:val="4"/>
+  </w:num>
+  <w:num w:numId="27" w16cid:durableId="1019966480">
+    <w:abstractNumId w:val="23"/>
   </w:num>
   <w:numIdMacAtCleanup w:val="14"/>
 </w:numbering>
@@ -7845,10 +8489,10 @@
     <w:autoRedefine/>
     <w:uiPriority w:val="34"/>
     <w:qFormat/>
-    <w:rsid w:val="00DB27BE"/>
+    <w:rsid w:val="002E2EAA"/>
     <w:pPr>
       <w:numPr>
-        <w:numId w:val="25"/>
+        <w:numId w:val="27"/>
       </w:numPr>
       <w:jc w:val="left"/>
     </w:pPr>
@@ -8648,6 +9292,35 @@
       </w:docPartPr>
       <w:docPartBody>
         <w:p>
+          <w:r>
+            <w:rPr>
+              <w:rStyle w:val="Zstupntext"/>
+            </w:rPr>
+            <w:t>Kliknite alebo ťuknite sem a zadajte text.</w:t>
+          </w:r>
+        </w:p>
+      </w:docPartBody>
+    </w:docPart>
+    <w:docPart>
+      <w:docPartPr>
+        <w:name w:val="769F832CC28340CE891B17C23E204D23"/>
+        <w:category>
+          <w:name w:val="Všeobecné"/>
+          <w:gallery w:val="placeholder"/>
+        </w:category>
+        <w:types>
+          <w:type w:val="bbPlcHdr"/>
+        </w:types>
+        <w:behaviors>
+          <w:behavior w:val="content"/>
+        </w:behaviors>
+        <w:guid w:val="{5C4C6629-62E1-48F0-AD58-D786E54EA637}"/>
+      </w:docPartPr>
+      <w:docPartBody>
+        <w:p>
+          <w:pPr>
+            <w:pStyle w:val="769F832CC28340CE891B17C23E204D23"/>
+          </w:pPr>
           <w:r>
             <w:rPr>
               <w:rStyle w:val="Zstupntext"/>
@@ -8686,21 +9359,21 @@
   </w:font>
   <w:font w:name="Courier New">
     <w:panose1 w:val="02070309020205020404"/>
-    <w:charset w:val="EE"/>
+    <w:charset w:val="00"/>
     <w:family w:val="modern"/>
     <w:pitch w:val="fixed"/>
     <w:sig w:usb0="E0002EFF" w:usb1="C0007843" w:usb2="00000009" w:usb3="00000000" w:csb0="000001FF" w:csb1="00000000"/>
   </w:font>
   <w:font w:name="Calibri">
     <w:panose1 w:val="020F0502020204030204"/>
-    <w:charset w:val="EE"/>
+    <w:charset w:val="00"/>
     <w:family w:val="swiss"/>
     <w:pitch w:val="variable"/>
     <w:sig w:usb0="E4002EFF" w:usb1="C200247B" w:usb2="00000009" w:usb3="00000000" w:csb0="000001FF" w:csb1="00000000"/>
   </w:font>
   <w:font w:name="Cambria">
     <w:panose1 w:val="02040503050406030204"/>
-    <w:charset w:val="EE"/>
+    <w:charset w:val="00"/>
     <w:family w:val="roman"/>
     <w:pitch w:val="variable"/>
     <w:sig w:usb0="E00006FF" w:usb1="420024FF" w:usb2="02000000" w:usb3="00000000" w:csb0="0000019F" w:csb1="00000000"/>
@@ -8753,6 +9426,7 @@
   <w:rsids>
     <w:rsidRoot w:val="005C3D30"/>
     <w:rsid w:val="000D7980"/>
+    <w:rsid w:val="0014106D"/>
     <w:rsid w:val="004B68D7"/>
     <w:rsid w:val="005605F5"/>
     <w:rsid w:val="005C3D30"/>
@@ -8760,7 +9434,9 @@
     <w:rsid w:val="00631B0A"/>
     <w:rsid w:val="006A0C80"/>
     <w:rsid w:val="008001EC"/>
+    <w:rsid w:val="00894C30"/>
     <w:rsid w:val="00B8366B"/>
+    <w:rsid w:val="00DA74A9"/>
     <w:rsid w:val="00F67108"/>
   </w:rsids>
   <m:mathPr>
@@ -9217,10 +9893,14 @@
     <w:basedOn w:val="Predvolenpsmoodseku"/>
     <w:uiPriority w:val="99"/>
     <w:semiHidden/>
-    <w:rsid w:val="005C3D30"/>
+    <w:rsid w:val="00894C30"/>
     <w:rPr>
       <w:color w:val="808080"/>
     </w:rPr>
+  </w:style>
+  <w:style w:type="paragraph" w:customStyle="1" w:styleId="769F832CC28340CE891B17C23E204D23">
+    <w:name w:val="769F832CC28340CE891B17C23E204D23"/>
+    <w:rsid w:val="00894C30"/>
   </w:style>
 </w:styles>
 </file>
@@ -9519,7 +10199,7 @@
 
 <file path=word/webextensions/taskpanes.xml><?xml version="1.0" encoding="utf-8"?>
 <wetp:taskpanes xmlns:wetp="http://schemas.microsoft.com/office/webextensions/taskpanes/2010/11">
-  <wetp:taskpane dockstate="right" visibility="0" width="350" row="0">
+  <wetp:taskpane dockstate="right" visibility="0" width="525" row="0">
     <wetp:webextensionref xmlns:r="http://schemas.openxmlformats.org/officeDocument/2006/relationships" r:id="rId1"/>
   </wetp:taskpane>
 </wetp:taskpanes>
@@ -9533,8 +10213,8 @@
   </we:alternateReferences>
   <we:properties>
     <we:property name="MENDELEY_BIBLIOGRAPHY_IS_DIRTY" value="false"/>
-    <we:property name="MENDELEY_BIBLIOGRAPHY_LAST_MODIFIED" value="1777664112047"/>
-    <we:property name="MENDELEY_CITATIONS" value="[{&quot;citationID&quot;:&quot;MENDELEY_CITATION_f445dcfc-da19-4caa-a8cf-57a7ddae45ee&quot;,&quot;properties&quot;:{&quot;noteIndex&quot;:0},&quot;isEdited&quot;:false,&quot;manualOverride&quot;:{&quot;isManuallyOverridden&quot;:false,&quot;citeprocText&quot;:&quot;(Hiransha et al., 2018)&quot;,&quot;manualOverrideText&quot;:&quot;&quot;},&quot;citationTag&quot;:&quot;MENDELEY_CITATION_v3_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&quot;,&quot;citationItems&quot;:[{&quot;id&quot;:&quot;9ccf1aa1-1254-3445-bb6e-4b633c72251a&quot;,&quot;itemData&quot;:{&quot;type&quot;:&quot;article-journal&quot;,&quot;id&quot;:&quot;9ccf1aa1-1254-3445-bb6e-4b633c72251a&quot;,&quot;title&quot;:&quot;NSE Stock Market Prediction Using Deep-Learning Models&quot;,&quot;groupId&quot;:&quot;092e372d-c067-3fdb-b3f7-8bafafb41bf5&quot;,&quot;author&quot;:[{&quot;family&quot;:&quot;Hiransha&quot;,&quot;given&quot;:&quot;M.&quot;,&quot;parse-names&quot;:false,&quot;dropping-particle&quot;:&quot;&quot;,&quot;non-dropping-particle&quot;:&quot;&quot;},{&quot;family&quot;:&quot;Gopalakrishnan&quot;,&quot;given&quot;:&quot;E. A.&quot;,&quot;parse-names&quot;:false,&quot;dropping-particle&quot;:&quot;&quot;,&quot;non-dropping-particle&quot;:&quot;&quot;},{&quot;family&quot;:&quot;Menon&quot;,&quot;given&quot;:&quot;Vijay Krishna&quot;,&quot;parse-names&quot;:false,&quot;dropping-particle&quot;:&quot;&quot;,&quot;non-dropping-particle&quot;:&quot;&quot;},{&quot;family&quot;:&quot;Soman&quot;,&quot;given&quot;:&quot;K. P.&quot;,&quot;parse-names&quot;:false,&quot;dropping-particle&quot;:&quot;&quot;,&quot;non-dropping-particle&quot;:&quot;&quot;}],&quot;container-title&quot;:&quot;Procedia Computer Science&quot;,&quot;container-title-short&quot;:&quot;Procedia Comput. Sci.&quot;,&quot;accessed&quot;:{&quot;date-parts&quot;:[[2026,4,29]]},&quot;DOI&quot;:&quot;10.1016/J.PROCS.2018.05.050&quot;,&quot;ISSN&quot;:&quot;1877-0509&quot;,&quot;URL&quot;:&quot;https://www.sciencedirect.com/science/article/pii/S1877050918307828?__cf_chl_tk=U6TCZCqvcyilUU41dh9Js8Ok4cjhAILJlEgc7461JYI-1777485243-1.0.1.1-4saQUybIPsAqa1ar0sQkWKp3rALtB.LEV6dh_t_it.k&quot;,&quot;issued&quot;:{&quot;date-parts&quot;:[[2018,1,1]]},&quot;page&quot;:&quot;1351-1362&quot;,&quot;abstract&quot;:&quot;The neural network, one of the intelligent data mining technique that has been used by researchers in various areas for the past 10 years. Prediction and analysis of stock market data have got an important role in today's economy. The various algorithms used for forecasting can be categorized into linear (AR, MA, ARIMA, ARMA) and non-linear models (ARCH, GARCH, Neural Network). In this paper, we are using four types of deep learning architectures i.e Multilayer Perceptron (MLP), Recurrent Neural Networks (RNN), Long Short-Term Memory (LSTM) and Convolutional Neural Network (CNN) for predicting the stock price of a company based on the historical prices available. Here we are using day-wise closing price of two different stock markets, National Stock Exchange (NSE) of India and New York Stock Exchange (NYSE). The network was trained with the stock price of a single company from NSE and predicted for five different companies from both NSE and NYSE. It has been observed that CNN is outperforming the other models. The network was able to predict for NYSE even though it was trained with NSE data. This was possible because both the stock markets share some common inner dynamics. The results obtained were com- pared with ARIMA model and it has been observed that the neural networks are outperforming the existing linear model (ARIMA).&quot;,&quot;publisher&quot;:&quot;Elsevier&quot;,&quot;volume&quot;:&quot;132&quot;},&quot;isTemporary&quot;:false}]},{&quot;citationID&quot;:&quot;MENDELEY_CITATION_aa2b6abc-95eb-4667-801f-e1b162858949&quot;,&quot;properties&quot;:{&quot;noteIndex&quot;:0},&quot;isEdited&quot;:false,&quot;manualOverride&quot;:{&quot;isManuallyOverridden&quot;:false,&quot;citeprocText&quot;:&quot;(Shah et al., 2019)&quot;,&quot;manualOverrideText&quot;:&quot;&quot;},&quot;citationTag&quot;:&quot;MENDELEY_CITATION_v3_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&quot;,&quot;citationItems&quot;:[{&quot;id&quot;:&quot;8d1a3d32-6c56-311b-80d4-9313558321ef&quot;,&quot;itemData&quot;:{&quot;type&quot;:&quot;article-journal&quot;,&quot;id&quot;:&quot;8d1a3d32-6c56-311b-80d4-9313558321ef&quot;,&quot;title&quot;:&quot;Stock Market Analysis: A Review and Taxonomy of Prediction Techniques&quot;,&quot;groupId&quot;:&quot;092e372d-c067-3fdb-b3f7-8bafafb41bf5&quot;,&quot;author&quot;:[{&quot;family&quot;:&quot;Shah&quot;,&quot;given&quot;:&quot;Dev&quot;,&quot;parse-names&quot;:false,&quot;dropping-particle&quot;:&quot;&quot;,&quot;non-dropping-particle&quot;:&quot;&quot;},{&quot;family&quot;:&quot;Isah&quot;,&quot;given&quot;:&quot;Haruna&quot;,&quot;parse-names&quot;:false,&quot;dropping-particle&quot;:&quot;&quot;,&quot;non-dropping-particle&quot;:&quot;&quot;},{&quot;family&quot;:&quot;Zulkernine&quot;,&quot;given&quot;:&quot;Farhana&quot;,&quot;parse-names&quot;:false,&quot;dropping-particle&quot;:&quot;&quot;,&quot;non-dropping-particle&quot;:&quot;&quot;}],&quot;container-title&quot;:&quot;International Journal of Financial Studies 2019, Vol. 7, Page 26&quot;,&quot;accessed&quot;:{&quot;date-parts&quot;:[[2026,4,29]]},&quot;DOI&quot;:&quot;10.3390/IJFS7020026&quot;,&quot;ISSN&quot;:&quot;2227-7072&quot;,&quot;URL&quot;:&quot;https://www.mdpi.com/2227-7072/7/2/26/htm&quot;,&quot;issued&quot;:{&quot;date-parts&quot;:[[2019,5,27]]},&quot;page&quot;:&quot;26&quot;,&quot;abstract&quot;:&quot;Stock market prediction has always caught the attention of many analysts and researchers. Popular theories suggest that stock markets are essentially a random walk and it is a fool’s game to try and predict them. Predicting stock prices is a challenging problem in itself because of the number of variables which are involved. In the short term, the market behaves like a voting machine but in the longer term, it acts like a weighing machine and hence there is scope for predicting the market movements for a longer timeframe. Application of machine learning techniques and other algorithms for stock price analysis and forecasting is an area that shows great promise. In this paper, we first provide a concise review of stock markets and taxonomy of stock market prediction methods. We then focus on some of the research achievements in stock analysis and prediction. We discuss technical, fundamental, short- and long-term approaches used for stock analysis. Finally, we present some challenges and research opportunities in this field.&quot;,&quot;publisher&quot;:&quot;Multidisciplinary Digital Publishing Institute&quot;,&quot;issue&quot;:&quot;2&quot;,&quot;volume&quot;:&quot;7&quot;,&quot;container-title-short&quot;:&quot;&quot;},&quot;isTemporary&quot;:false}]},{&quot;citationID&quot;:&quot;MENDELEY_CITATION_3f021c6d-2661-4bb4-9f03-f17b1b7e7780&quot;,&quot;properties&quot;:{&quot;noteIndex&quot;:0},&quot;isEdited&quot;:false,&quot;manualOverride&quot;:{&quot;isManuallyOverridden&quot;:false,&quot;citeprocText&quot;:&quot;(Shah et al., 2019)&quot;,&quot;manualOverrideText&quot;:&quot;&quot;},&quot;citationTag&quot;:&quot;MENDELEY_CITATION_v3_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&quot;,&quot;citationItems&quot;:[{&quot;id&quot;:&quot;8d1a3d32-6c56-311b-80d4-9313558321ef&quot;,&quot;itemData&quot;:{&quot;type&quot;:&quot;article-journal&quot;,&quot;id&quot;:&quot;8d1a3d32-6c56-311b-80d4-9313558321ef&quot;,&quot;title&quot;:&quot;Stock Market Analysis: A Review and Taxonomy of Prediction Techniques&quot;,&quot;groupId&quot;:&quot;092e372d-c067-3fdb-b3f7-8bafafb41bf5&quot;,&quot;author&quot;:[{&quot;family&quot;:&quot;Shah&quot;,&quot;given&quot;:&quot;Dev&quot;,&quot;parse-names&quot;:false,&quot;dropping-particle&quot;:&quot;&quot;,&quot;non-dropping-particle&quot;:&quot;&quot;},{&quot;family&quot;:&quot;Isah&quot;,&quot;given&quot;:&quot;Haruna&quot;,&quot;parse-names&quot;:false,&quot;dropping-particle&quot;:&quot;&quot;,&quot;non-dropping-particle&quot;:&quot;&quot;},{&quot;family&quot;:&quot;Zulkernine&quot;,&quot;given&quot;:&quot;Farhana&quot;,&quot;parse-names&quot;:false,&quot;dropping-particle&quot;:&quot;&quot;,&quot;non-dropping-particle&quot;:&quot;&quot;}],&quot;container-title&quot;:&quot;International Journal of Financial Studies 2019, Vol. 7, Page 26&quot;,&quot;accessed&quot;:{&quot;date-parts&quot;:[[2026,4,29]]},&quot;DOI&quot;:&quot;10.3390/IJFS7020026&quot;,&quot;ISSN&quot;:&quot;2227-7072&quot;,&quot;URL&quot;:&quot;https://www.mdpi.com/2227-7072/7/2/26/htm&quot;,&quot;issued&quot;:{&quot;date-parts&quot;:[[2019,5,27]]},&quot;page&quot;:&quot;26&quot;,&quot;abstract&quot;:&quot;Stock market prediction has always caught the attention of many analysts and researchers. Popular theories suggest that stock markets are essentially a random walk and it is a fool’s game to try and predict them. Predicting stock prices is a challenging problem in itself because of the number of variables which are involved. In the short term, the market behaves like a voting machine but in the longer term, it acts like a weighing machine and hence there is scope for predicting the market movements for a longer timeframe. Application of machine learning techniques and other algorithms for stock price analysis and forecasting is an area that shows great promise. In this paper, we first provide a concise review of stock markets and taxonomy of stock market prediction methods. We then focus on some of the research achievements in stock analysis and prediction. We discuss technical, fundamental, short- and long-term approaches used for stock analysis. Finally, we present some challenges and research opportunities in this field.&quot;,&quot;publisher&quot;:&quot;Multidisciplinary Digital Publishing Institute&quot;,&quot;issue&quot;:&quot;2&quot;,&quot;volume&quot;:&quot;7&quot;,&quot;container-title-short&quot;:&quot;&quot;},&quot;isTemporary&quot;:false}]},{&quot;citationID&quot;:&quot;MENDELEY_CITATION_53ec8ca4-926d-45ce-9e2b-95b029699543&quot;,&quot;properties&quot;:{&quot;noteIndex&quot;:0},&quot;isEdited&quot;:false,&quot;manualOverride&quot;:{&quot;isManuallyOverridden&quot;:false,&quot;citeprocText&quot;:&quot;(Fama, 1970)&quot;,&quot;manualOverrideText&quot;:&quot;&quot;},&quot;citationTag&quot;:&quot;MENDELEY_CITATION_v3_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&quot;,&quot;citationItems&quot;:[{&quot;id&quot;:&quot;091e2749-aa60-3c2d-9cc3-1cdad11b5547&quot;,&quot;itemData&quot;:{&quot;type&quot;:&quot;article-journal&quot;,&quot;id&quot;:&quot;091e2749-aa60-3c2d-9cc3-1cdad11b5547&quot;,&quot;title&quot;:&quot;Efficient Capital Markets: A Review of Theory and Empirical Work&quot;,&quot;groupId&quot;:&quot;092e372d-c067-3fdb-b3f7-8bafafb41bf5&quot;,&quot;author&quot;:[{&quot;family&quot;:&quot;Fama&quot;,&quot;given&quot;:&quot;Eugene F.&quot;,&quot;parse-names&quot;:false,&quot;dropping-particle&quot;:&quot;&quot;,&quot;non-dropping-particle&quot;:&quot;&quot;}],&quot;container-title&quot;:&quot;The Journal of Finance&quot;,&quot;container-title-short&quot;:&quot;J. Finance&quot;,&quot;accessed&quot;:{&quot;date-parts&quot;:[[2026,4,29]]},&quot;DOI&quot;:&quot;10.2307/2325486&quot;,&quot;ISSN&quot;:&quot;00221082&quot;,&quot;issued&quot;:{&quot;date-parts&quot;:[[1970,5]]},&quot;page&quot;:&quot;383&quot;,&quot;abstract&quot;:&quot;N/A&quot;,&quot;publisher&quot;:&quot;JSTOR&quot;,&quot;issue&quot;:&quot;2&quot;,&quot;volume&quot;:&quot;25&quot;},&quot;isTemporary&quot;:false}]},{&quot;citationID&quot;:&quot;MENDELEY_CITATION_d73ada41-befa-4e0f-90bd-ae86af98ec82&quot;,&quot;properties&quot;:{&quot;noteIndex&quot;:0},&quot;isEdited&quot;:false,&quot;manualOverride&quot;:{&quot;isManuallyOverridden&quot;:false,&quot;citeprocText&quot;:&quot;(Malkiel, 2003)&quot;,&quot;manualOverrideText&quot;:&quot;&quot;},&quot;citationTag&quot;:&quot;MENDELEY_CITATION_v3_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&quot;,&quot;citationItems&quot;:[{&quot;id&quot;:&quot;1e3d3c72-ca45-32d2-ac4d-18f479bf6e02&quot;,&quot;itemData&quot;:{&quot;type&quot;:&quot;article-journal&quot;,&quot;id&quot;:&quot;1e3d3c72-ca45-32d2-ac4d-18f479bf6e02&quot;,&quot;title&quot;:&quot;The Efficient Market Hypothesis and Its Critics&quot;,&quot;groupId&quot;:&quot;092e372d-c067-3fdb-b3f7-8bafafb41bf5&quot;,&quot;author&quot;:[{&quot;family&quot;:&quot;Malkiel&quot;,&quot;given&quot;:&quot;Burton G&quot;,&quot;parse-names&quot;:false,&quot;dropping-particle&quot;:&quot;&quot;,&quot;non-dropping-particle&quot;:&quot;&quot;}],&quot;accessed&quot;:{&quot;date-parts&quot;:[[2026,4,29]]},&quot;issued&quot;:{&quot;date-parts&quot;:[[2003]]}},&quot;isTemporary&quot;:false}]}]"/>
+    <we:property name="MENDELEY_BIBLIOGRAPHY_LAST_MODIFIED" value="1778089335441"/>
+    <we:property name="MENDELEY_CITATIONS" value="[{&quot;citationID&quot;:&quot;MENDELEY_CITATION_f445dcfc-da19-4caa-a8cf-57a7ddae45ee&quot;,&quot;properties&quot;:{&quot;noteIndex&quot;:0},&quot;isEdited&quot;:false,&quot;manualOverride&quot;:{&quot;isManuallyOverridden&quot;:false,&quot;citeprocText&quot;:&quot;(Hiransha et al., 2018)&quot;,&quot;manualOverrideText&quot;:&quot;&quot;},&quot;citationTag&quot;:&quot;MENDELEY_CITATION_v3_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&quot;,&quot;citationItems&quot;:[{&quot;id&quot;:&quot;9ccf1aa1-1254-3445-bb6e-4b633c72251a&quot;,&quot;itemData&quot;:{&quot;type&quot;:&quot;article-journal&quot;,&quot;id&quot;:&quot;9ccf1aa1-1254-3445-bb6e-4b633c72251a&quot;,&quot;title&quot;:&quot;NSE Stock Market Prediction Using Deep-Learning Models&quot;,&quot;groupId&quot;:&quot;092e372d-c067-3fdb-b3f7-8bafafb41bf5&quot;,&quot;author&quot;:[{&quot;family&quot;:&quot;Hiransha&quot;,&quot;given&quot;:&quot;M.&quot;,&quot;parse-names&quot;:false,&quot;dropping-particle&quot;:&quot;&quot;,&quot;non-dropping-particle&quot;:&quot;&quot;},{&quot;family&quot;:&quot;Gopalakrishnan&quot;,&quot;given&quot;:&quot;E. A.&quot;,&quot;parse-names&quot;:false,&quot;dropping-particle&quot;:&quot;&quot;,&quot;non-dropping-particle&quot;:&quot;&quot;},{&quot;family&quot;:&quot;Menon&quot;,&quot;given&quot;:&quot;Vijay Krishna&quot;,&quot;parse-names&quot;:false,&quot;dropping-particle&quot;:&quot;&quot;,&quot;non-dropping-particle&quot;:&quot;&quot;},{&quot;family&quot;:&quot;Soman&quot;,&quot;given&quot;:&quot;K. P.&quot;,&quot;parse-names&quot;:false,&quot;dropping-particle&quot;:&quot;&quot;,&quot;non-dropping-particle&quot;:&quot;&quot;}],&quot;container-title&quot;:&quot;Procedia Computer Science&quot;,&quot;container-title-short&quot;:&quot;Procedia Comput. Sci.&quot;,&quot;accessed&quot;:{&quot;date-parts&quot;:[[2026,4,29]]},&quot;DOI&quot;:&quot;10.1016/J.PROCS.2018.05.050&quot;,&quot;ISSN&quot;:&quot;1877-0509&quot;,&quot;URL&quot;:&quot;https://www.sciencedirect.com/science/article/pii/S1877050918307828?__cf_chl_tk=U6TCZCqvcyilUU41dh9Js8Ok4cjhAILJlEgc7461JYI-1777485243-1.0.1.1-4saQUybIPsAqa1ar0sQkWKp3rALtB.LEV6dh_t_it.k&quot;,&quot;issued&quot;:{&quot;date-parts&quot;:[[2018,1,1]]},&quot;page&quot;:&quot;1351-1362&quot;,&quot;abstract&quot;:&quot;The neural network, one of the intelligent data mining technique that has been used by researchers in various areas for the past 10 years. Prediction and analysis of stock market data have got an important role in today's economy. The various algorithms used for forecasting can be categorized into linear (AR, MA, ARIMA, ARMA) and non-linear models (ARCH, GARCH, Neural Network). In this paper, we are using four types of deep learning architectures i.e Multilayer Perceptron (MLP), Recurrent Neural Networks (RNN), Long Short-Term Memory (LSTM) and Convolutional Neural Network (CNN) for predicting the stock price of a company based on the historical prices available. Here we are using day-wise closing price of two different stock markets, National Stock Exchange (NSE) of India and New York Stock Exchange (NYSE). The network was trained with the stock price of a single company from NSE and predicted for five different companies from both NSE and NYSE. It has been observed that CNN is outperforming the other models. The network was able to predict for NYSE even though it was trained with NSE data. This was possible because both the stock markets share some common inner dynamics. The results obtained were com- pared with ARIMA model and it has been observed that the neural networks are outperforming the existing linear model (ARIMA).&quot;,&quot;publisher&quot;:&quot;Elsevier&quot;,&quot;volume&quot;:&quot;132&quot;},&quot;isTemporary&quot;:false}]},{&quot;citationID&quot;:&quot;MENDELEY_CITATION_53ec8ca4-926d-45ce-9e2b-95b029699543&quot;,&quot;properties&quot;:{&quot;noteIndex&quot;:0},&quot;isEdited&quot;:false,&quot;manualOverride&quot;:{&quot;isManuallyOverridden&quot;:false,&quot;citeprocText&quot;:&quot;(Fama, 1970)&quot;,&quot;manualOverrideText&quot;:&quot;&quot;},&quot;citationTag&quot;:&quot;MENDELEY_CITATION_v3_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&quot;,&quot;citationItems&quot;:[{&quot;id&quot;:&quot;091e2749-aa60-3c2d-9cc3-1cdad11b5547&quot;,&quot;itemData&quot;:{&quot;type&quot;:&quot;article-journal&quot;,&quot;id&quot;:&quot;091e2749-aa60-3c2d-9cc3-1cdad11b5547&quot;,&quot;title&quot;:&quot;Efficient Capital Markets: A Review of Theory and Empirical Work&quot;,&quot;groupId&quot;:&quot;092e372d-c067-3fdb-b3f7-8bafafb41bf5&quot;,&quot;author&quot;:[{&quot;family&quot;:&quot;Fama&quot;,&quot;given&quot;:&quot;Eugene F.&quot;,&quot;parse-names&quot;:false,&quot;dropping-particle&quot;:&quot;&quot;,&quot;non-dropping-particle&quot;:&quot;&quot;}],&quot;container-title&quot;:&quot;The Journal of Finance&quot;,&quot;container-title-short&quot;:&quot;J. Finance&quot;,&quot;accessed&quot;:{&quot;date-parts&quot;:[[2026,4,29]]},&quot;DOI&quot;:&quot;10.2307/2325486&quot;,&quot;ISSN&quot;:&quot;00221082&quot;,&quot;issued&quot;:{&quot;date-parts&quot;:[[1970,5]]},&quot;page&quot;:&quot;383&quot;,&quot;abstract&quot;:&quot;N/A&quot;,&quot;publisher&quot;:&quot;JSTOR&quot;,&quot;issue&quot;:&quot;2&quot;,&quot;volume&quot;:&quot;25&quot;},&quot;isTemporary&quot;:false}]},{&quot;citationID&quot;:&quot;MENDELEY_CITATION_d73ada41-befa-4e0f-90bd-ae86af98ec82&quot;,&quot;properties&quot;:{&quot;noteIndex&quot;:0},&quot;isEdited&quot;:false,&quot;manualOverride&quot;:{&quot;isManuallyOverridden&quot;:false,&quot;citeprocText&quot;:&quot;(Malkiel, 2003)&quot;,&quot;manualOverrideText&quot;:&quot;&quot;},&quot;citationTag&quot;:&quot;MENDELEY_CITATION_v3_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&quot;,&quot;citationItems&quot;:[{&quot;id&quot;:&quot;1e3d3c72-ca45-32d2-ac4d-18f479bf6e02&quot;,&quot;itemData&quot;:{&quot;type&quot;:&quot;article-journal&quot;,&quot;id&quot;:&quot;1e3d3c72-ca45-32d2-ac4d-18f479bf6e02&quot;,&quot;title&quot;:&quot;The Efficient Market Hypothesis and Its Critics&quot;,&quot;groupId&quot;:&quot;092e372d-c067-3fdb-b3f7-8bafafb41bf5&quot;,&quot;author&quot;:[{&quot;family&quot;:&quot;Malkiel&quot;,&quot;given&quot;:&quot;Burton G&quot;,&quot;parse-names&quot;:false,&quot;dropping-particle&quot;:&quot;&quot;,&quot;non-dropping-particle&quot;:&quot;&quot;}],&quot;accessed&quot;:{&quot;date-parts&quot;:[[2026,4,29]]},&quot;issued&quot;:{&quot;date-parts&quot;:[[2003]]}},&quot;isTemporary&quot;:false}]},{&quot;citationID&quot;:&quot;MENDELEY_CITATION_d823a6e8-196a-49b3-bcc2-27a9685af0e9&quot;,&quot;properties&quot;:{&quot;noteIndex&quot;:0},&quot;isEdited&quot;:false,&quot;manualOverride&quot;:{&quot;isManuallyOverridden&quot;:false,&quot;citeprocText&quot;:&quot;(Levine &amp;#38; Zervos, 1996)&quot;,&quot;manualOverrideText&quot;:&quot;&quot;},&quot;citationTag&quot;:&quot;MENDELEY_CITATION_v3_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&quot;,&quot;citationItems&quot;:[{&quot;id&quot;:&quot;c54459cf-ae7c-3a20-8e06-1752f7983a75&quot;,&quot;itemData&quot;:{&quot;type&quot;:&quot;article-journal&quot;,&quot;id&quot;:&quot;c54459cf-ae7c-3a20-8e06-1752f7983a75&quot;,&quot;title&quot;:&quot;Stock Market Development and Long-Run Growth&quot;,&quot;groupId&quot;:&quot;092e372d-c067-3fdb-b3f7-8bafafb41bf5&quot;,&quot;author&quot;:[{&quot;family&quot;:&quot;Levine&quot;,&quot;given&quot;:&quot;Ross&quot;,&quot;parse-names&quot;:false,&quot;dropping-particle&quot;:&quot;&quot;,&quot;non-dropping-particle&quot;:&quot;&quot;},{&quot;family&quot;:&quot;Zervos&quot;,&quot;given&quot;:&quot;Sara&quot;,&quot;parse-names&quot;:false,&quot;dropping-particle&quot;:&quot;&quot;,&quot;non-dropping-particle&quot;:&quot;&quot;}],&quot;container-title&quot;:&quot;The World Bank Economic Review&quot;,&quot;container-title-short&quot;:&quot;World Bank Econ. Rev.&quot;,&quot;accessed&quot;:{&quot;date-parts&quot;:[[2026,5,6]]},&quot;DOI&quot;:&quot;10.1093/WBER/10.2.323&quot;,&quot;ISSN&quot;:&quot;0258-6770&quot;,&quot;URL&quot;:&quot;https://dx.doi.org/10.1093/wber/10.2.323&quot;,&quot;issued&quot;:{&quot;date-parts&quot;:[[1996,5,1]]},&quot;page&quot;:&quot;323-339&quot;,&quot;abstract&quot;:&quot;Is the financial system important for economic growth? One line of research argues that it is not; another line stresses the importance of the financial system in mobilizing savings, allocating capital, exerting corporate control, and easing risk management. Moreover, some theories provide a conceptual basis for the belief that larger, more efficient stock markets boost economic growth. This article examines whether there is a strong empirical association between stock market development and long-run economic growth. Cross-country growth regressions suggest that the predeter-mined component of stock market development is positively and robustly associated with long-run economic growth.&quot;,&quot;publisher&quot;:&quot;Oxford Academic&quot;,&quot;issue&quot;:&quot;2&quot;,&quot;volume&quot;:&quot;10&quot;},&quot;isTemporary&quot;:false}]},{&quot;citationID&quot;:&quot;MENDELEY_CITATION_597f96f4-553a-44a2-8dd3-addebd32ee68&quot;,&quot;properties&quot;:{&quot;noteIndex&quot;:0},&quot;isEdited&quot;:false,&quot;manualOverride&quot;:{&quot;isManuallyOverridden&quot;:false,&quot;citeprocText&quot;:&quot;(Levine &amp;#38; Zervos, 1996)&quot;,&quot;manualOverrideText&quot;:&quot;&quot;},&quot;citationTag&quot;:&quot;MENDELEY_CITATION_v3_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&quot;,&quot;citationItems&quot;:[{&quot;id&quot;:&quot;c54459cf-ae7c-3a20-8e06-1752f7983a75&quot;,&quot;itemData&quot;:{&quot;type&quot;:&quot;article-journal&quot;,&quot;id&quot;:&quot;c54459cf-ae7c-3a20-8e06-1752f7983a75&quot;,&quot;title&quot;:&quot;Stock Market Development and Long-Run Growth&quot;,&quot;groupId&quot;:&quot;092e372d-c067-3fdb-b3f7-8bafafb41bf5&quot;,&quot;author&quot;:[{&quot;family&quot;:&quot;Levine&quot;,&quot;given&quot;:&quot;Ross&quot;,&quot;parse-names&quot;:false,&quot;dropping-particle&quot;:&quot;&quot;,&quot;non-dropping-particle&quot;:&quot;&quot;},{&quot;family&quot;:&quot;Zervos&quot;,&quot;given&quot;:&quot;Sara&quot;,&quot;parse-names&quot;:false,&quot;dropping-particle&quot;:&quot;&quot;,&quot;non-dropping-particle&quot;:&quot;&quot;}],&quot;container-title&quot;:&quot;The World Bank Economic Review&quot;,&quot;container-title-short&quot;:&quot;World Bank Econ. Rev.&quot;,&quot;accessed&quot;:{&quot;date-parts&quot;:[[2026,5,6]]},&quot;DOI&quot;:&quot;10.1093/WBER/10.2.323&quot;,&quot;ISSN&quot;:&quot;0258-6770&quot;,&quot;URL&quot;:&quot;https://dx.doi.org/10.1093/wber/10.2.323&quot;,&quot;issued&quot;:{&quot;date-parts&quot;:[[1996,5,1]]},&quot;page&quot;:&quot;323-339&quot;,&quot;abstract&quot;:&quot;Is the financial system important for economic growth? One line of research argues that it is not; another line stresses the importance of the financial system in mobilizing savings, allocating capital, exerting corporate control, and easing risk management. Moreover, some theories provide a conceptual basis for the belief that larger, more efficient stock markets boost economic growth. This article examines whether there is a strong empirical association between stock market development and long-run economic growth. Cross-country growth regressions suggest that the predeter-mined component of stock market development is positively and robustly associated with long-run economic growth.&quot;,&quot;publisher&quot;:&quot;Oxford Academic&quot;,&quot;issue&quot;:&quot;2&quot;,&quot;volume&quot;:&quot;10&quot;},&quot;isTemporary&quot;:false}]},{&quot;citationID&quot;:&quot;MENDELEY_CITATION_aa2b6abc-95eb-4667-801f-e1b162858949&quot;,&quot;properties&quot;:{&quot;noteIndex&quot;:0},&quot;isEdited&quot;:false,&quot;manualOverride&quot;:{&quot;isManuallyOverridden&quot;:false,&quot;citeprocText&quot;:&quot;(Shah et al., 2019)&quot;,&quot;manualOverrideText&quot;:&quot;&quot;},&quot;citationTag&quot;:&quot;MENDELEY_CITATION_v3_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&quot;,&quot;citationItems&quot;:[{&quot;id&quot;:&quot;8d1a3d32-6c56-311b-80d4-9313558321ef&quot;,&quot;itemData&quot;:{&quot;type&quot;:&quot;article-journal&quot;,&quot;id&quot;:&quot;8d1a3d32-6c56-311b-80d4-9313558321ef&quot;,&quot;title&quot;:&quot;Stock Market Analysis: A Review and Taxonomy of Prediction Techniques&quot;,&quot;groupId&quot;:&quot;092e372d-c067-3fdb-b3f7-8bafafb41bf5&quot;,&quot;author&quot;:[{&quot;family&quot;:&quot;Shah&quot;,&quot;given&quot;:&quot;Dev&quot;,&quot;parse-names&quot;:false,&quot;dropping-particle&quot;:&quot;&quot;,&quot;non-dropping-particle&quot;:&quot;&quot;},{&quot;family&quot;:&quot;Isah&quot;,&quot;given&quot;:&quot;Haruna&quot;,&quot;parse-names&quot;:false,&quot;dropping-particle&quot;:&quot;&quot;,&quot;non-dropping-particle&quot;:&quot;&quot;},{&quot;family&quot;:&quot;Zulkernine&quot;,&quot;given&quot;:&quot;Farhana&quot;,&quot;parse-names&quot;:false,&quot;dropping-particle&quot;:&quot;&quot;,&quot;non-dropping-particle&quot;:&quot;&quot;}],&quot;container-title&quot;:&quot;International Journal of Financial Studies 2019, Vol. 7, Page 26&quot;,&quot;accessed&quot;:{&quot;date-parts&quot;:[[2026,4,29]]},&quot;DOI&quot;:&quot;10.3390/IJFS7020026&quot;,&quot;ISSN&quot;:&quot;2227-7072&quot;,&quot;URL&quot;:&quot;https://www.mdpi.com/2227-7072/7/2/26/htm&quot;,&quot;issued&quot;:{&quot;date-parts&quot;:[[2019,5,27]]},&quot;page&quot;:&quot;26&quot;,&quot;abstract&quot;:&quot;Stock market prediction has always caught the attention of many analysts and researchers. Popular theories suggest that stock markets are essentially a random walk and it is a fool’s game to try and predict them. Predicting stock prices is a challenging problem in itself because of the number of variables which are involved. In the short term, the market behaves like a voting machine but in the longer term, it acts like a weighing machine and hence there is scope for predicting the market movements for a longer timeframe. Application of machine learning techniques and other algorithms for stock price analysis and forecasting is an area that shows great promise. In this paper, we first provide a concise review of stock markets and taxonomy of stock market prediction methods. We then focus on some of the research achievements in stock analysis and prediction. We discuss technical, fundamental, short- and long-term approaches used for stock analysis. Finally, we present some challenges and research opportunities in this field.&quot;,&quot;publisher&quot;:&quot;Multidisciplinary Digital Publishing Institute&quot;,&quot;issue&quot;:&quot;2&quot;,&quot;volume&quot;:&quot;7&quot;},&quot;isTemporary&quot;:false}]},{&quot;citationID&quot;:&quot;MENDELEY_CITATION_3f021c6d-2661-4bb4-9f03-f17b1b7e7780&quot;,&quot;properties&quot;:{&quot;noteIndex&quot;:0},&quot;isEdited&quot;:false,&quot;manualOverride&quot;:{&quot;isManuallyOverridden&quot;:false,&quot;citeprocText&quot;:&quot;(Shah et al., 2019)&quot;,&quot;manualOverrideText&quot;:&quot;&quot;},&quot;citationTag&quot;:&quot;MENDELEY_CITATION_v3_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&quot;,&quot;citationItems&quot;:[{&quot;id&quot;:&quot;8d1a3d32-6c56-311b-80d4-9313558321ef&quot;,&quot;itemData&quot;:{&quot;type&quot;:&quot;article-journal&quot;,&quot;id&quot;:&quot;8d1a3d32-6c56-311b-80d4-9313558321ef&quot;,&quot;title&quot;:&quot;Stock Market Analysis: A Review and Taxonomy of Prediction Techniques&quot;,&quot;groupId&quot;:&quot;092e372d-c067-3fdb-b3f7-8bafafb41bf5&quot;,&quot;author&quot;:[{&quot;family&quot;:&quot;Shah&quot;,&quot;given&quot;:&quot;Dev&quot;,&quot;parse-names&quot;:false,&quot;dropping-particle&quot;:&quot;&quot;,&quot;non-dropping-particle&quot;:&quot;&quot;},{&quot;family&quot;:&quot;Isah&quot;,&quot;given&quot;:&quot;Haruna&quot;,&quot;parse-names&quot;:false,&quot;dropping-particle&quot;:&quot;&quot;,&quot;non-dropping-particle&quot;:&quot;&quot;},{&quot;family&quot;:&quot;Zulkernine&quot;,&quot;given&quot;:&quot;Farhana&quot;,&quot;parse-names&quot;:false,&quot;dropping-particle&quot;:&quot;&quot;,&quot;non-dropping-particle&quot;:&quot;&quot;}],&quot;container-title&quot;:&quot;International Journal of Financial Studies 2019, Vol. 7, Page 26&quot;,&quot;accessed&quot;:{&quot;date-parts&quot;:[[2026,4,29]]},&quot;DOI&quot;:&quot;10.3390/IJFS7020026&quot;,&quot;ISSN&quot;:&quot;2227-7072&quot;,&quot;URL&quot;:&quot;https://www.mdpi.com/2227-7072/7/2/26/htm&quot;,&quot;issued&quot;:{&quot;date-parts&quot;:[[2019,5,27]]},&quot;page&quot;:&quot;26&quot;,&quot;abstract&quot;:&quot;Stock market prediction has always caught the attention of many analysts and researchers. Popular theories suggest that stock markets are essentially a random walk and it is a fool’s game to try and predict them. Predicting stock prices is a challenging problem in itself because of the number of variables which are involved. In the short term, the market behaves like a voting machine but in the longer term, it acts like a weighing machine and hence there is scope for predicting the market movements for a longer timeframe. Application of machine learning techniques and other algorithms for stock price analysis and forecasting is an area that shows great promise. In this paper, we first provide a concise review of stock markets and taxonomy of stock market prediction methods. We then focus on some of the research achievements in stock analysis and prediction. We discuss technical, fundamental, short- and long-term approaches used for stock analysis. Finally, we present some challenges and research opportunities in this field.&quot;,&quot;publisher&quot;:&quot;Multidisciplinary Digital Publishing Institute&quot;,&quot;issue&quot;:&quot;2&quot;,&quot;volume&quot;:&quot;7&quot;},&quot;isTemporary&quot;:false}]}]"/>
     <we:property name="MENDELEY_CITATIONS_STYLE" value="{&quot;id&quot;:&quot;https://www.zotero.org/styles/apa&quot;,&quot;title&quot;:&quot;APA Style 7th edition&quot;,&quot;format&quot;:&quot;author-date&quot;,&quot;defaultLocale&quot;:null,&quot;isLocaleCodeValid&quot;:true}"/>
   </we:properties>
   <we:bindings/>

</xml_diff>

<commit_message>
Modely ARCH teoretická časť
</commit_message>
<xml_diff>
--- a/Volatilita_Trhov_Luzak.docx
+++ b/Volatilita_Trhov_Luzak.docx
@@ -388,6 +388,7 @@
       <w:bookmarkStart w:id="21" w:name="_Toc318099693"/>
       <w:bookmarkStart w:id="22" w:name="_Toc339279004"/>
       <w:bookmarkStart w:id="23" w:name="_Toc476657452"/>
+      <w:bookmarkStart w:id="24" w:name="_Toc230542207"/>
       <w:r>
         <w:lastRenderedPageBreak/>
         <w:t xml:space="preserve">Zadanie </w:t>
@@ -404,6 +405,7 @@
       <w:bookmarkEnd w:id="13"/>
       <w:bookmarkEnd w:id="14"/>
       <w:bookmarkEnd w:id="15"/>
+      <w:bookmarkEnd w:id="24"/>
       <w:r>
         <w:rPr>
           <w:lang w:eastAsia="sk-SK"/>
@@ -553,10 +555,10 @@
       </w:r>
     </w:p>
     <w:p>
-      <w:bookmarkStart w:id="24" w:name="_Toc309047200"/>
-      <w:bookmarkStart w:id="25" w:name="_Toc309047429"/>
-      <w:bookmarkStart w:id="26" w:name="_Toc309047475"/>
-      <w:bookmarkStart w:id="27" w:name="_Toc309047592"/>
+      <w:bookmarkStart w:id="25" w:name="_Toc309047200"/>
+      <w:bookmarkStart w:id="26" w:name="_Toc309047429"/>
+      <w:bookmarkStart w:id="27" w:name="_Toc309047475"/>
+      <w:bookmarkStart w:id="28" w:name="_Toc309047592"/>
     </w:p>
     <w:p/>
     <w:p/>
@@ -588,24 +590,24 @@
       <w:pPr>
         <w:pStyle w:val="Nadpis1"/>
       </w:pPr>
-      <w:bookmarkStart w:id="28" w:name="_Toc339279005"/>
-      <w:bookmarkStart w:id="29" w:name="_Toc476657453"/>
-      <w:bookmarkStart w:id="30" w:name="_Toc99180810"/>
-      <w:bookmarkStart w:id="31" w:name="_Toc114690416"/>
-      <w:bookmarkStart w:id="32" w:name="_Toc115115255"/>
-      <w:bookmarkStart w:id="33" w:name="_Toc115369793"/>
-      <w:bookmarkStart w:id="34" w:name="_Toc209454650"/>
-      <w:bookmarkStart w:id="35" w:name="_Toc227589980"/>
-      <w:bookmarkStart w:id="36" w:name="_Toc309114060"/>
-      <w:bookmarkStart w:id="37" w:name="_Toc318099694"/>
-      <w:bookmarkEnd w:id="24"/>
+      <w:bookmarkStart w:id="29" w:name="_Toc339279005"/>
+      <w:bookmarkStart w:id="30" w:name="_Toc476657453"/>
+      <w:bookmarkStart w:id="31" w:name="_Toc99180810"/>
+      <w:bookmarkStart w:id="32" w:name="_Toc114690416"/>
+      <w:bookmarkStart w:id="33" w:name="_Toc115115255"/>
+      <w:bookmarkStart w:id="34" w:name="_Toc115369793"/>
+      <w:bookmarkStart w:id="35" w:name="_Toc209454650"/>
+      <w:bookmarkStart w:id="36" w:name="_Toc227589980"/>
+      <w:bookmarkStart w:id="37" w:name="_Toc309114060"/>
+      <w:bookmarkStart w:id="38" w:name="_Toc318099694"/>
+      <w:bookmarkStart w:id="39" w:name="_Toc230542208"/>
       <w:bookmarkEnd w:id="25"/>
       <w:bookmarkEnd w:id="26"/>
       <w:bookmarkEnd w:id="27"/>
+      <w:bookmarkEnd w:id="28"/>
       <w:r>
         <w:t>Poďakovanie</w:t>
       </w:r>
-      <w:bookmarkEnd w:id="28"/>
       <w:bookmarkEnd w:id="29"/>
       <w:bookmarkEnd w:id="30"/>
       <w:bookmarkEnd w:id="31"/>
@@ -613,12 +615,14 @@
       <w:bookmarkEnd w:id="33"/>
       <w:bookmarkEnd w:id="34"/>
       <w:bookmarkEnd w:id="35"/>
+      <w:bookmarkEnd w:id="36"/>
+      <w:bookmarkEnd w:id="39"/>
       <w:r>
         <w:t xml:space="preserve"> </w:t>
       </w:r>
     </w:p>
-    <w:bookmarkEnd w:id="36"/>
     <w:bookmarkEnd w:id="37"/>
+    <w:bookmarkEnd w:id="38"/>
     <w:p>
       <w:pPr>
         <w:rPr>
@@ -669,25 +673,24 @@
       <w:pPr>
         <w:pStyle w:val="Nadpis1"/>
       </w:pPr>
-      <w:bookmarkStart w:id="38" w:name="_Toc309047430"/>
-      <w:bookmarkStart w:id="39" w:name="_Toc309047476"/>
-      <w:bookmarkStart w:id="40" w:name="_Toc309047593"/>
-      <w:bookmarkStart w:id="41" w:name="_Toc309114061"/>
-      <w:bookmarkStart w:id="42" w:name="_Toc318099695"/>
-      <w:bookmarkStart w:id="43" w:name="_Toc339279006"/>
-      <w:bookmarkStart w:id="44" w:name="_Toc476657454"/>
-      <w:bookmarkStart w:id="45" w:name="_Toc99180811"/>
-      <w:bookmarkStart w:id="46" w:name="_Toc114690417"/>
-      <w:bookmarkStart w:id="47" w:name="_Toc115115256"/>
-      <w:bookmarkStart w:id="48" w:name="_Toc115369794"/>
-      <w:bookmarkStart w:id="49" w:name="_Toc209454651"/>
-      <w:bookmarkStart w:id="50" w:name="_Toc227589981"/>
+      <w:bookmarkStart w:id="40" w:name="_Toc309047430"/>
+      <w:bookmarkStart w:id="41" w:name="_Toc309047476"/>
+      <w:bookmarkStart w:id="42" w:name="_Toc309047593"/>
+      <w:bookmarkStart w:id="43" w:name="_Toc309114061"/>
+      <w:bookmarkStart w:id="44" w:name="_Toc318099695"/>
+      <w:bookmarkStart w:id="45" w:name="_Toc339279006"/>
+      <w:bookmarkStart w:id="46" w:name="_Toc476657454"/>
+      <w:bookmarkStart w:id="47" w:name="_Toc99180811"/>
+      <w:bookmarkStart w:id="48" w:name="_Toc114690417"/>
+      <w:bookmarkStart w:id="49" w:name="_Toc115115256"/>
+      <w:bookmarkStart w:id="50" w:name="_Toc115369794"/>
+      <w:bookmarkStart w:id="51" w:name="_Toc209454651"/>
+      <w:bookmarkStart w:id="52" w:name="_Toc227589981"/>
+      <w:bookmarkStart w:id="53" w:name="_Toc230542209"/>
       <w:r>
         <w:lastRenderedPageBreak/>
         <w:t>ABSTRAKT</w:t>
       </w:r>
-      <w:bookmarkEnd w:id="38"/>
-      <w:bookmarkEnd w:id="39"/>
       <w:bookmarkEnd w:id="40"/>
       <w:bookmarkEnd w:id="41"/>
       <w:bookmarkEnd w:id="42"/>
@@ -699,45 +702,46 @@
       <w:bookmarkEnd w:id="48"/>
       <w:bookmarkEnd w:id="49"/>
       <w:bookmarkEnd w:id="50"/>
-    </w:p>
-    <w:p>
-      <w:pPr>
-        <w:rPr>
-          <w:kern w:val="32"/>
-        </w:rPr>
-      </w:pPr>
-      <w:bookmarkStart w:id="51" w:name="_Toc309047431"/>
-      <w:bookmarkStart w:id="52" w:name="_Toc309047477"/>
-      <w:bookmarkStart w:id="53" w:name="_Toc309047594"/>
-      <w:bookmarkStart w:id="54" w:name="_Toc309114062"/>
-      <w:bookmarkStart w:id="55" w:name="_Toc318099696"/>
-      <w:r>
-        <w:br w:type="page"/>
-      </w:r>
-    </w:p>
-    <w:p>
-      <w:pPr>
-        <w:pStyle w:val="Nadpis1"/>
-      </w:pPr>
-      <w:bookmarkStart w:id="56" w:name="_Toc339279007"/>
-      <w:bookmarkStart w:id="57" w:name="_Toc476657455"/>
-      <w:bookmarkStart w:id="58" w:name="_Toc99180812"/>
-      <w:bookmarkStart w:id="59" w:name="_Toc114690418"/>
-      <w:bookmarkStart w:id="60" w:name="_Toc115115257"/>
-      <w:bookmarkStart w:id="61" w:name="_Toc115369795"/>
-      <w:bookmarkStart w:id="62" w:name="_Toc209454652"/>
-      <w:bookmarkStart w:id="63" w:name="_Toc227589982"/>
-      <w:r>
-        <w:lastRenderedPageBreak/>
-        <w:t>ABSTRACT</w:t>
-      </w:r>
-      <w:bookmarkStart w:id="64" w:name="_Toc309047203"/>
-      <w:bookmarkStart w:id="65" w:name="_Toc309047432"/>
-      <w:bookmarkStart w:id="66" w:name="_Toc309047478"/>
-      <w:bookmarkStart w:id="67" w:name="_Toc309047595"/>
       <w:bookmarkEnd w:id="51"/>
       <w:bookmarkEnd w:id="52"/>
       <w:bookmarkEnd w:id="53"/>
+    </w:p>
+    <w:p>
+      <w:pPr>
+        <w:rPr>
+          <w:kern w:val="32"/>
+        </w:rPr>
+      </w:pPr>
+      <w:bookmarkStart w:id="54" w:name="_Toc309047431"/>
+      <w:bookmarkStart w:id="55" w:name="_Toc309047477"/>
+      <w:bookmarkStart w:id="56" w:name="_Toc309047594"/>
+      <w:bookmarkStart w:id="57" w:name="_Toc309114062"/>
+      <w:bookmarkStart w:id="58" w:name="_Toc318099696"/>
+      <w:r>
+        <w:br w:type="page"/>
+      </w:r>
+    </w:p>
+    <w:p>
+      <w:pPr>
+        <w:pStyle w:val="Nadpis1"/>
+      </w:pPr>
+      <w:bookmarkStart w:id="59" w:name="_Toc339279007"/>
+      <w:bookmarkStart w:id="60" w:name="_Toc476657455"/>
+      <w:bookmarkStart w:id="61" w:name="_Toc99180812"/>
+      <w:bookmarkStart w:id="62" w:name="_Toc114690418"/>
+      <w:bookmarkStart w:id="63" w:name="_Toc115115257"/>
+      <w:bookmarkStart w:id="64" w:name="_Toc115369795"/>
+      <w:bookmarkStart w:id="65" w:name="_Toc209454652"/>
+      <w:bookmarkStart w:id="66" w:name="_Toc227589982"/>
+      <w:bookmarkStart w:id="67" w:name="_Toc230542210"/>
+      <w:r>
+        <w:lastRenderedPageBreak/>
+        <w:t>ABSTRACT</w:t>
+      </w:r>
+      <w:bookmarkStart w:id="68" w:name="_Toc309047203"/>
+      <w:bookmarkStart w:id="69" w:name="_Toc309047432"/>
+      <w:bookmarkStart w:id="70" w:name="_Toc309047478"/>
+      <w:bookmarkStart w:id="71" w:name="_Toc309047595"/>
       <w:bookmarkEnd w:id="54"/>
       <w:bookmarkEnd w:id="55"/>
       <w:bookmarkEnd w:id="56"/>
@@ -748,6 +752,10 @@
       <w:bookmarkEnd w:id="61"/>
       <w:bookmarkEnd w:id="62"/>
       <w:bookmarkEnd w:id="63"/>
+      <w:bookmarkEnd w:id="64"/>
+      <w:bookmarkEnd w:id="65"/>
+      <w:bookmarkEnd w:id="66"/>
+      <w:bookmarkEnd w:id="67"/>
     </w:p>
     <w:p>
       <w:pPr>
@@ -791,23 +799,20 @@
       <w:pPr>
         <w:pStyle w:val="Nadpis1"/>
       </w:pPr>
-      <w:bookmarkStart w:id="68" w:name="_Toc309114063"/>
-      <w:bookmarkStart w:id="69" w:name="_Toc318099697"/>
-      <w:bookmarkStart w:id="70" w:name="_Toc339279008"/>
-      <w:bookmarkStart w:id="71" w:name="_Toc115115258"/>
-      <w:bookmarkStart w:id="72" w:name="_Toc115369796"/>
-      <w:bookmarkStart w:id="73" w:name="_Toc209454653"/>
-      <w:bookmarkStart w:id="74" w:name="_Toc227589983"/>
-      <w:bookmarkStart w:id="75" w:name="_Toc99180813"/>
-      <w:bookmarkStart w:id="76" w:name="_Toc114690419"/>
+      <w:bookmarkStart w:id="72" w:name="_Toc309114063"/>
+      <w:bookmarkStart w:id="73" w:name="_Toc318099697"/>
+      <w:bookmarkStart w:id="74" w:name="_Toc339279008"/>
+      <w:bookmarkStart w:id="75" w:name="_Toc115115258"/>
+      <w:bookmarkStart w:id="76" w:name="_Toc115369796"/>
+      <w:bookmarkStart w:id="77" w:name="_Toc209454653"/>
+      <w:bookmarkStart w:id="78" w:name="_Toc227589983"/>
+      <w:bookmarkStart w:id="79" w:name="_Toc99180813"/>
+      <w:bookmarkStart w:id="80" w:name="_Toc114690419"/>
+      <w:bookmarkStart w:id="81" w:name="_Toc230542211"/>
       <w:r>
         <w:lastRenderedPageBreak/>
         <w:t>Obsah</w:t>
       </w:r>
-      <w:bookmarkEnd w:id="64"/>
-      <w:bookmarkEnd w:id="65"/>
-      <w:bookmarkEnd w:id="66"/>
-      <w:bookmarkEnd w:id="67"/>
       <w:bookmarkEnd w:id="68"/>
       <w:bookmarkEnd w:id="69"/>
       <w:bookmarkEnd w:id="70"/>
@@ -815,11 +820,16 @@
       <w:bookmarkEnd w:id="72"/>
       <w:bookmarkEnd w:id="73"/>
       <w:bookmarkEnd w:id="74"/>
-      <w:r>
-        <w:t xml:space="preserve"> </w:t>
-      </w:r>
       <w:bookmarkEnd w:id="75"/>
       <w:bookmarkEnd w:id="76"/>
+      <w:bookmarkEnd w:id="77"/>
+      <w:bookmarkEnd w:id="78"/>
+      <w:bookmarkEnd w:id="81"/>
+      <w:r>
+        <w:t xml:space="preserve"> </w:t>
+      </w:r>
+      <w:bookmarkEnd w:id="79"/>
+      <w:bookmarkEnd w:id="80"/>
     </w:p>
     <w:sdt>
       <w:sdtPr>
@@ -844,7 +854,6 @@
               <w:rFonts w:asciiTheme="minorHAnsi" w:eastAsiaTheme="minorEastAsia" w:hAnsiTheme="minorHAnsi" w:cstheme="minorBidi"/>
               <w:b w:val="0"/>
               <w:bCs w:val="0"/>
-              <w:noProof w:val="0"/>
               <w:kern w:val="2"/>
               <w:szCs w:val="24"/>
               <w:lang w:eastAsia="sk-SK"/>
@@ -872,11 +881,10 @@
             </w:rPr>
             <w:fldChar w:fldCharType="separate"/>
           </w:r>
-          <w:hyperlink w:anchor="_Toc227589986" w:history="1">
+          <w:hyperlink w:anchor="_Toc230542214" w:history="1">
             <w:r>
               <w:rPr>
                 <w:rStyle w:val="Hypertextovprepojenie"/>
-                <w:noProof w:val="0"/>
               </w:rPr>
               <w:t>1</w:t>
             </w:r>
@@ -885,7 +893,6 @@
                 <w:rFonts w:asciiTheme="minorHAnsi" w:eastAsiaTheme="minorEastAsia" w:hAnsiTheme="minorHAnsi" w:cstheme="minorBidi"/>
                 <w:b w:val="0"/>
                 <w:bCs w:val="0"/>
-                <w:noProof w:val="0"/>
                 <w:kern w:val="2"/>
                 <w:szCs w:val="24"/>
                 <w:lang w:eastAsia="sk-SK"/>
@@ -896,54 +903,535 @@
             <w:r>
               <w:rPr>
                 <w:rStyle w:val="Hypertextovprepojenie"/>
-                <w:noProof w:val="0"/>
               </w:rPr>
               <w:t>Analýza súčasného stavu</w:t>
             </w:r>
             <w:r>
               <w:rPr>
-                <w:noProof w:val="0"/>
                 <w:webHidden/>
               </w:rPr>
               <w:tab/>
             </w:r>
             <w:r>
               <w:rPr>
-                <w:noProof w:val="0"/>
                 <w:webHidden/>
               </w:rPr>
               <w:fldChar w:fldCharType="begin"/>
             </w:r>
             <w:r>
               <w:rPr>
-                <w:noProof w:val="0"/>
                 <w:webHidden/>
               </w:rPr>
-              <w:instrText xml:space="preserve"> PAGEREF _Toc227589986 \h </w:instrText>
-            </w:r>
-            <w:r>
-              <w:rPr>
-                <w:noProof w:val="0"/>
+              <w:instrText xml:space="preserve"> PAGEREF _Toc230542214 \h </w:instrText>
+            </w:r>
+            <w:r>
+              <w:rPr>
                 <w:webHidden/>
               </w:rPr>
             </w:r>
             <w:r>
               <w:rPr>
-                <w:noProof w:val="0"/>
                 <w:webHidden/>
               </w:rPr>
               <w:fldChar w:fldCharType="separate"/>
             </w:r>
             <w:r>
               <w:rPr>
-                <w:noProof w:val="0"/>
                 <w:webHidden/>
               </w:rPr>
               <w:t>10</w:t>
             </w:r>
             <w:r>
               <w:rPr>
-                <w:noProof w:val="0"/>
+                <w:webHidden/>
+              </w:rPr>
+              <w:fldChar w:fldCharType="end"/>
+            </w:r>
+          </w:hyperlink>
+        </w:p>
+        <w:p>
+          <w:pPr>
+            <w:pStyle w:val="Obsah2"/>
+            <w:rPr>
+              <w:rFonts w:asciiTheme="minorHAnsi" w:eastAsiaTheme="minorEastAsia" w:hAnsiTheme="minorHAnsi" w:cstheme="minorBidi"/>
+              <w:kern w:val="2"/>
+              <w:sz w:val="24"/>
+              <w:szCs w:val="24"/>
+              <w:lang w:eastAsia="sk-SK"/>
+              <w14:ligatures w14:val="standardContextual"/>
+            </w:rPr>
+          </w:pPr>
+          <w:hyperlink w:anchor="_Toc230542215" w:history="1">
+            <w:r>
+              <w:rPr>
+                <w:rStyle w:val="Hypertextovprepojenie"/>
+              </w:rPr>
+              <w:t>1.1</w:t>
+            </w:r>
+            <w:r>
+              <w:rPr>
+                <w:rFonts w:asciiTheme="minorHAnsi" w:eastAsiaTheme="minorEastAsia" w:hAnsiTheme="minorHAnsi" w:cstheme="minorBidi"/>
+                <w:kern w:val="2"/>
+                <w:sz w:val="24"/>
+                <w:szCs w:val="24"/>
+                <w:lang w:eastAsia="sk-SK"/>
+                <w14:ligatures w14:val="standardContextual"/>
+              </w:rPr>
+              <w:tab/>
+            </w:r>
+            <w:r>
+              <w:rPr>
+                <w:rStyle w:val="Hypertextovprepojenie"/>
+              </w:rPr>
+              <w:t>Charakteristika Akciového trhu</w:t>
+            </w:r>
+            <w:r>
+              <w:rPr>
+                <w:webHidden/>
+              </w:rPr>
+              <w:tab/>
+            </w:r>
+            <w:r>
+              <w:rPr>
+                <w:webHidden/>
+              </w:rPr>
+              <w:fldChar w:fldCharType="begin"/>
+            </w:r>
+            <w:r>
+              <w:rPr>
+                <w:webHidden/>
+              </w:rPr>
+              <w:instrText xml:space="preserve"> PAGEREF _Toc230542215 \h </w:instrText>
+            </w:r>
+            <w:r>
+              <w:rPr>
+                <w:webHidden/>
+              </w:rPr>
+            </w:r>
+            <w:r>
+              <w:rPr>
+                <w:webHidden/>
+              </w:rPr>
+              <w:fldChar w:fldCharType="separate"/>
+            </w:r>
+            <w:r>
+              <w:rPr>
+                <w:webHidden/>
+              </w:rPr>
+              <w:t>10</w:t>
+            </w:r>
+            <w:r>
+              <w:rPr>
+                <w:webHidden/>
+              </w:rPr>
+              <w:fldChar w:fldCharType="end"/>
+            </w:r>
+          </w:hyperlink>
+        </w:p>
+        <w:p>
+          <w:pPr>
+            <w:pStyle w:val="Obsah3"/>
+            <w:rPr>
+              <w:rFonts w:asciiTheme="minorHAnsi" w:eastAsiaTheme="minorEastAsia" w:hAnsiTheme="minorHAnsi" w:cstheme="minorBidi"/>
+              <w:iCs w:val="0"/>
+              <w:kern w:val="2"/>
+              <w:sz w:val="24"/>
+              <w:szCs w:val="24"/>
+              <w:lang w:eastAsia="sk-SK"/>
+              <w14:ligatures w14:val="standardContextual"/>
+            </w:rPr>
+          </w:pPr>
+          <w:hyperlink w:anchor="_Toc230542216" w:history="1">
+            <w:r>
+              <w:rPr>
+                <w:rStyle w:val="Hypertextovprepojenie"/>
+              </w:rPr>
+              <w:t>1.1.1</w:t>
+            </w:r>
+            <w:r>
+              <w:rPr>
+                <w:rFonts w:asciiTheme="minorHAnsi" w:eastAsiaTheme="minorEastAsia" w:hAnsiTheme="minorHAnsi" w:cstheme="minorBidi"/>
+                <w:iCs w:val="0"/>
+                <w:kern w:val="2"/>
+                <w:sz w:val="24"/>
+                <w:szCs w:val="24"/>
+                <w:lang w:eastAsia="sk-SK"/>
+                <w14:ligatures w14:val="standardContextual"/>
+              </w:rPr>
+              <w:tab/>
+            </w:r>
+            <w:r>
+              <w:rPr>
+                <w:rStyle w:val="Hypertextovprepojenie"/>
+              </w:rPr>
+              <w:t>Hypotéza Efektívneho trhu</w:t>
+            </w:r>
+            <w:r>
+              <w:rPr>
+                <w:webHidden/>
+              </w:rPr>
+              <w:tab/>
+            </w:r>
+            <w:r>
+              <w:rPr>
+                <w:webHidden/>
+              </w:rPr>
+              <w:fldChar w:fldCharType="begin"/>
+            </w:r>
+            <w:r>
+              <w:rPr>
+                <w:webHidden/>
+              </w:rPr>
+              <w:instrText xml:space="preserve"> PAGEREF _Toc230542216 \h </w:instrText>
+            </w:r>
+            <w:r>
+              <w:rPr>
+                <w:webHidden/>
+              </w:rPr>
+            </w:r>
+            <w:r>
+              <w:rPr>
+                <w:webHidden/>
+              </w:rPr>
+              <w:fldChar w:fldCharType="separate"/>
+            </w:r>
+            <w:r>
+              <w:rPr>
+                <w:webHidden/>
+              </w:rPr>
+              <w:t>10</w:t>
+            </w:r>
+            <w:r>
+              <w:rPr>
+                <w:webHidden/>
+              </w:rPr>
+              <w:fldChar w:fldCharType="end"/>
+            </w:r>
+          </w:hyperlink>
+        </w:p>
+        <w:p>
+          <w:pPr>
+            <w:pStyle w:val="Obsah3"/>
+            <w:rPr>
+              <w:rFonts w:asciiTheme="minorHAnsi" w:eastAsiaTheme="minorEastAsia" w:hAnsiTheme="minorHAnsi" w:cstheme="minorBidi"/>
+              <w:iCs w:val="0"/>
+              <w:kern w:val="2"/>
+              <w:sz w:val="24"/>
+              <w:szCs w:val="24"/>
+              <w:lang w:eastAsia="sk-SK"/>
+              <w14:ligatures w14:val="standardContextual"/>
+            </w:rPr>
+          </w:pPr>
+          <w:hyperlink w:anchor="_Toc230542217" w:history="1">
+            <w:r>
+              <w:rPr>
+                <w:rStyle w:val="Hypertextovprepojenie"/>
+              </w:rPr>
+              <w:t>1.1.2</w:t>
+            </w:r>
+            <w:r>
+              <w:rPr>
+                <w:rFonts w:asciiTheme="minorHAnsi" w:eastAsiaTheme="minorEastAsia" w:hAnsiTheme="minorHAnsi" w:cstheme="minorBidi"/>
+                <w:iCs w:val="0"/>
+                <w:kern w:val="2"/>
+                <w:sz w:val="24"/>
+                <w:szCs w:val="24"/>
+                <w:lang w:eastAsia="sk-SK"/>
+                <w14:ligatures w14:val="standardContextual"/>
+              </w:rPr>
+              <w:tab/>
+            </w:r>
+            <w:r>
+              <w:rPr>
+                <w:rStyle w:val="Hypertextovprepojenie"/>
+              </w:rPr>
+              <w:t>Ekonomický význam akciových trhov</w:t>
+            </w:r>
+            <w:r>
+              <w:rPr>
+                <w:webHidden/>
+              </w:rPr>
+              <w:tab/>
+            </w:r>
+            <w:r>
+              <w:rPr>
+                <w:webHidden/>
+              </w:rPr>
+              <w:fldChar w:fldCharType="begin"/>
+            </w:r>
+            <w:r>
+              <w:rPr>
+                <w:webHidden/>
+              </w:rPr>
+              <w:instrText xml:space="preserve"> PAGEREF _Toc230542217 \h </w:instrText>
+            </w:r>
+            <w:r>
+              <w:rPr>
+                <w:webHidden/>
+              </w:rPr>
+            </w:r>
+            <w:r>
+              <w:rPr>
+                <w:webHidden/>
+              </w:rPr>
+              <w:fldChar w:fldCharType="separate"/>
+            </w:r>
+            <w:r>
+              <w:rPr>
+                <w:webHidden/>
+              </w:rPr>
+              <w:t>10</w:t>
+            </w:r>
+            <w:r>
+              <w:rPr>
+                <w:webHidden/>
+              </w:rPr>
+              <w:fldChar w:fldCharType="end"/>
+            </w:r>
+          </w:hyperlink>
+        </w:p>
+        <w:p>
+          <w:pPr>
+            <w:pStyle w:val="Obsah3"/>
+            <w:rPr>
+              <w:rFonts w:asciiTheme="minorHAnsi" w:eastAsiaTheme="minorEastAsia" w:hAnsiTheme="minorHAnsi" w:cstheme="minorBidi"/>
+              <w:iCs w:val="0"/>
+              <w:kern w:val="2"/>
+              <w:sz w:val="24"/>
+              <w:szCs w:val="24"/>
+              <w:lang w:eastAsia="sk-SK"/>
+              <w14:ligatures w14:val="standardContextual"/>
+            </w:rPr>
+          </w:pPr>
+          <w:hyperlink w:anchor="_Toc230542218" w:history="1">
+            <w:r>
+              <w:rPr>
+                <w:rStyle w:val="Hypertextovprepojenie"/>
+              </w:rPr>
+              <w:t>1.1.3</w:t>
+            </w:r>
+            <w:r>
+              <w:rPr>
+                <w:rFonts w:asciiTheme="minorHAnsi" w:eastAsiaTheme="minorEastAsia" w:hAnsiTheme="minorHAnsi" w:cstheme="minorBidi"/>
+                <w:iCs w:val="0"/>
+                <w:kern w:val="2"/>
+                <w:sz w:val="24"/>
+                <w:szCs w:val="24"/>
+                <w:lang w:eastAsia="sk-SK"/>
+                <w14:ligatures w14:val="standardContextual"/>
+              </w:rPr>
+              <w:tab/>
+            </w:r>
+            <w:r>
+              <w:rPr>
+                <w:rStyle w:val="Hypertextovprepojenie"/>
+              </w:rPr>
+              <w:t>Analýza akciových trhov</w:t>
+            </w:r>
+            <w:r>
+              <w:rPr>
+                <w:webHidden/>
+              </w:rPr>
+              <w:tab/>
+            </w:r>
+            <w:r>
+              <w:rPr>
+                <w:webHidden/>
+              </w:rPr>
+              <w:fldChar w:fldCharType="begin"/>
+            </w:r>
+            <w:r>
+              <w:rPr>
+                <w:webHidden/>
+              </w:rPr>
+              <w:instrText xml:space="preserve"> PAGEREF _Toc230542218 \h </w:instrText>
+            </w:r>
+            <w:r>
+              <w:rPr>
+                <w:webHidden/>
+              </w:rPr>
+            </w:r>
+            <w:r>
+              <w:rPr>
+                <w:webHidden/>
+              </w:rPr>
+              <w:fldChar w:fldCharType="separate"/>
+            </w:r>
+            <w:r>
+              <w:rPr>
+                <w:webHidden/>
+              </w:rPr>
+              <w:t>11</w:t>
+            </w:r>
+            <w:r>
+              <w:rPr>
+                <w:webHidden/>
+              </w:rPr>
+              <w:fldChar w:fldCharType="end"/>
+            </w:r>
+          </w:hyperlink>
+        </w:p>
+        <w:p>
+          <w:pPr>
+            <w:pStyle w:val="Obsah3"/>
+            <w:rPr>
+              <w:rFonts w:asciiTheme="minorHAnsi" w:eastAsiaTheme="minorEastAsia" w:hAnsiTheme="minorHAnsi" w:cstheme="minorBidi"/>
+              <w:iCs w:val="0"/>
+              <w:kern w:val="2"/>
+              <w:sz w:val="24"/>
+              <w:szCs w:val="24"/>
+              <w:lang w:eastAsia="sk-SK"/>
+              <w14:ligatures w14:val="standardContextual"/>
+            </w:rPr>
+          </w:pPr>
+          <w:hyperlink w:anchor="_Toc230542219" w:history="1">
+            <w:r>
+              <w:rPr>
+                <w:rStyle w:val="Hypertextovprepojenie"/>
+              </w:rPr>
+              <w:t>1.1.4</w:t>
+            </w:r>
+            <w:r>
+              <w:rPr>
+                <w:rFonts w:asciiTheme="minorHAnsi" w:eastAsiaTheme="minorEastAsia" w:hAnsiTheme="minorHAnsi" w:cstheme="minorBidi"/>
+                <w:iCs w:val="0"/>
+                <w:kern w:val="2"/>
+                <w:sz w:val="24"/>
+                <w:szCs w:val="24"/>
+                <w:lang w:eastAsia="sk-SK"/>
+                <w14:ligatures w14:val="standardContextual"/>
+              </w:rPr>
+              <w:tab/>
+            </w:r>
+            <w:r>
+              <w:rPr>
+                <w:rStyle w:val="Hypertextovprepojenie"/>
+              </w:rPr>
+              <w:t>Volatilita akciov</w:t>
+            </w:r>
+            <w:r>
+              <w:rPr>
+                <w:rStyle w:val="Hypertextovprepojenie"/>
+                <w:lang w:val="en-US"/>
+              </w:rPr>
+              <w:t>ých trhov</w:t>
+            </w:r>
+            <w:r>
+              <w:rPr>
+                <w:webHidden/>
+              </w:rPr>
+              <w:tab/>
+            </w:r>
+            <w:r>
+              <w:rPr>
+                <w:webHidden/>
+              </w:rPr>
+              <w:fldChar w:fldCharType="begin"/>
+            </w:r>
+            <w:r>
+              <w:rPr>
+                <w:webHidden/>
+              </w:rPr>
+              <w:instrText xml:space="preserve"> PAGEREF _Toc230542219 \h </w:instrText>
+            </w:r>
+            <w:r>
+              <w:rPr>
+                <w:webHidden/>
+              </w:rPr>
+            </w:r>
+            <w:r>
+              <w:rPr>
+                <w:webHidden/>
+              </w:rPr>
+              <w:fldChar w:fldCharType="separate"/>
+            </w:r>
+            <w:r>
+              <w:rPr>
+                <w:webHidden/>
+              </w:rPr>
+              <w:t>11</w:t>
+            </w:r>
+            <w:r>
+              <w:rPr>
+                <w:webHidden/>
+              </w:rPr>
+              <w:fldChar w:fldCharType="end"/>
+            </w:r>
+          </w:hyperlink>
+        </w:p>
+        <w:p>
+          <w:pPr>
+            <w:pStyle w:val="Obsah2"/>
+            <w:rPr>
+              <w:rFonts w:asciiTheme="minorHAnsi" w:eastAsiaTheme="minorEastAsia" w:hAnsiTheme="minorHAnsi" w:cstheme="minorBidi"/>
+              <w:kern w:val="2"/>
+              <w:sz w:val="24"/>
+              <w:szCs w:val="24"/>
+              <w:lang w:eastAsia="sk-SK"/>
+              <w14:ligatures w14:val="standardContextual"/>
+            </w:rPr>
+          </w:pPr>
+          <w:hyperlink w:anchor="_Toc230542220" w:history="1">
+            <w:r>
+              <w:rPr>
+                <w:rStyle w:val="Hypertextovprepojenie"/>
+              </w:rPr>
+              <w:t>1.3</w:t>
+            </w:r>
+            <w:r>
+              <w:rPr>
+                <w:rFonts w:asciiTheme="minorHAnsi" w:eastAsiaTheme="minorEastAsia" w:hAnsiTheme="minorHAnsi" w:cstheme="minorBidi"/>
+                <w:kern w:val="2"/>
+                <w:sz w:val="24"/>
+                <w:szCs w:val="24"/>
+                <w:lang w:eastAsia="sk-SK"/>
+                <w14:ligatures w14:val="standardContextual"/>
+              </w:rPr>
+              <w:tab/>
+            </w:r>
+            <w:r>
+              <w:rPr>
+                <w:rStyle w:val="Hypertextovprepojenie"/>
+              </w:rPr>
+              <w:t>Modely ARCH</w:t>
+            </w:r>
+            <w:r>
+              <w:rPr>
+                <w:webHidden/>
+              </w:rPr>
+              <w:tab/>
+            </w:r>
+            <w:r>
+              <w:rPr>
+                <w:webHidden/>
+              </w:rPr>
+              <w:fldChar w:fldCharType="begin"/>
+            </w:r>
+            <w:r>
+              <w:rPr>
+                <w:webHidden/>
+              </w:rPr>
+              <w:instrText xml:space="preserve"> PAGEREF _Toc230542220 \h </w:instrText>
+            </w:r>
+            <w:r>
+              <w:rPr>
+                <w:webHidden/>
+              </w:rPr>
+            </w:r>
+            <w:r>
+              <w:rPr>
+                <w:webHidden/>
+              </w:rPr>
+              <w:fldChar w:fldCharType="separate"/>
+            </w:r>
+            <w:r>
+              <w:rPr>
+                <w:webHidden/>
+              </w:rPr>
+              <w:t>12</w:t>
+            </w:r>
+            <w:r>
+              <w:rPr>
                 <w:webHidden/>
               </w:rPr>
               <w:fldChar w:fldCharType="end"/>
@@ -957,18 +1445,16 @@
               <w:rFonts w:asciiTheme="minorHAnsi" w:eastAsiaTheme="minorEastAsia" w:hAnsiTheme="minorHAnsi" w:cstheme="minorBidi"/>
               <w:b w:val="0"/>
               <w:bCs w:val="0"/>
-              <w:noProof w:val="0"/>
               <w:kern w:val="2"/>
               <w:szCs w:val="24"/>
               <w:lang w:eastAsia="sk-SK"/>
               <w14:ligatures w14:val="standardContextual"/>
             </w:rPr>
           </w:pPr>
-          <w:hyperlink w:anchor="_Toc227589987" w:history="1">
+          <w:hyperlink w:anchor="_Toc230542221" w:history="1">
             <w:r>
               <w:rPr>
                 <w:rStyle w:val="Hypertextovprepojenie"/>
-                <w:noProof w:val="0"/>
               </w:rPr>
               <w:t>2</w:t>
             </w:r>
@@ -977,7 +1463,6 @@
                 <w:rFonts w:asciiTheme="minorHAnsi" w:eastAsiaTheme="minorEastAsia" w:hAnsiTheme="minorHAnsi" w:cstheme="minorBidi"/>
                 <w:b w:val="0"/>
                 <w:bCs w:val="0"/>
-                <w:noProof w:val="0"/>
                 <w:kern w:val="2"/>
                 <w:szCs w:val="24"/>
                 <w:lang w:eastAsia="sk-SK"/>
@@ -988,54 +1473,46 @@
             <w:r>
               <w:rPr>
                 <w:rStyle w:val="Hypertextovprepojenie"/>
-                <w:noProof w:val="0"/>
               </w:rPr>
               <w:t>Ciele záverečnej práce</w:t>
             </w:r>
             <w:r>
               <w:rPr>
-                <w:noProof w:val="0"/>
                 <w:webHidden/>
               </w:rPr>
               <w:tab/>
             </w:r>
             <w:r>
               <w:rPr>
-                <w:noProof w:val="0"/>
                 <w:webHidden/>
               </w:rPr>
               <w:fldChar w:fldCharType="begin"/>
             </w:r>
             <w:r>
               <w:rPr>
-                <w:noProof w:val="0"/>
                 <w:webHidden/>
               </w:rPr>
-              <w:instrText xml:space="preserve"> PAGEREF _Toc227589987 \h </w:instrText>
-            </w:r>
-            <w:r>
-              <w:rPr>
-                <w:noProof w:val="0"/>
+              <w:instrText xml:space="preserve"> PAGEREF _Toc230542221 \h </w:instrText>
+            </w:r>
+            <w:r>
+              <w:rPr>
                 <w:webHidden/>
               </w:rPr>
             </w:r>
             <w:r>
               <w:rPr>
-                <w:noProof w:val="0"/>
                 <w:webHidden/>
               </w:rPr>
               <w:fldChar w:fldCharType="separate"/>
             </w:r>
             <w:r>
               <w:rPr>
-                <w:noProof w:val="0"/>
                 <w:webHidden/>
               </w:rPr>
-              <w:t>11</w:t>
-            </w:r>
-            <w:r>
-              <w:rPr>
-                <w:noProof w:val="0"/>
+              <w:t>13</w:t>
+            </w:r>
+            <w:r>
+              <w:rPr>
                 <w:webHidden/>
               </w:rPr>
               <w:fldChar w:fldCharType="end"/>
@@ -1049,18 +1526,16 @@
               <w:rFonts w:asciiTheme="minorHAnsi" w:eastAsiaTheme="minorEastAsia" w:hAnsiTheme="minorHAnsi" w:cstheme="minorBidi"/>
               <w:b w:val="0"/>
               <w:bCs w:val="0"/>
-              <w:noProof w:val="0"/>
               <w:kern w:val="2"/>
               <w:szCs w:val="24"/>
               <w:lang w:eastAsia="sk-SK"/>
               <w14:ligatures w14:val="standardContextual"/>
             </w:rPr>
           </w:pPr>
-          <w:hyperlink w:anchor="_Toc227589988" w:history="1">
+          <w:hyperlink w:anchor="_Toc230542222" w:history="1">
             <w:r>
               <w:rPr>
                 <w:rStyle w:val="Hypertextovprepojenie"/>
-                <w:noProof w:val="0"/>
               </w:rPr>
               <w:t>3</w:t>
             </w:r>
@@ -1069,7 +1544,6 @@
                 <w:rFonts w:asciiTheme="minorHAnsi" w:eastAsiaTheme="minorEastAsia" w:hAnsiTheme="minorHAnsi" w:cstheme="minorBidi"/>
                 <w:b w:val="0"/>
                 <w:bCs w:val="0"/>
-                <w:noProof w:val="0"/>
                 <w:kern w:val="2"/>
                 <w:szCs w:val="24"/>
                 <w:lang w:eastAsia="sk-SK"/>
@@ -1080,54 +1554,46 @@
             <w:r>
               <w:rPr>
                 <w:rStyle w:val="Hypertextovprepojenie"/>
-                <w:noProof w:val="0"/>
               </w:rPr>
               <w:t>Metodika výskumu</w:t>
             </w:r>
             <w:r>
               <w:rPr>
-                <w:noProof w:val="0"/>
                 <w:webHidden/>
               </w:rPr>
               <w:tab/>
             </w:r>
             <w:r>
               <w:rPr>
-                <w:noProof w:val="0"/>
                 <w:webHidden/>
               </w:rPr>
               <w:fldChar w:fldCharType="begin"/>
             </w:r>
             <w:r>
               <w:rPr>
-                <w:noProof w:val="0"/>
                 <w:webHidden/>
               </w:rPr>
-              <w:instrText xml:space="preserve"> PAGEREF _Toc227589988 \h </w:instrText>
-            </w:r>
-            <w:r>
-              <w:rPr>
-                <w:noProof w:val="0"/>
+              <w:instrText xml:space="preserve"> PAGEREF _Toc230542222 \h </w:instrText>
+            </w:r>
+            <w:r>
+              <w:rPr>
                 <w:webHidden/>
               </w:rPr>
             </w:r>
             <w:r>
               <w:rPr>
-                <w:noProof w:val="0"/>
                 <w:webHidden/>
               </w:rPr>
               <w:fldChar w:fldCharType="separate"/>
             </w:r>
             <w:r>
               <w:rPr>
-                <w:noProof w:val="0"/>
                 <w:webHidden/>
               </w:rPr>
-              <w:t>12</w:t>
-            </w:r>
-            <w:r>
-              <w:rPr>
-                <w:noProof w:val="0"/>
+              <w:t>14</w:t>
+            </w:r>
+            <w:r>
+              <w:rPr>
                 <w:webHidden/>
               </w:rPr>
               <w:fldChar w:fldCharType="end"/>
@@ -1141,18 +1607,16 @@
               <w:rFonts w:asciiTheme="minorHAnsi" w:eastAsiaTheme="minorEastAsia" w:hAnsiTheme="minorHAnsi" w:cstheme="minorBidi"/>
               <w:b w:val="0"/>
               <w:bCs w:val="0"/>
-              <w:noProof w:val="0"/>
               <w:kern w:val="2"/>
               <w:szCs w:val="24"/>
               <w:lang w:eastAsia="sk-SK"/>
               <w14:ligatures w14:val="standardContextual"/>
             </w:rPr>
           </w:pPr>
-          <w:hyperlink w:anchor="_Toc227589989" w:history="1">
+          <w:hyperlink w:anchor="_Toc230542223" w:history="1">
             <w:r>
               <w:rPr>
                 <w:rStyle w:val="Hypertextovprepojenie"/>
-                <w:noProof w:val="0"/>
               </w:rPr>
               <w:t>4</w:t>
             </w:r>
@@ -1161,7 +1625,6 @@
                 <w:rFonts w:asciiTheme="minorHAnsi" w:eastAsiaTheme="minorEastAsia" w:hAnsiTheme="minorHAnsi" w:cstheme="minorBidi"/>
                 <w:b w:val="0"/>
                 <w:bCs w:val="0"/>
-                <w:noProof w:val="0"/>
                 <w:kern w:val="2"/>
                 <w:szCs w:val="24"/>
                 <w:lang w:eastAsia="sk-SK"/>
@@ -1172,54 +1635,46 @@
             <w:r>
               <w:rPr>
                 <w:rStyle w:val="Hypertextovprepojenie"/>
-                <w:noProof w:val="0"/>
               </w:rPr>
               <w:t>Výsledky výskumu</w:t>
             </w:r>
             <w:r>
               <w:rPr>
-                <w:noProof w:val="0"/>
                 <w:webHidden/>
               </w:rPr>
               <w:tab/>
             </w:r>
             <w:r>
               <w:rPr>
-                <w:noProof w:val="0"/>
                 <w:webHidden/>
               </w:rPr>
               <w:fldChar w:fldCharType="begin"/>
             </w:r>
             <w:r>
               <w:rPr>
-                <w:noProof w:val="0"/>
                 <w:webHidden/>
               </w:rPr>
-              <w:instrText xml:space="preserve"> PAGEREF _Toc227589989 \h </w:instrText>
-            </w:r>
-            <w:r>
-              <w:rPr>
-                <w:noProof w:val="0"/>
+              <w:instrText xml:space="preserve"> PAGEREF _Toc230542223 \h </w:instrText>
+            </w:r>
+            <w:r>
+              <w:rPr>
                 <w:webHidden/>
               </w:rPr>
             </w:r>
             <w:r>
               <w:rPr>
-                <w:noProof w:val="0"/>
                 <w:webHidden/>
               </w:rPr>
               <w:fldChar w:fldCharType="separate"/>
             </w:r>
             <w:r>
               <w:rPr>
-                <w:noProof w:val="0"/>
                 <w:webHidden/>
               </w:rPr>
-              <w:t>13</w:t>
-            </w:r>
-            <w:r>
-              <w:rPr>
-                <w:noProof w:val="0"/>
+              <w:t>15</w:t>
+            </w:r>
+            <w:r>
+              <w:rPr>
                 <w:webHidden/>
               </w:rPr>
               <w:fldChar w:fldCharType="end"/>
@@ -1233,65 +1688,56 @@
               <w:rFonts w:asciiTheme="minorHAnsi" w:eastAsiaTheme="minorEastAsia" w:hAnsiTheme="minorHAnsi" w:cstheme="minorBidi"/>
               <w:b w:val="0"/>
               <w:bCs w:val="0"/>
-              <w:noProof w:val="0"/>
               <w:kern w:val="2"/>
               <w:szCs w:val="24"/>
               <w:lang w:eastAsia="sk-SK"/>
               <w14:ligatures w14:val="standardContextual"/>
             </w:rPr>
           </w:pPr>
-          <w:hyperlink w:anchor="_Toc227589990" w:history="1">
+          <w:hyperlink w:anchor="_Toc230542224" w:history="1">
             <w:r>
               <w:rPr>
                 <w:rStyle w:val="Hypertextovprepojenie"/>
-                <w:noProof w:val="0"/>
               </w:rPr>
               <w:t>Záver</w:t>
             </w:r>
             <w:r>
               <w:rPr>
-                <w:noProof w:val="0"/>
                 <w:webHidden/>
               </w:rPr>
               <w:tab/>
             </w:r>
             <w:r>
               <w:rPr>
-                <w:noProof w:val="0"/>
                 <w:webHidden/>
               </w:rPr>
               <w:fldChar w:fldCharType="begin"/>
             </w:r>
             <w:r>
               <w:rPr>
-                <w:noProof w:val="0"/>
                 <w:webHidden/>
               </w:rPr>
-              <w:instrText xml:space="preserve"> PAGEREF _Toc227589990 \h </w:instrText>
-            </w:r>
-            <w:r>
-              <w:rPr>
-                <w:noProof w:val="0"/>
+              <w:instrText xml:space="preserve"> PAGEREF _Toc230542224 \h </w:instrText>
+            </w:r>
+            <w:r>
+              <w:rPr>
                 <w:webHidden/>
               </w:rPr>
             </w:r>
             <w:r>
               <w:rPr>
-                <w:noProof w:val="0"/>
                 <w:webHidden/>
               </w:rPr>
               <w:fldChar w:fldCharType="separate"/>
             </w:r>
             <w:r>
               <w:rPr>
-                <w:noProof w:val="0"/>
                 <w:webHidden/>
               </w:rPr>
-              <w:t>14</w:t>
-            </w:r>
-            <w:r>
-              <w:rPr>
-                <w:noProof w:val="0"/>
+              <w:t>16</w:t>
+            </w:r>
+            <w:r>
+              <w:rPr>
                 <w:webHidden/>
               </w:rPr>
               <w:fldChar w:fldCharType="end"/>
@@ -1305,65 +1751,56 @@
               <w:rFonts w:asciiTheme="minorHAnsi" w:eastAsiaTheme="minorEastAsia" w:hAnsiTheme="minorHAnsi" w:cstheme="minorBidi"/>
               <w:b w:val="0"/>
               <w:bCs w:val="0"/>
-              <w:noProof w:val="0"/>
               <w:kern w:val="2"/>
               <w:szCs w:val="24"/>
               <w:lang w:eastAsia="sk-SK"/>
               <w14:ligatures w14:val="standardContextual"/>
             </w:rPr>
           </w:pPr>
-          <w:hyperlink w:anchor="_Toc227589991" w:history="1">
+          <w:hyperlink w:anchor="_Toc230542225" w:history="1">
             <w:r>
               <w:rPr>
                 <w:rStyle w:val="Hypertextovprepojenie"/>
-                <w:noProof w:val="0"/>
               </w:rPr>
               <w:t>Zoznam bibliografických odkazov</w:t>
             </w:r>
             <w:r>
               <w:rPr>
-                <w:noProof w:val="0"/>
                 <w:webHidden/>
               </w:rPr>
               <w:tab/>
             </w:r>
             <w:r>
               <w:rPr>
-                <w:noProof w:val="0"/>
                 <w:webHidden/>
               </w:rPr>
               <w:fldChar w:fldCharType="begin"/>
             </w:r>
             <w:r>
               <w:rPr>
-                <w:noProof w:val="0"/>
                 <w:webHidden/>
               </w:rPr>
-              <w:instrText xml:space="preserve"> PAGEREF _Toc227589991 \h </w:instrText>
-            </w:r>
-            <w:r>
-              <w:rPr>
-                <w:noProof w:val="0"/>
+              <w:instrText xml:space="preserve"> PAGEREF _Toc230542225 \h </w:instrText>
+            </w:r>
+            <w:r>
+              <w:rPr>
                 <w:webHidden/>
               </w:rPr>
             </w:r>
             <w:r>
               <w:rPr>
-                <w:noProof w:val="0"/>
                 <w:webHidden/>
               </w:rPr>
               <w:fldChar w:fldCharType="separate"/>
             </w:r>
             <w:r>
               <w:rPr>
-                <w:noProof w:val="0"/>
                 <w:webHidden/>
               </w:rPr>
-              <w:t>15</w:t>
-            </w:r>
-            <w:r>
-              <w:rPr>
-                <w:noProof w:val="0"/>
+              <w:t>17</w:t>
+            </w:r>
+            <w:r>
+              <w:rPr>
                 <w:webHidden/>
               </w:rPr>
               <w:fldChar w:fldCharType="end"/>
@@ -1377,65 +1814,56 @@
               <w:rFonts w:asciiTheme="minorHAnsi" w:eastAsiaTheme="minorEastAsia" w:hAnsiTheme="minorHAnsi" w:cstheme="minorBidi"/>
               <w:b w:val="0"/>
               <w:bCs w:val="0"/>
-              <w:noProof w:val="0"/>
               <w:kern w:val="2"/>
               <w:szCs w:val="24"/>
               <w:lang w:eastAsia="sk-SK"/>
               <w14:ligatures w14:val="standardContextual"/>
             </w:rPr>
           </w:pPr>
-          <w:hyperlink w:anchor="_Toc227589992" w:history="1">
+          <w:hyperlink w:anchor="_Toc230542226" w:history="1">
             <w:r>
               <w:rPr>
                 <w:rStyle w:val="Hypertextovprepojenie"/>
-                <w:noProof w:val="0"/>
               </w:rPr>
               <w:t>Zoznam príloh</w:t>
             </w:r>
             <w:r>
               <w:rPr>
-                <w:noProof w:val="0"/>
                 <w:webHidden/>
               </w:rPr>
               <w:tab/>
             </w:r>
             <w:r>
               <w:rPr>
-                <w:noProof w:val="0"/>
                 <w:webHidden/>
               </w:rPr>
               <w:fldChar w:fldCharType="begin"/>
             </w:r>
             <w:r>
               <w:rPr>
-                <w:noProof w:val="0"/>
                 <w:webHidden/>
               </w:rPr>
-              <w:instrText xml:space="preserve"> PAGEREF _Toc227589992 \h </w:instrText>
-            </w:r>
-            <w:r>
-              <w:rPr>
-                <w:noProof w:val="0"/>
+              <w:instrText xml:space="preserve"> PAGEREF _Toc230542226 \h </w:instrText>
+            </w:r>
+            <w:r>
+              <w:rPr>
                 <w:webHidden/>
               </w:rPr>
             </w:r>
             <w:r>
               <w:rPr>
-                <w:noProof w:val="0"/>
                 <w:webHidden/>
               </w:rPr>
               <w:fldChar w:fldCharType="separate"/>
             </w:r>
             <w:r>
               <w:rPr>
-                <w:noProof w:val="0"/>
                 <w:webHidden/>
               </w:rPr>
-              <w:t>16</w:t>
-            </w:r>
-            <w:r>
-              <w:rPr>
-                <w:noProof w:val="0"/>
+              <w:t>18</w:t>
+            </w:r>
+            <w:r>
+              <w:rPr>
                 <w:webHidden/>
               </w:rPr>
               <w:fldChar w:fldCharType="end"/>
@@ -1462,17 +1890,18 @@
       <w:pPr>
         <w:pStyle w:val="Nadpis1"/>
       </w:pPr>
-      <w:bookmarkStart w:id="77" w:name="_Toc309047433"/>
-      <w:bookmarkStart w:id="78" w:name="_Toc309047479"/>
-      <w:bookmarkStart w:id="79" w:name="_Toc309047596"/>
-      <w:bookmarkStart w:id="80" w:name="_Toc339279009"/>
-      <w:bookmarkStart w:id="81" w:name="_Toc476657456"/>
-      <w:bookmarkStart w:id="82" w:name="_Toc99180814"/>
-      <w:bookmarkStart w:id="83" w:name="_Toc114690420"/>
-      <w:bookmarkStart w:id="84" w:name="_Toc115115259"/>
-      <w:bookmarkStart w:id="85" w:name="_Toc115369797"/>
-      <w:bookmarkStart w:id="86" w:name="_Toc209454654"/>
-      <w:bookmarkStart w:id="87" w:name="_Toc227589984"/>
+      <w:bookmarkStart w:id="82" w:name="_Toc309047433"/>
+      <w:bookmarkStart w:id="83" w:name="_Toc309047479"/>
+      <w:bookmarkStart w:id="84" w:name="_Toc309047596"/>
+      <w:bookmarkStart w:id="85" w:name="_Toc339279009"/>
+      <w:bookmarkStart w:id="86" w:name="_Toc476657456"/>
+      <w:bookmarkStart w:id="87" w:name="_Toc99180814"/>
+      <w:bookmarkStart w:id="88" w:name="_Toc114690420"/>
+      <w:bookmarkStart w:id="89" w:name="_Toc115115259"/>
+      <w:bookmarkStart w:id="90" w:name="_Toc115369797"/>
+      <w:bookmarkStart w:id="91" w:name="_Toc209454654"/>
+      <w:bookmarkStart w:id="92" w:name="_Toc227589984"/>
+      <w:bookmarkStart w:id="93" w:name="_Toc230542212"/>
       <w:r>
         <w:lastRenderedPageBreak/>
         <w:t>zoznam ilustrácií a</w:t>
@@ -1483,17 +1912,18 @@
       <w:r>
         <w:t>tabuliek</w:t>
       </w:r>
-      <w:bookmarkEnd w:id="77"/>
-      <w:bookmarkEnd w:id="78"/>
-      <w:bookmarkEnd w:id="79"/>
-      <w:bookmarkEnd w:id="80"/>
-      <w:bookmarkEnd w:id="81"/>
       <w:bookmarkEnd w:id="82"/>
       <w:bookmarkEnd w:id="83"/>
       <w:bookmarkEnd w:id="84"/>
       <w:bookmarkEnd w:id="85"/>
       <w:bookmarkEnd w:id="86"/>
       <w:bookmarkEnd w:id="87"/>
+      <w:bookmarkEnd w:id="88"/>
+      <w:bookmarkEnd w:id="89"/>
+      <w:bookmarkEnd w:id="90"/>
+      <w:bookmarkEnd w:id="91"/>
+      <w:bookmarkEnd w:id="92"/>
+      <w:bookmarkEnd w:id="93"/>
       <w:r>
         <w:t xml:space="preserve"> </w:t>
       </w:r>
@@ -1506,11 +1936,11 @@
           <w:szCs w:val="24"/>
         </w:rPr>
       </w:pPr>
-      <w:bookmarkStart w:id="88" w:name="_Toc195670723"/>
-      <w:bookmarkStart w:id="89" w:name="_Toc195684471"/>
-      <w:bookmarkStart w:id="90" w:name="_Toc309047436"/>
-      <w:bookmarkStart w:id="91" w:name="_Toc309047482"/>
-      <w:bookmarkStart w:id="92" w:name="_Toc309047599"/>
+      <w:bookmarkStart w:id="94" w:name="_Toc195670723"/>
+      <w:bookmarkStart w:id="95" w:name="_Toc195684471"/>
+      <w:bookmarkStart w:id="96" w:name="_Toc309047436"/>
+      <w:bookmarkStart w:id="97" w:name="_Toc309047482"/>
+      <w:bookmarkStart w:id="98" w:name="_Toc309047599"/>
     </w:p>
     <w:p>
       <w:pPr>
@@ -1537,52 +1967,14 @@
       <w:pPr>
         <w:pStyle w:val="Nadpis1"/>
       </w:pPr>
-      <w:bookmarkStart w:id="93" w:name="_Toc339279012"/>
-      <w:bookmarkStart w:id="94" w:name="_Toc227589985"/>
+      <w:bookmarkStart w:id="99" w:name="_Toc339279012"/>
+      <w:bookmarkStart w:id="100" w:name="_Toc227589985"/>
+      <w:bookmarkStart w:id="101" w:name="_Toc230542213"/>
       <w:r>
         <w:lastRenderedPageBreak/>
         <w:t>Úvod</w:t>
       </w:r>
-      <w:bookmarkEnd w:id="88"/>
-      <w:bookmarkEnd w:id="89"/>
-      <w:bookmarkEnd w:id="90"/>
-      <w:bookmarkEnd w:id="91"/>
-      <w:bookmarkEnd w:id="92"/>
-      <w:bookmarkEnd w:id="93"/>
       <w:bookmarkEnd w:id="94"/>
-      <w:r>
-        <w:t xml:space="preserve"> </w:t>
-      </w:r>
-      <w:r>
-        <w:t xml:space="preserve"> </w:t>
-      </w:r>
-      <w:bookmarkStart w:id="95" w:name="_Toc195670724"/>
-      <w:bookmarkStart w:id="96" w:name="_Toc195684472"/>
-    </w:p>
-    <w:p>
-      <w:bookmarkStart w:id="97" w:name="_Toc309047437"/>
-      <w:bookmarkStart w:id="98" w:name="_Toc309047483"/>
-      <w:bookmarkStart w:id="99" w:name="_Toc309047600"/>
-      <w:r>
-        <w:br w:type="page"/>
-      </w:r>
-    </w:p>
-    <w:p>
-      <w:pPr>
-        <w:pStyle w:val="Nadpis1"/>
-      </w:pPr>
-      <w:bookmarkStart w:id="100" w:name="_Toc339279013"/>
-      <w:bookmarkStart w:id="101" w:name="_Toc227589986"/>
-      <w:r>
-        <w:lastRenderedPageBreak/>
-        <w:t>1</w:t>
-      </w:r>
-      <w:r>
-        <w:tab/>
-      </w:r>
-      <w:r>
-        <w:t>Analýza súčasného stavu</w:t>
-      </w:r>
       <w:bookmarkEnd w:id="95"/>
       <w:bookmarkEnd w:id="96"/>
       <w:bookmarkEnd w:id="97"/>
@@ -1593,9 +1985,49 @@
       <w:r>
         <w:t xml:space="preserve"> </w:t>
       </w:r>
-      <w:bookmarkStart w:id="102" w:name="_Toc309047440"/>
-      <w:bookmarkStart w:id="103" w:name="_Toc309047486"/>
-      <w:bookmarkStart w:id="104" w:name="_Toc309047603"/>
+      <w:r>
+        <w:t xml:space="preserve"> </w:t>
+      </w:r>
+      <w:bookmarkStart w:id="102" w:name="_Toc195670724"/>
+      <w:bookmarkStart w:id="103" w:name="_Toc195684472"/>
+    </w:p>
+    <w:p>
+      <w:bookmarkStart w:id="104" w:name="_Toc309047437"/>
+      <w:bookmarkStart w:id="105" w:name="_Toc309047483"/>
+      <w:bookmarkStart w:id="106" w:name="_Toc309047600"/>
+      <w:r>
+        <w:br w:type="page"/>
+      </w:r>
+    </w:p>
+    <w:p>
+      <w:pPr>
+        <w:pStyle w:val="Nadpis1"/>
+      </w:pPr>
+      <w:bookmarkStart w:id="107" w:name="_Toc339279013"/>
+      <w:bookmarkStart w:id="108" w:name="_Toc230542214"/>
+      <w:r>
+        <w:lastRenderedPageBreak/>
+        <w:t>1</w:t>
+      </w:r>
+      <w:r>
+        <w:tab/>
+      </w:r>
+      <w:r>
+        <w:t>Analýza súčasného stavu</w:t>
+      </w:r>
+      <w:bookmarkEnd w:id="102"/>
+      <w:bookmarkEnd w:id="103"/>
+      <w:bookmarkEnd w:id="104"/>
+      <w:bookmarkEnd w:id="105"/>
+      <w:bookmarkEnd w:id="106"/>
+      <w:bookmarkEnd w:id="107"/>
+      <w:bookmarkEnd w:id="108"/>
+      <w:r>
+        <w:t xml:space="preserve"> </w:t>
+      </w:r>
+      <w:bookmarkStart w:id="109" w:name="_Toc309047440"/>
+      <w:bookmarkStart w:id="110" w:name="_Toc309047486"/>
+      <w:bookmarkStart w:id="111" w:name="_Toc309047603"/>
     </w:p>
     <w:p>
       <w:pPr>
@@ -1606,6 +2038,7 @@
       <w:pPr>
         <w:pStyle w:val="Nadpis2"/>
       </w:pPr>
+      <w:bookmarkStart w:id="112" w:name="_Toc230542215"/>
       <w:r>
         <w:t>1.1</w:t>
       </w:r>
@@ -1627,6 +2060,7 @@
       <w:r>
         <w:t>u</w:t>
       </w:r>
+      <w:bookmarkEnd w:id="112"/>
     </w:p>
     <w:p>
       <w:pPr>
@@ -1683,7 +2117,7 @@
           <w:rPr>
             <w:color w:val="000000"/>
           </w:rPr>
-          <w:tag w:val="MENDELEY_CITATION_v3_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"/>
+          <w:tag w:val="MENDELEY_CITATION_v3_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"/>
           <w:id w:val="-2130695190"/>
           <w:placeholder>
             <w:docPart w:val="DefaultPlaceholder_-1854013440"/>
@@ -1728,6 +2162,7 @@
       <w:pPr>
         <w:pStyle w:val="Nadpis3"/>
       </w:pPr>
+      <w:bookmarkStart w:id="113" w:name="_Toc230542216"/>
       <w:r>
         <w:t>1.</w:t>
       </w:r>
@@ -1746,6 +2181,7 @@
       <w:r>
         <w:t xml:space="preserve"> Efektívneho trhu</w:t>
       </w:r>
+      <w:bookmarkEnd w:id="113"/>
     </w:p>
     <w:p>
       <w:pPr>
@@ -1783,7 +2219,7 @@
           <w:rPr>
             <w:color w:val="000000"/>
           </w:rPr>
-          <w:tag w:val="MENDELEY_CITATION_v3_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"/>
+          <w:tag w:val="MENDELEY_CITATION_v3_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"/>
           <w:id w:val="-2146417282"/>
           <w:placeholder>
             <w:docPart w:val="DefaultPlaceholder_-1854013440"/>
@@ -1863,7 +2299,7 @@
           <w:rPr>
             <w:color w:val="000000"/>
           </w:rPr>
-          <w:tag w:val="MENDELEY_CITATION_v3_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"/>
+          <w:tag w:val="MENDELEY_CITATION_v3_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"/>
           <w:id w:val="-1391260349"/>
           <w:placeholder>
             <w:docPart w:val="DefaultPlaceholder_-1854013440"/>
@@ -1911,6 +2347,7 @@
       <w:pPr>
         <w:pStyle w:val="Nadpis3"/>
       </w:pPr>
+      <w:bookmarkStart w:id="114" w:name="_Toc230542217"/>
       <w:r>
         <w:t>1.1.</w:t>
       </w:r>
@@ -1921,6 +2358,7 @@
         <w:tab/>
         <w:t>Ekonomický význam akciových trhov</w:t>
       </w:r>
+      <w:bookmarkEnd w:id="114"/>
     </w:p>
     <w:p>
       <w:pPr>
@@ -1992,7 +2430,7 @@
           <w:rPr>
             <w:color w:val="000000"/>
           </w:rPr>
-          <w:tag w:val="MENDELEY_CITATION_v3_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"/>
+          <w:tag w:val="MENDELEY_CITATION_v3_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"/>
           <w:id w:val="1457446129"/>
           <w:placeholder>
             <w:docPart w:val="DefaultPlaceholder_-1854013440"/>
@@ -2059,7 +2497,7 @@
           <w:rPr>
             <w:color w:val="000000"/>
           </w:rPr>
-          <w:tag w:val="MENDELEY_CITATION_v3_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"/>
+          <w:tag w:val="MENDELEY_CITATION_v3_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"/>
           <w:id w:val="1718320412"/>
           <w:placeholder>
             <w:docPart w:val="DefaultPlaceholder_-1854013440"/>
@@ -2150,6 +2588,7 @@
       <w:pPr>
         <w:pStyle w:val="Nadpis3"/>
       </w:pPr>
+      <w:bookmarkStart w:id="115" w:name="_Toc230542218"/>
       <w:r>
         <w:t>1.1.</w:t>
       </w:r>
@@ -2160,6 +2599,7 @@
         <w:tab/>
         <w:t>Analýza akciových trhov</w:t>
       </w:r>
+      <w:bookmarkEnd w:id="115"/>
     </w:p>
     <w:p>
       <w:pPr>
@@ -2192,7 +2632,7 @@
           <w:rPr>
             <w:color w:val="000000"/>
           </w:rPr>
-          <w:tag w:val="MENDELEY_CITATION_v3_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"/>
+          <w:tag w:val="MENDELEY_CITATION_v3_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"/>
           <w:id w:val="1364324382"/>
           <w:placeholder>
             <w:docPart w:val="769F832CC28340CE891B17C23E204D23"/>
@@ -2368,7 +2808,7 @@
           <w:rPr>
             <w:color w:val="000000"/>
           </w:rPr>
-          <w:tag w:val="MENDELEY_CITATION_v3_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"/>
+          <w:tag w:val="MENDELEY_CITATION_v3_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"/>
           <w:id w:val="-493875876"/>
           <w:placeholder>
             <w:docPart w:val="769F832CC28340CE891B17C23E204D23"/>
@@ -2411,13 +2851,17 @@
     </w:p>
     <w:p>
       <w:pPr>
-        <w:pStyle w:val="Nadpis2"/>
+        <w:pStyle w:val="Nadpis3"/>
         <w:rPr>
           <w:lang w:val="en-US"/>
         </w:rPr>
       </w:pPr>
-      <w:r>
-        <w:t>1.2</w:t>
+      <w:bookmarkStart w:id="116" w:name="_Toc230542219"/>
+      <w:r>
+        <w:t>1.</w:t>
+      </w:r>
+      <w:r>
+        <w:t>1.4</w:t>
       </w:r>
       <w:r>
         <w:tab/>
@@ -2429,6 +2873,7 @@
         </w:rPr>
         <w:t>ých trhov</w:t>
       </w:r>
+      <w:bookmarkEnd w:id="116"/>
     </w:p>
     <w:p>
       <w:pPr>
@@ -2490,7 +2935,7 @@
           <w:rPr>
             <w:color w:val="000000"/>
           </w:rPr>
-          <w:tag w:val="MENDELEY_CITATION_v3_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"/>
+          <w:tag w:val="MENDELEY_CITATION_v3_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"/>
           <w:id w:val="465547256"/>
           <w:placeholder>
             <w:docPart w:val="DefaultPlaceholder_-1854013440"/>
@@ -2900,7 +3345,7 @@
             <w:color w:val="000000"/>
             <w:lang w:val="en-US"/>
           </w:rPr>
-          <w:tag w:val="MENDELEY_CITATION_v3_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"/>
+          <w:tag w:val="MENDELEY_CITATION_v3_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"/>
           <w:id w:val="-1822265127"/>
           <w:placeholder>
             <w:docPart w:val="DefaultPlaceholder_-1854013440"/>
@@ -2992,7 +3437,7 @@
           <w:rPr>
             <w:color w:val="000000"/>
           </w:rPr>
-          <w:tag w:val="MENDELEY_CITATION_v3_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"/>
+          <w:tag w:val="MENDELEY_CITATION_v3_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"/>
           <w:id w:val="-1055392729"/>
           <w:placeholder>
             <w:docPart w:val="DefaultPlaceholder_-1854013440"/>
@@ -3051,13 +3496,18 @@
       <w:pPr>
         <w:pStyle w:val="Nadpis2"/>
       </w:pPr>
-      <w:r>
-        <w:t>1.3</w:t>
+      <w:bookmarkStart w:id="117" w:name="_Toc230542220"/>
+      <w:r>
+        <w:t>1.</w:t>
+      </w:r>
+      <w:r>
+        <w:t>2</w:t>
       </w:r>
       <w:r>
         <w:tab/>
         <w:t>Modely ARCH</w:t>
       </w:r>
+      <w:bookmarkEnd w:id="117"/>
     </w:p>
     <w:p>
       <w:pPr>
@@ -3298,7 +3748,7 @@
             <w:color w:val="000000"/>
             <w:lang w:val="en-US"/>
           </w:rPr>
-          <w:tag w:val="MENDELEY_CITATION_v3_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"/>
+          <w:tag w:val="MENDELEY_CITATION_v3_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"/>
           <w:id w:val="-49460524"/>
           <w:placeholder>
             <w:docPart w:val="DefaultPlaceholder_-1854013440"/>
@@ -3323,7 +3773,21 @@
             <w:rPr>
               <w:color w:val="000000"/>
             </w:rPr>
-            <w:t xml:space="preserve"> &amp; Xekalaki, 2004)</w:t>
+            <w:t xml:space="preserve"> &amp; </w:t>
+          </w:r>
+          <w:proofErr w:type="spellStart"/>
+          <w:r>
+            <w:rPr>
+              <w:color w:val="000000"/>
+            </w:rPr>
+            <w:t>Xekalaki</w:t>
+          </w:r>
+          <w:proofErr w:type="spellEnd"/>
+          <w:r>
+            <w:rPr>
+              <w:color w:val="000000"/>
+            </w:rPr>
+            <w:t>, 2004)</w:t>
           </w:r>
         </w:sdtContent>
       </w:sdt>
@@ -3339,51 +3803,128 @@
       <w:pPr>
         <w:ind w:firstLine="0"/>
       </w:pPr>
-    </w:p>
-    <w:p>
-      <w:pPr>
-        <w:pStyle w:val="Nadpis2"/>
-      </w:pPr>
-      <w:r>
-        <w:t>1.3.1</w:t>
-      </w:r>
       <w:r>
         <w:tab/>
+      </w:r>
+      <w:r>
+        <w:t>Naj</w:t>
+      </w:r>
+      <w:r>
+        <w:t>dôležitejším</w:t>
+      </w:r>
+      <w:r>
+        <w:t xml:space="preserve"> nástrojom aplikovanej ekonomiky je </w:t>
+      </w:r>
+      <w:proofErr w:type="spellStart"/>
+      <w:r>
+        <w:rPr>
+          <w:i/>
+          <w:iCs/>
+        </w:rPr>
+        <w:t>least</w:t>
+      </w:r>
+      <w:proofErr w:type="spellEnd"/>
+      <w:r>
+        <w:rPr>
+          <w:i/>
+          <w:iCs/>
+        </w:rPr>
+        <w:t xml:space="preserve"> </w:t>
+      </w:r>
+      <w:proofErr w:type="spellStart"/>
+      <w:r>
+        <w:rPr>
+          <w:i/>
+          <w:iCs/>
+        </w:rPr>
+        <w:t>squares</w:t>
+      </w:r>
+      <w:proofErr w:type="spellEnd"/>
+      <w:r>
+        <w:t xml:space="preserve"> model, pretože väčšinou ide o určenie miery zmeny premennej v závislosti od zmeny inej premennej. Tento predpoklad sa nazýva </w:t>
+      </w:r>
+      <w:proofErr w:type="spellStart"/>
+      <w:r>
+        <w:t>heteroskedasticita</w:t>
+      </w:r>
+      <w:proofErr w:type="spellEnd"/>
+      <w:r>
+        <w:t xml:space="preserve"> a predstavuje hlavnú myšlienku modelov </w:t>
+      </w:r>
+      <w:r>
+        <w:rPr>
+          <w:i/>
+          <w:iCs/>
+        </w:rPr>
+        <w:t>ARCH/GARCH</w:t>
+      </w:r>
+      <w:r>
+        <w:t xml:space="preserve">, pričom sa otázky týkajú výhradne volatility premenných. </w:t>
+      </w:r>
+      <w:r>
+        <w:t>Konkrétne š</w:t>
+      </w:r>
+      <w:r>
+        <w:t xml:space="preserve">pecifikácia modelu </w:t>
+      </w:r>
+      <w:r>
+        <w:rPr>
+          <w:i/>
+          <w:iCs/>
+        </w:rPr>
         <w:t>GARCH</w:t>
       </w:r>
       <w:r>
-        <w:tab/>
-      </w:r>
-    </w:p>
-    <w:p>
-      <w:pPr>
-        <w:ind w:firstLine="0"/>
-      </w:pPr>
-    </w:p>
-    <w:p>
-      <w:pPr>
-        <w:ind w:firstLine="0"/>
-      </w:pPr>
-    </w:p>
-    <w:p>
-      <w:pPr>
-        <w:ind w:firstLine="0"/>
-      </w:pPr>
-    </w:p>
-    <w:p>
-      <w:pPr>
-        <w:ind w:firstLine="0"/>
-      </w:pPr>
-    </w:p>
-    <w:p>
-      <w:pPr>
-        <w:ind w:firstLine="0"/>
-      </w:pPr>
-    </w:p>
-    <w:p>
-      <w:pPr>
-        <w:ind w:firstLine="0"/>
-      </w:pPr>
+        <w:t xml:space="preserve"> vychádza z predpokladu, že najlepším </w:t>
+      </w:r>
+      <w:proofErr w:type="spellStart"/>
+      <w:r>
+        <w:t>prediktorom</w:t>
+      </w:r>
+      <w:proofErr w:type="spellEnd"/>
+      <w:r>
+        <w:t xml:space="preserve"> rozptylu v nasledujúcom období je priemer dlhodobého rozptylu v predchádzajúcom období </w:t>
+      </w:r>
+      <w:sdt>
+        <w:sdtPr>
+          <w:rPr>
+            <w:color w:val="000000"/>
+          </w:rPr>
+          <w:tag w:val="MENDELEY_CITATION_v3_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"/>
+          <w:id w:val="972484153"/>
+          <w:placeholder>
+            <w:docPart w:val="DefaultPlaceholder_-1854013440"/>
+          </w:placeholder>
+        </w:sdtPr>
+        <w:sdtContent>
+          <w:r>
+            <w:rPr>
+              <w:color w:val="000000"/>
+            </w:rPr>
+            <w:t>(</w:t>
+          </w:r>
+          <w:proofErr w:type="spellStart"/>
+          <w:r>
+            <w:rPr>
+              <w:color w:val="000000"/>
+            </w:rPr>
+            <w:t>Engle</w:t>
+          </w:r>
+          <w:proofErr w:type="spellEnd"/>
+          <w:r>
+            <w:rPr>
+              <w:color w:val="000000"/>
+            </w:rPr>
+            <w:t>, 2001)</w:t>
+          </w:r>
+        </w:sdtContent>
+      </w:sdt>
+      <w:r>
+        <w:rPr>
+          <w:color w:val="000000"/>
+        </w:rPr>
+        <w:t>.</w:t>
+      </w:r>
     </w:p>
     <w:p>
       <w:pPr>
@@ -3470,8 +4011,8 @@
         <w:pStyle w:val="Nadpis1"/>
         <w:ind w:left="0" w:firstLine="0"/>
       </w:pPr>
-      <w:bookmarkStart w:id="105" w:name="_Toc339279017"/>
-      <w:bookmarkStart w:id="106" w:name="_Toc227589987"/>
+      <w:bookmarkStart w:id="118" w:name="_Toc339279017"/>
+      <w:bookmarkStart w:id="119" w:name="_Toc230542221"/>
       <w:r>
         <w:lastRenderedPageBreak/>
         <w:t>2</w:t>
@@ -3492,19 +4033,24 @@
       <w:r>
         <w:t>ráce</w:t>
       </w:r>
-      <w:bookmarkEnd w:id="102"/>
-      <w:bookmarkEnd w:id="103"/>
-      <w:bookmarkEnd w:id="104"/>
-      <w:bookmarkEnd w:id="105"/>
-      <w:bookmarkEnd w:id="106"/>
+      <w:bookmarkEnd w:id="109"/>
+      <w:bookmarkEnd w:id="110"/>
+      <w:bookmarkEnd w:id="111"/>
+      <w:bookmarkEnd w:id="118"/>
+      <w:bookmarkEnd w:id="119"/>
       <w:r>
         <w:t xml:space="preserve"> </w:t>
       </w:r>
-      <w:bookmarkStart w:id="107" w:name="_Toc309047441"/>
-      <w:bookmarkStart w:id="108" w:name="_Toc309047487"/>
-      <w:bookmarkStart w:id="109" w:name="_Toc309047604"/>
-      <w:bookmarkStart w:id="110" w:name="_Toc195670726"/>
-      <w:bookmarkStart w:id="111" w:name="_Toc195684474"/>
+      <w:bookmarkStart w:id="120" w:name="_Toc309047441"/>
+      <w:bookmarkStart w:id="121" w:name="_Toc309047487"/>
+      <w:bookmarkStart w:id="122" w:name="_Toc309047604"/>
+      <w:bookmarkStart w:id="123" w:name="_Toc195670726"/>
+      <w:bookmarkStart w:id="124" w:name="_Toc195684474"/>
+    </w:p>
+    <w:p>
+      <w:r>
+        <w:t>Cieľom práce je analyzovať a porovnať volatilitu akciových trhov v USA, Číne a Európe v období pred pandémiou COVID-19, počas nej a v post-covidovom období s využitím metód umelej inteligencie na identifikáciu vzorov v časových radoch. Výskum sa zameria na skúmanie dynamiky volatility a identifikáciu rozdielov v reakciách jednotlivých trhov na externé ekonomické a geopolitické šoky.</w:t>
+      </w:r>
       <w:r>
         <w:br w:type="page"/>
       </w:r>
@@ -3513,8 +4059,8 @@
       <w:pPr>
         <w:pStyle w:val="Nadpis1"/>
       </w:pPr>
-      <w:bookmarkStart w:id="112" w:name="_Toc339279018"/>
-      <w:bookmarkStart w:id="113" w:name="_Toc227589988"/>
+      <w:bookmarkStart w:id="125" w:name="_Toc339279018"/>
+      <w:bookmarkStart w:id="126" w:name="_Toc230542222"/>
       <w:r>
         <w:lastRenderedPageBreak/>
         <w:t>3</w:t>
@@ -3522,83 +4068,83 @@
       <w:r>
         <w:tab/>
       </w:r>
-      <w:bookmarkEnd w:id="107"/>
-      <w:bookmarkEnd w:id="108"/>
-      <w:bookmarkEnd w:id="109"/>
-      <w:bookmarkEnd w:id="112"/>
-      <w:r>
-        <w:t>Metodika výskumu</w:t>
-      </w:r>
-      <w:bookmarkEnd w:id="113"/>
-    </w:p>
-    <w:p>
-      <w:pPr>
-        <w:pStyle w:val="Nadpis1"/>
-        <w:ind w:left="0" w:firstLine="0"/>
-      </w:pPr>
-      <w:bookmarkStart w:id="114" w:name="_Toc309047444"/>
-      <w:bookmarkStart w:id="115" w:name="_Toc309047490"/>
-      <w:bookmarkStart w:id="116" w:name="_Toc309047607"/>
-      <w:bookmarkStart w:id="117" w:name="_Toc339279022"/>
-      <w:r>
-        <w:br w:type="page"/>
-      </w:r>
-    </w:p>
-    <w:p>
-      <w:pPr>
-        <w:pStyle w:val="Nadpis1"/>
-      </w:pPr>
-      <w:bookmarkStart w:id="118" w:name="_Toc227589989"/>
-      <w:r>
-        <w:lastRenderedPageBreak/>
-        <w:t>4</w:t>
-      </w:r>
-      <w:r>
-        <w:tab/>
-      </w:r>
-      <w:r>
-        <w:t xml:space="preserve">Výsledky </w:t>
-      </w:r>
-      <w:bookmarkEnd w:id="114"/>
-      <w:bookmarkEnd w:id="115"/>
-      <w:bookmarkEnd w:id="116"/>
-      <w:bookmarkEnd w:id="117"/>
-      <w:r>
-        <w:t>výskumu</w:t>
-      </w:r>
-      <w:bookmarkEnd w:id="118"/>
-    </w:p>
-    <w:p>
-      <w:r>
-        <w:br w:type="page"/>
-      </w:r>
-    </w:p>
-    <w:p>
-      <w:pPr>
-        <w:pStyle w:val="Nadpis1"/>
-      </w:pPr>
-      <w:bookmarkStart w:id="119" w:name="_Toc309047447"/>
-      <w:bookmarkStart w:id="120" w:name="_Toc309047493"/>
-      <w:bookmarkStart w:id="121" w:name="_Toc309047610"/>
-      <w:bookmarkStart w:id="122" w:name="_Toc339279025"/>
-      <w:bookmarkStart w:id="123" w:name="_Toc227589990"/>
-      <w:r>
-        <w:lastRenderedPageBreak/>
-        <w:t>Záver</w:t>
-      </w:r>
-      <w:bookmarkStart w:id="124" w:name="_Toc195670727"/>
-      <w:bookmarkStart w:id="125" w:name="_Toc195684475"/>
-      <w:bookmarkStart w:id="126" w:name="_Toc309047448"/>
-      <w:bookmarkStart w:id="127" w:name="_Toc309047494"/>
-      <w:bookmarkStart w:id="128" w:name="_Toc309047611"/>
-      <w:bookmarkStart w:id="129" w:name="_Toc339279026"/>
-      <w:bookmarkEnd w:id="110"/>
-      <w:bookmarkEnd w:id="111"/>
-      <w:bookmarkEnd w:id="119"/>
       <w:bookmarkEnd w:id="120"/>
       <w:bookmarkEnd w:id="121"/>
       <w:bookmarkEnd w:id="122"/>
+      <w:bookmarkEnd w:id="125"/>
+      <w:r>
+        <w:t>Metodika výskumu</w:t>
+      </w:r>
+      <w:bookmarkEnd w:id="126"/>
+    </w:p>
+    <w:p>
+      <w:pPr>
+        <w:pStyle w:val="Nadpis1"/>
+        <w:ind w:left="0" w:firstLine="0"/>
+      </w:pPr>
+      <w:bookmarkStart w:id="127" w:name="_Toc309047444"/>
+      <w:bookmarkStart w:id="128" w:name="_Toc309047490"/>
+      <w:bookmarkStart w:id="129" w:name="_Toc309047607"/>
+      <w:bookmarkStart w:id="130" w:name="_Toc339279022"/>
+      <w:r>
+        <w:br w:type="page"/>
+      </w:r>
+    </w:p>
+    <w:p>
+      <w:pPr>
+        <w:pStyle w:val="Nadpis1"/>
+      </w:pPr>
+      <w:bookmarkStart w:id="131" w:name="_Toc230542223"/>
+      <w:r>
+        <w:lastRenderedPageBreak/>
+        <w:t>4</w:t>
+      </w:r>
+      <w:r>
+        <w:tab/>
+      </w:r>
+      <w:r>
+        <w:t xml:space="preserve">Výsledky </w:t>
+      </w:r>
+      <w:bookmarkEnd w:id="127"/>
+      <w:bookmarkEnd w:id="128"/>
+      <w:bookmarkEnd w:id="129"/>
+      <w:bookmarkEnd w:id="130"/>
+      <w:r>
+        <w:t>výskumu</w:t>
+      </w:r>
+      <w:bookmarkEnd w:id="131"/>
+    </w:p>
+    <w:p>
+      <w:r>
+        <w:br w:type="page"/>
+      </w:r>
+    </w:p>
+    <w:p>
+      <w:pPr>
+        <w:pStyle w:val="Nadpis1"/>
+      </w:pPr>
+      <w:bookmarkStart w:id="132" w:name="_Toc309047447"/>
+      <w:bookmarkStart w:id="133" w:name="_Toc309047493"/>
+      <w:bookmarkStart w:id="134" w:name="_Toc309047610"/>
+      <w:bookmarkStart w:id="135" w:name="_Toc339279025"/>
+      <w:bookmarkStart w:id="136" w:name="_Toc230542224"/>
+      <w:r>
+        <w:lastRenderedPageBreak/>
+        <w:t>Záver</w:t>
+      </w:r>
+      <w:bookmarkStart w:id="137" w:name="_Toc195670727"/>
+      <w:bookmarkStart w:id="138" w:name="_Toc195684475"/>
+      <w:bookmarkStart w:id="139" w:name="_Toc309047448"/>
+      <w:bookmarkStart w:id="140" w:name="_Toc309047494"/>
+      <w:bookmarkStart w:id="141" w:name="_Toc309047611"/>
+      <w:bookmarkStart w:id="142" w:name="_Toc339279026"/>
       <w:bookmarkEnd w:id="123"/>
+      <w:bookmarkEnd w:id="124"/>
+      <w:bookmarkEnd w:id="132"/>
+      <w:bookmarkEnd w:id="133"/>
+      <w:bookmarkEnd w:id="134"/>
+      <w:bookmarkEnd w:id="135"/>
+      <w:bookmarkEnd w:id="136"/>
     </w:p>
     <w:p>
       <w:pPr>
@@ -3619,7 +4165,7 @@
       <w:pPr>
         <w:pStyle w:val="Nadpis1"/>
       </w:pPr>
-      <w:bookmarkStart w:id="130" w:name="_Toc227589991"/>
+      <w:bookmarkStart w:id="143" w:name="_Toc230542225"/>
       <w:r>
         <w:lastRenderedPageBreak/>
         <w:t xml:space="preserve">Zoznam </w:t>
@@ -3627,13 +4173,13 @@
       <w:r>
         <w:t>bibliografických odkazov</w:t>
       </w:r>
-      <w:bookmarkEnd w:id="124"/>
-      <w:bookmarkEnd w:id="125"/>
-      <w:bookmarkEnd w:id="126"/>
-      <w:bookmarkEnd w:id="127"/>
-      <w:bookmarkEnd w:id="128"/>
-      <w:bookmarkEnd w:id="129"/>
-      <w:bookmarkEnd w:id="130"/>
+      <w:bookmarkEnd w:id="137"/>
+      <w:bookmarkEnd w:id="138"/>
+      <w:bookmarkEnd w:id="139"/>
+      <w:bookmarkEnd w:id="140"/>
+      <w:bookmarkEnd w:id="141"/>
+      <w:bookmarkEnd w:id="142"/>
+      <w:bookmarkEnd w:id="143"/>
       <w:r>
         <w:t xml:space="preserve"> </w:t>
       </w:r>
@@ -3655,7 +4201,7 @@
             <w:autoSpaceDE w:val="0"/>
             <w:autoSpaceDN w:val="0"/>
             <w:ind w:hanging="480"/>
-            <w:divId w:val="678233547"/>
+            <w:divId w:val="608197071"/>
             <w:rPr>
               <w:color w:val="000000"/>
             </w:rPr>
@@ -3808,7 +4354,7 @@
             <w:autoSpaceDE w:val="0"/>
             <w:autoSpaceDN w:val="0"/>
             <w:ind w:hanging="480"/>
-            <w:divId w:val="490562882"/>
+            <w:divId w:val="1681395754"/>
             <w:rPr>
               <w:color w:val="000000"/>
             </w:rPr>
@@ -3991,7 +4537,7 @@
             <w:autoSpaceDE w:val="0"/>
             <w:autoSpaceDN w:val="0"/>
             <w:ind w:hanging="480"/>
-            <w:divId w:val="812332420"/>
+            <w:divId w:val="1483354614"/>
             <w:rPr>
               <w:color w:val="000000"/>
             </w:rPr>
@@ -4001,21 +4547,21 @@
             <w:rPr>
               <w:color w:val="000000"/>
             </w:rPr>
-            <w:t>Fama</w:t>
+            <w:t>Engle</w:t>
           </w:r>
           <w:proofErr w:type="spellEnd"/>
           <w:r>
             <w:rPr>
               <w:color w:val="000000"/>
             </w:rPr>
-            <w:t xml:space="preserve">, E. F. (1970). </w:t>
+            <w:t xml:space="preserve">, R. (2001). GARCH 101: </w:t>
           </w:r>
           <w:proofErr w:type="spellStart"/>
           <w:r>
             <w:rPr>
               <w:color w:val="000000"/>
             </w:rPr>
-            <w:t>Efficient</w:t>
+            <w:t>The</w:t>
           </w:r>
           <w:proofErr w:type="spellEnd"/>
           <w:r>
@@ -4029,63 +4575,49 @@
             <w:rPr>
               <w:color w:val="000000"/>
             </w:rPr>
-            <w:t>Capital</w:t>
+            <w:t>Use</w:t>
           </w:r>
           <w:proofErr w:type="spellEnd"/>
           <w:r>
             <w:rPr>
               <w:color w:val="000000"/>
             </w:rPr>
-            <w:t xml:space="preserve"> Markets: A </w:t>
+            <w:t xml:space="preserve"> of ARCH/GARCH </w:t>
           </w:r>
           <w:proofErr w:type="spellStart"/>
           <w:r>
             <w:rPr>
               <w:color w:val="000000"/>
             </w:rPr>
-            <w:t>Review</w:t>
+            <w:t>Models</w:t>
           </w:r>
           <w:proofErr w:type="spellEnd"/>
           <w:r>
             <w:rPr>
               <w:color w:val="000000"/>
             </w:rPr>
-            <w:t xml:space="preserve"> of </w:t>
+            <w:t xml:space="preserve"> in </w:t>
           </w:r>
           <w:proofErr w:type="spellStart"/>
           <w:r>
             <w:rPr>
               <w:color w:val="000000"/>
             </w:rPr>
-            <w:t>Theory</w:t>
+            <w:t>Applied</w:t>
           </w:r>
           <w:proofErr w:type="spellEnd"/>
           <w:r>
             <w:rPr>
               <w:color w:val="000000"/>
             </w:rPr>
-            <w:t xml:space="preserve"> and </w:t>
+            <w:t xml:space="preserve"> </w:t>
           </w:r>
           <w:proofErr w:type="spellStart"/>
           <w:r>
             <w:rPr>
               <w:color w:val="000000"/>
             </w:rPr>
-            <w:t>Empirical</w:t>
-          </w:r>
-          <w:proofErr w:type="spellEnd"/>
-          <w:r>
-            <w:rPr>
-              <w:color w:val="000000"/>
-            </w:rPr>
-            <w:t xml:space="preserve"> </w:t>
-          </w:r>
-          <w:proofErr w:type="spellStart"/>
-          <w:r>
-            <w:rPr>
-              <w:color w:val="000000"/>
-            </w:rPr>
-            <w:t>Work</w:t>
+            <w:t>Econometrics</w:t>
           </w:r>
           <w:proofErr w:type="spellEnd"/>
           <w:r>
@@ -4101,7 +4633,7 @@
               <w:iCs/>
               <w:color w:val="000000"/>
             </w:rPr>
-            <w:t>The</w:t>
+            <w:t>Journal</w:t>
           </w:r>
           <w:proofErr w:type="spellEnd"/>
           <w:r>
@@ -4110,7 +4642,7 @@
               <w:iCs/>
               <w:color w:val="000000"/>
             </w:rPr>
-            <w:t xml:space="preserve"> </w:t>
+            <w:t xml:space="preserve"> of </w:t>
           </w:r>
           <w:proofErr w:type="spellStart"/>
           <w:r>
@@ -4119,7 +4651,7 @@
               <w:iCs/>
               <w:color w:val="000000"/>
             </w:rPr>
-            <w:t>Journal</w:t>
+            <w:t>Economic</w:t>
           </w:r>
           <w:proofErr w:type="spellEnd"/>
           <w:r>
@@ -4128,7 +4660,7 @@
               <w:iCs/>
               <w:color w:val="000000"/>
             </w:rPr>
-            <w:t xml:space="preserve"> of </w:t>
+            <w:t xml:space="preserve"> </w:t>
           </w:r>
           <w:proofErr w:type="spellStart"/>
           <w:r>
@@ -4137,7 +4669,7 @@
               <w:iCs/>
               <w:color w:val="000000"/>
             </w:rPr>
-            <w:t>Finance</w:t>
+            <w:t>Perspectives</w:t>
           </w:r>
           <w:proofErr w:type="spellEnd"/>
           <w:r>
@@ -4152,13 +4684,13 @@
               <w:iCs/>
               <w:color w:val="000000"/>
             </w:rPr>
-            <w:t>25</w:t>
-          </w:r>
-          <w:r>
-            <w:rPr>
-              <w:color w:val="000000"/>
-            </w:rPr>
-            <w:t>(2), 383. https://doi.org/10.2307/2325486</w:t>
+            <w:t>15</w:t>
+          </w:r>
+          <w:r>
+            <w:rPr>
+              <w:color w:val="000000"/>
+            </w:rPr>
+            <w:t>(4), 157–168. https://doi.org/10.1257/JEP.15.4.157</w:t>
           </w:r>
         </w:p>
         <w:p>
@@ -4166,7 +4698,7 @@
             <w:autoSpaceDE w:val="0"/>
             <w:autoSpaceDN w:val="0"/>
             <w:ind w:hanging="480"/>
-            <w:divId w:val="639042290"/>
+            <w:divId w:val="56707050"/>
             <w:rPr>
               <w:color w:val="000000"/>
             </w:rPr>
@@ -4176,77 +4708,77 @@
             <w:rPr>
               <w:color w:val="000000"/>
             </w:rPr>
-            <w:t>Granger</w:t>
+            <w:t>Fama</w:t>
           </w:r>
           <w:proofErr w:type="spellEnd"/>
           <w:r>
             <w:rPr>
               <w:color w:val="000000"/>
             </w:rPr>
-            <w:t xml:space="preserve">, C. W. J., &amp; </w:t>
+            <w:t xml:space="preserve">, E. F. (1970). </w:t>
           </w:r>
           <w:proofErr w:type="spellStart"/>
           <w:r>
             <w:rPr>
               <w:color w:val="000000"/>
             </w:rPr>
-            <w:t>Poon</w:t>
+            <w:t>Efficient</w:t>
           </w:r>
           <w:proofErr w:type="spellEnd"/>
           <w:r>
             <w:rPr>
               <w:color w:val="000000"/>
             </w:rPr>
-            <w:t xml:space="preserve">, S.-H. (2002). </w:t>
+            <w:t xml:space="preserve"> </w:t>
           </w:r>
           <w:proofErr w:type="spellStart"/>
           <w:r>
             <w:rPr>
               <w:color w:val="000000"/>
             </w:rPr>
-            <w:t>Forecasting</w:t>
+            <w:t>Capital</w:t>
           </w:r>
           <w:proofErr w:type="spellEnd"/>
           <w:r>
             <w:rPr>
               <w:color w:val="000000"/>
             </w:rPr>
-            <w:t xml:space="preserve"> Volatility in </w:t>
+            <w:t xml:space="preserve"> Markets: A </w:t>
           </w:r>
           <w:proofErr w:type="spellStart"/>
           <w:r>
             <w:rPr>
               <w:color w:val="000000"/>
             </w:rPr>
-            <w:t>Financial</w:t>
+            <w:t>Review</w:t>
           </w:r>
           <w:proofErr w:type="spellEnd"/>
           <w:r>
             <w:rPr>
               <w:color w:val="000000"/>
             </w:rPr>
-            <w:t xml:space="preserve"> Markets: A </w:t>
+            <w:t xml:space="preserve"> of </w:t>
           </w:r>
           <w:proofErr w:type="spellStart"/>
           <w:r>
             <w:rPr>
               <w:color w:val="000000"/>
             </w:rPr>
-            <w:t>Review</w:t>
+            <w:t>Theory</w:t>
           </w:r>
           <w:proofErr w:type="spellEnd"/>
           <w:r>
             <w:rPr>
               <w:color w:val="000000"/>
             </w:rPr>
-            <w:t xml:space="preserve"> (</w:t>
+            <w:t xml:space="preserve"> and </w:t>
           </w:r>
           <w:proofErr w:type="spellStart"/>
           <w:r>
             <w:rPr>
               <w:color w:val="000000"/>
             </w:rPr>
-            <w:t>Revised</w:t>
+            <w:t>Empirical</w:t>
           </w:r>
           <w:proofErr w:type="spellEnd"/>
           <w:r>
@@ -4260,56 +4792,80 @@
             <w:rPr>
               <w:color w:val="000000"/>
             </w:rPr>
-            <w:t>Edition</w:t>
+            <w:t>Work</w:t>
           </w:r>
           <w:proofErr w:type="spellEnd"/>
           <w:r>
             <w:rPr>
               <w:color w:val="000000"/>
             </w:rPr>
-            <w:t xml:space="preserve">). </w:t>
-          </w:r>
+            <w:t xml:space="preserve">. </w:t>
+          </w:r>
+          <w:proofErr w:type="spellStart"/>
           <w:r>
             <w:rPr>
               <w:i/>
               <w:iCs/>
               <w:color w:val="000000"/>
             </w:rPr>
-            <w:t xml:space="preserve">SSRN </w:t>
-          </w:r>
-          <w:proofErr w:type="spellStart"/>
+            <w:t>The</w:t>
+          </w:r>
+          <w:proofErr w:type="spellEnd"/>
           <w:r>
             <w:rPr>
               <w:i/>
               <w:iCs/>
               <w:color w:val="000000"/>
             </w:rPr>
-            <w:t>Electronic</w:t>
-          </w:r>
-          <w:proofErr w:type="spellEnd"/>
+            <w:t xml:space="preserve"> </w:t>
+          </w:r>
+          <w:proofErr w:type="spellStart"/>
           <w:r>
             <w:rPr>
               <w:i/>
               <w:iCs/>
               <w:color w:val="000000"/>
             </w:rPr>
-            <w:t xml:space="preserve"> </w:t>
-          </w:r>
-          <w:proofErr w:type="spellStart"/>
+            <w:t>Journal</w:t>
+          </w:r>
+          <w:proofErr w:type="spellEnd"/>
           <w:r>
             <w:rPr>
               <w:i/>
               <w:iCs/>
               <w:color w:val="000000"/>
             </w:rPr>
-            <w:t>Journal</w:t>
+            <w:t xml:space="preserve"> of </w:t>
+          </w:r>
+          <w:proofErr w:type="spellStart"/>
+          <w:r>
+            <w:rPr>
+              <w:i/>
+              <w:iCs/>
+              <w:color w:val="000000"/>
+            </w:rPr>
+            <w:t>Finance</w:t>
           </w:r>
           <w:proofErr w:type="spellEnd"/>
           <w:r>
             <w:rPr>
               <w:color w:val="000000"/>
             </w:rPr>
-            <w:t>. https://doi.org/10.2139/SSRN.331800</w:t>
+            <w:t xml:space="preserve">, </w:t>
+          </w:r>
+          <w:r>
+            <w:rPr>
+              <w:i/>
+              <w:iCs/>
+              <w:color w:val="000000"/>
+            </w:rPr>
+            <w:t>25</w:t>
+          </w:r>
+          <w:r>
+            <w:rPr>
+              <w:color w:val="000000"/>
+            </w:rPr>
+            <w:t>(2), 383. https://doi.org/10.2307/2325486</w:t>
           </w:r>
         </w:p>
         <w:p>
@@ -4317,7 +4873,7 @@
             <w:autoSpaceDE w:val="0"/>
             <w:autoSpaceDN w:val="0"/>
             <w:ind w:hanging="480"/>
-            <w:divId w:val="1005673882"/>
+            <w:divId w:val="1740402648"/>
             <w:rPr>
               <w:color w:val="000000"/>
             </w:rPr>
@@ -4327,69 +4883,83 @@
             <w:rPr>
               <w:color w:val="000000"/>
             </w:rPr>
-            <w:t>Hiransha</w:t>
+            <w:t>Granger</w:t>
           </w:r>
           <w:proofErr w:type="spellEnd"/>
           <w:r>
             <w:rPr>
               <w:color w:val="000000"/>
             </w:rPr>
-            <w:t xml:space="preserve">, M., </w:t>
+            <w:t xml:space="preserve">, C. W. J., &amp; </w:t>
           </w:r>
           <w:proofErr w:type="spellStart"/>
           <w:r>
             <w:rPr>
               <w:color w:val="000000"/>
             </w:rPr>
-            <w:t>Gopalakrishnan</w:t>
+            <w:t>Poon</w:t>
           </w:r>
           <w:proofErr w:type="spellEnd"/>
           <w:r>
             <w:rPr>
               <w:color w:val="000000"/>
             </w:rPr>
-            <w:t xml:space="preserve">, E. A., </w:t>
+            <w:t xml:space="preserve">, S.-H. (2002). </w:t>
           </w:r>
           <w:proofErr w:type="spellStart"/>
           <w:r>
             <w:rPr>
               <w:color w:val="000000"/>
             </w:rPr>
-            <w:t>Menon</w:t>
+            <w:t>Forecasting</w:t>
           </w:r>
           <w:proofErr w:type="spellEnd"/>
           <w:r>
             <w:rPr>
               <w:color w:val="000000"/>
             </w:rPr>
-            <w:t xml:space="preserve">, V. K., &amp; </w:t>
+            <w:t xml:space="preserve"> Volatility in </w:t>
           </w:r>
           <w:proofErr w:type="spellStart"/>
           <w:r>
             <w:rPr>
               <w:color w:val="000000"/>
             </w:rPr>
-            <w:t>Soman</w:t>
+            <w:t>Financial</w:t>
           </w:r>
           <w:proofErr w:type="spellEnd"/>
           <w:r>
             <w:rPr>
               <w:color w:val="000000"/>
             </w:rPr>
-            <w:t xml:space="preserve">, K. P. (2018). NSE Stock </w:t>
+            <w:t xml:space="preserve"> Markets: A </w:t>
           </w:r>
           <w:proofErr w:type="spellStart"/>
           <w:r>
             <w:rPr>
               <w:color w:val="000000"/>
             </w:rPr>
-            <w:t>Market</w:t>
+            <w:t>Review</w:t>
           </w:r>
           <w:proofErr w:type="spellEnd"/>
           <w:r>
             <w:rPr>
               <w:color w:val="000000"/>
             </w:rPr>
+            <w:t xml:space="preserve"> (</w:t>
+          </w:r>
+          <w:proofErr w:type="spellStart"/>
+          <w:r>
+            <w:rPr>
+              <w:color w:val="000000"/>
+            </w:rPr>
+            <w:t>Revised</w:t>
+          </w:r>
+          <w:proofErr w:type="spellEnd"/>
+          <w:r>
+            <w:rPr>
+              <w:color w:val="000000"/>
+            </w:rPr>
             <w:t xml:space="preserve"> </w:t>
           </w:r>
           <w:proofErr w:type="spellStart"/>
@@ -4397,122 +4967,56 @@
             <w:rPr>
               <w:color w:val="000000"/>
             </w:rPr>
-            <w:t>Prediction</w:t>
+            <w:t>Edition</w:t>
           </w:r>
           <w:proofErr w:type="spellEnd"/>
           <w:r>
             <w:rPr>
               <w:color w:val="000000"/>
             </w:rPr>
-            <w:t xml:space="preserve"> </w:t>
-          </w:r>
-          <w:proofErr w:type="spellStart"/>
-          <w:r>
-            <w:rPr>
-              <w:color w:val="000000"/>
-            </w:rPr>
-            <w:t>Using</w:t>
-          </w:r>
-          <w:proofErr w:type="spellEnd"/>
-          <w:r>
-            <w:rPr>
-              <w:color w:val="000000"/>
-            </w:rPr>
-            <w:t xml:space="preserve"> </w:t>
-          </w:r>
-          <w:proofErr w:type="spellStart"/>
-          <w:r>
-            <w:rPr>
-              <w:color w:val="000000"/>
-            </w:rPr>
-            <w:t>Deep-Learning</w:t>
-          </w:r>
-          <w:proofErr w:type="spellEnd"/>
-          <w:r>
-            <w:rPr>
-              <w:color w:val="000000"/>
-            </w:rPr>
-            <w:t xml:space="preserve"> </w:t>
-          </w:r>
-          <w:proofErr w:type="spellStart"/>
-          <w:r>
-            <w:rPr>
-              <w:color w:val="000000"/>
-            </w:rPr>
-            <w:t>Models</w:t>
-          </w:r>
-          <w:proofErr w:type="spellEnd"/>
-          <w:r>
-            <w:rPr>
-              <w:color w:val="000000"/>
-            </w:rPr>
-            <w:t xml:space="preserve">. </w:t>
-          </w:r>
-          <w:proofErr w:type="spellStart"/>
+            <w:t xml:space="preserve">). </w:t>
+          </w:r>
           <w:r>
             <w:rPr>
               <w:i/>
               <w:iCs/>
               <w:color w:val="000000"/>
             </w:rPr>
-            <w:t>Procedia</w:t>
-          </w:r>
-          <w:proofErr w:type="spellEnd"/>
+            <w:t xml:space="preserve">SSRN </w:t>
+          </w:r>
+          <w:proofErr w:type="spellStart"/>
           <w:r>
             <w:rPr>
               <w:i/>
               <w:iCs/>
               <w:color w:val="000000"/>
             </w:rPr>
-            <w:t xml:space="preserve"> </w:t>
-          </w:r>
-          <w:proofErr w:type="spellStart"/>
+            <w:t>Electronic</w:t>
+          </w:r>
+          <w:proofErr w:type="spellEnd"/>
           <w:r>
             <w:rPr>
               <w:i/>
               <w:iCs/>
               <w:color w:val="000000"/>
             </w:rPr>
-            <w:t>Computer</w:t>
-          </w:r>
-          <w:proofErr w:type="spellEnd"/>
+            <w:t xml:space="preserve"> </w:t>
+          </w:r>
+          <w:proofErr w:type="spellStart"/>
           <w:r>
             <w:rPr>
               <w:i/>
               <w:iCs/>
               <w:color w:val="000000"/>
             </w:rPr>
-            <w:t xml:space="preserve"> </w:t>
-          </w:r>
-          <w:proofErr w:type="spellStart"/>
-          <w:r>
-            <w:rPr>
-              <w:i/>
-              <w:iCs/>
-              <w:color w:val="000000"/>
-            </w:rPr>
-            <w:t>Science</w:t>
+            <w:t>Journal</w:t>
           </w:r>
           <w:proofErr w:type="spellEnd"/>
           <w:r>
             <w:rPr>
               <w:color w:val="000000"/>
             </w:rPr>
-            <w:t xml:space="preserve">, </w:t>
-          </w:r>
-          <w:r>
-            <w:rPr>
-              <w:i/>
-              <w:iCs/>
-              <w:color w:val="000000"/>
-            </w:rPr>
-            <w:t>132</w:t>
-          </w:r>
-          <w:r>
-            <w:rPr>
-              <w:color w:val="000000"/>
-            </w:rPr>
-            <w:t>, 1351–1362. https://doi.org/10.1016/J.PROCS.2018.05.050</w:t>
+            <w:t>. https://doi.org/10.2139/SSRN.331800</w:t>
           </w:r>
         </w:p>
         <w:p>
@@ -4520,7 +5024,7 @@
             <w:autoSpaceDE w:val="0"/>
             <w:autoSpaceDN w:val="0"/>
             <w:ind w:hanging="480"/>
-            <w:divId w:val="2047830541"/>
+            <w:divId w:val="1269586541"/>
             <w:rPr>
               <w:color w:val="000000"/>
             </w:rPr>
@@ -4530,34 +5034,62 @@
             <w:rPr>
               <w:color w:val="000000"/>
             </w:rPr>
-            <w:t>Levine</w:t>
+            <w:t>Hiransha</w:t>
           </w:r>
           <w:proofErr w:type="spellEnd"/>
           <w:r>
             <w:rPr>
               <w:color w:val="000000"/>
             </w:rPr>
-            <w:t xml:space="preserve">, R., &amp; </w:t>
+            <w:t xml:space="preserve">, M., </w:t>
           </w:r>
           <w:proofErr w:type="spellStart"/>
           <w:r>
             <w:rPr>
               <w:color w:val="000000"/>
             </w:rPr>
-            <w:t>Zervos</w:t>
+            <w:t>Gopalakrishnan</w:t>
           </w:r>
           <w:proofErr w:type="spellEnd"/>
           <w:r>
             <w:rPr>
               <w:color w:val="000000"/>
             </w:rPr>
-            <w:t xml:space="preserve">, S. (1996). Stock </w:t>
+            <w:t xml:space="preserve">, E. A., </w:t>
           </w:r>
           <w:proofErr w:type="spellStart"/>
           <w:r>
             <w:rPr>
               <w:color w:val="000000"/>
             </w:rPr>
+            <w:t>Menon</w:t>
+          </w:r>
+          <w:proofErr w:type="spellEnd"/>
+          <w:r>
+            <w:rPr>
+              <w:color w:val="000000"/>
+            </w:rPr>
+            <w:t xml:space="preserve">, V. K., &amp; </w:t>
+          </w:r>
+          <w:proofErr w:type="spellStart"/>
+          <w:r>
+            <w:rPr>
+              <w:color w:val="000000"/>
+            </w:rPr>
+            <w:t>Soman</w:t>
+          </w:r>
+          <w:proofErr w:type="spellEnd"/>
+          <w:r>
+            <w:rPr>
+              <w:color w:val="000000"/>
+            </w:rPr>
+            <w:t xml:space="preserve">, K. P. (2018). NSE Stock </w:t>
+          </w:r>
+          <w:proofErr w:type="spellStart"/>
+          <w:r>
+            <w:rPr>
+              <w:color w:val="000000"/>
+            </w:rPr>
             <w:t>Market</w:t>
           </w:r>
           <w:proofErr w:type="spellEnd"/>
@@ -4572,35 +5104,49 @@
             <w:rPr>
               <w:color w:val="000000"/>
             </w:rPr>
-            <w:t>Development</w:t>
+            <w:t>Prediction</w:t>
           </w:r>
           <w:proofErr w:type="spellEnd"/>
           <w:r>
             <w:rPr>
               <w:color w:val="000000"/>
             </w:rPr>
-            <w:t xml:space="preserve"> and </w:t>
+            <w:t xml:space="preserve"> </w:t>
           </w:r>
           <w:proofErr w:type="spellStart"/>
           <w:r>
             <w:rPr>
               <w:color w:val="000000"/>
             </w:rPr>
-            <w:t>Long</w:t>
+            <w:t>Using</w:t>
           </w:r>
           <w:proofErr w:type="spellEnd"/>
           <w:r>
             <w:rPr>
               <w:color w:val="000000"/>
             </w:rPr>
-            <w:t xml:space="preserve">-Run </w:t>
+            <w:t xml:space="preserve"> </w:t>
           </w:r>
           <w:proofErr w:type="spellStart"/>
           <w:r>
             <w:rPr>
               <w:color w:val="000000"/>
             </w:rPr>
-            <w:t>Growth</w:t>
+            <w:t>Deep-Learning</w:t>
+          </w:r>
+          <w:proofErr w:type="spellEnd"/>
+          <w:r>
+            <w:rPr>
+              <w:color w:val="000000"/>
+            </w:rPr>
+            <w:t xml:space="preserve"> </w:t>
+          </w:r>
+          <w:proofErr w:type="spellStart"/>
+          <w:r>
+            <w:rPr>
+              <w:color w:val="000000"/>
+            </w:rPr>
+            <w:t>Models</w:t>
           </w:r>
           <w:proofErr w:type="spellEnd"/>
           <w:r>
@@ -4616,7 +5162,7 @@
               <w:iCs/>
               <w:color w:val="000000"/>
             </w:rPr>
-            <w:t>The</w:t>
+            <w:t>Procedia</w:t>
           </w:r>
           <w:proofErr w:type="spellEnd"/>
           <w:r>
@@ -4634,7 +5180,7 @@
               <w:iCs/>
               <w:color w:val="000000"/>
             </w:rPr>
-            <w:t>World</w:t>
+            <w:t>Computer</w:t>
           </w:r>
           <w:proofErr w:type="spellEnd"/>
           <w:r>
@@ -4643,7 +5189,7 @@
               <w:iCs/>
               <w:color w:val="000000"/>
             </w:rPr>
-            <w:t xml:space="preserve"> Bank </w:t>
+            <w:t xml:space="preserve"> </w:t>
           </w:r>
           <w:proofErr w:type="spellStart"/>
           <w:r>
@@ -4652,46 +5198,28 @@
               <w:iCs/>
               <w:color w:val="000000"/>
             </w:rPr>
-            <w:t>Economic</w:t>
+            <w:t>Science</w:t>
           </w:r>
           <w:proofErr w:type="spellEnd"/>
+          <w:r>
+            <w:rPr>
+              <w:color w:val="000000"/>
+            </w:rPr>
+            <w:t xml:space="preserve">, </w:t>
+          </w:r>
           <w:r>
             <w:rPr>
               <w:i/>
               <w:iCs/>
               <w:color w:val="000000"/>
             </w:rPr>
-            <w:t xml:space="preserve"> </w:t>
-          </w:r>
-          <w:proofErr w:type="spellStart"/>
-          <w:r>
-            <w:rPr>
-              <w:i/>
-              <w:iCs/>
-              <w:color w:val="000000"/>
-            </w:rPr>
-            <w:t>Review</w:t>
-          </w:r>
-          <w:proofErr w:type="spellEnd"/>
-          <w:r>
-            <w:rPr>
-              <w:color w:val="000000"/>
-            </w:rPr>
-            <w:t xml:space="preserve">, </w:t>
-          </w:r>
-          <w:r>
-            <w:rPr>
-              <w:i/>
-              <w:iCs/>
-              <w:color w:val="000000"/>
-            </w:rPr>
-            <w:t>10</w:t>
-          </w:r>
-          <w:r>
-            <w:rPr>
-              <w:color w:val="000000"/>
-            </w:rPr>
-            <w:t>(2), 323–339. https://doi.org/10.1093/WBER/10.2.323</w:t>
+            <w:t>132</w:t>
+          </w:r>
+          <w:r>
+            <w:rPr>
+              <w:color w:val="000000"/>
+            </w:rPr>
+            <w:t>, 1351–1362. https://doi.org/10.1016/J.PROCS.2018.05.050</w:t>
           </w:r>
         </w:p>
         <w:p>
@@ -4699,7 +5227,7 @@
             <w:autoSpaceDE w:val="0"/>
             <w:autoSpaceDN w:val="0"/>
             <w:ind w:hanging="480"/>
-            <w:divId w:val="1346515518"/>
+            <w:divId w:val="827405952"/>
             <w:rPr>
               <w:color w:val="000000"/>
             </w:rPr>
@@ -4709,14 +5237,84 @@
             <w:rPr>
               <w:color w:val="000000"/>
             </w:rPr>
-            <w:t>Malkiel</w:t>
+            <w:t>Levine</w:t>
           </w:r>
           <w:proofErr w:type="spellEnd"/>
           <w:r>
             <w:rPr>
               <w:color w:val="000000"/>
             </w:rPr>
-            <w:t xml:space="preserve">, B. G. (2003). </w:t>
+            <w:t xml:space="preserve">, R., &amp; </w:t>
+          </w:r>
+          <w:proofErr w:type="spellStart"/>
+          <w:r>
+            <w:rPr>
+              <w:color w:val="000000"/>
+            </w:rPr>
+            <w:t>Zervos</w:t>
+          </w:r>
+          <w:proofErr w:type="spellEnd"/>
+          <w:r>
+            <w:rPr>
+              <w:color w:val="000000"/>
+            </w:rPr>
+            <w:t xml:space="preserve">, S. (1996). Stock </w:t>
+          </w:r>
+          <w:proofErr w:type="spellStart"/>
+          <w:r>
+            <w:rPr>
+              <w:color w:val="000000"/>
+            </w:rPr>
+            <w:t>Market</w:t>
+          </w:r>
+          <w:proofErr w:type="spellEnd"/>
+          <w:r>
+            <w:rPr>
+              <w:color w:val="000000"/>
+            </w:rPr>
+            <w:t xml:space="preserve"> </w:t>
+          </w:r>
+          <w:proofErr w:type="spellStart"/>
+          <w:r>
+            <w:rPr>
+              <w:color w:val="000000"/>
+            </w:rPr>
+            <w:t>Development</w:t>
+          </w:r>
+          <w:proofErr w:type="spellEnd"/>
+          <w:r>
+            <w:rPr>
+              <w:color w:val="000000"/>
+            </w:rPr>
+            <w:t xml:space="preserve"> and </w:t>
+          </w:r>
+          <w:proofErr w:type="spellStart"/>
+          <w:r>
+            <w:rPr>
+              <w:color w:val="000000"/>
+            </w:rPr>
+            <w:t>Long</w:t>
+          </w:r>
+          <w:proofErr w:type="spellEnd"/>
+          <w:r>
+            <w:rPr>
+              <w:color w:val="000000"/>
+            </w:rPr>
+            <w:t xml:space="preserve">-Run </w:t>
+          </w:r>
+          <w:proofErr w:type="spellStart"/>
+          <w:r>
+            <w:rPr>
+              <w:color w:val="000000"/>
+            </w:rPr>
+            <w:t>Growth</w:t>
+          </w:r>
+          <w:proofErr w:type="spellEnd"/>
+          <w:r>
+            <w:rPr>
+              <w:color w:val="000000"/>
+            </w:rPr>
+            <w:t xml:space="preserve">. </w:t>
           </w:r>
           <w:proofErr w:type="spellStart"/>
           <w:r>
@@ -4743,7 +5341,7 @@
               <w:iCs/>
               <w:color w:val="000000"/>
             </w:rPr>
-            <w:t>Efficient</w:t>
+            <w:t>World</w:t>
           </w:r>
           <w:proofErr w:type="spellEnd"/>
           <w:r>
@@ -4752,7 +5350,7 @@
               <w:iCs/>
               <w:color w:val="000000"/>
             </w:rPr>
-            <w:t xml:space="preserve"> </w:t>
+            <w:t xml:space="preserve"> Bank </w:t>
           </w:r>
           <w:proofErr w:type="spellStart"/>
           <w:r>
@@ -4761,7 +5359,7 @@
               <w:iCs/>
               <w:color w:val="000000"/>
             </w:rPr>
-            <w:t>Market</w:t>
+            <w:t>Economic</w:t>
           </w:r>
           <w:proofErr w:type="spellEnd"/>
           <w:r>
@@ -4779,50 +5377,28 @@
               <w:iCs/>
               <w:color w:val="000000"/>
             </w:rPr>
-            <w:t>Hypothesis</w:t>
+            <w:t>Review</w:t>
           </w:r>
           <w:proofErr w:type="spellEnd"/>
+          <w:r>
+            <w:rPr>
+              <w:color w:val="000000"/>
+            </w:rPr>
+            <w:t xml:space="preserve">, </w:t>
+          </w:r>
           <w:r>
             <w:rPr>
               <w:i/>
               <w:iCs/>
               <w:color w:val="000000"/>
             </w:rPr>
-            <w:t xml:space="preserve"> and </w:t>
-          </w:r>
-          <w:proofErr w:type="spellStart"/>
-          <w:r>
-            <w:rPr>
-              <w:i/>
-              <w:iCs/>
-              <w:color w:val="000000"/>
-            </w:rPr>
-            <w:t>Its</w:t>
-          </w:r>
-          <w:proofErr w:type="spellEnd"/>
-          <w:r>
-            <w:rPr>
-              <w:i/>
-              <w:iCs/>
-              <w:color w:val="000000"/>
-            </w:rPr>
-            <w:t xml:space="preserve"> </w:t>
-          </w:r>
-          <w:proofErr w:type="spellStart"/>
-          <w:r>
-            <w:rPr>
-              <w:i/>
-              <w:iCs/>
-              <w:color w:val="000000"/>
-            </w:rPr>
-            <w:t>Critics</w:t>
-          </w:r>
-          <w:proofErr w:type="spellEnd"/>
-          <w:r>
-            <w:rPr>
-              <w:color w:val="000000"/>
-            </w:rPr>
-            <w:t>.</w:t>
+            <w:t>10</w:t>
+          </w:r>
+          <w:r>
+            <w:rPr>
+              <w:color w:val="000000"/>
+            </w:rPr>
+            <w:t>(2), 323–339. https://doi.org/10.1093/WBER/10.2.323</w:t>
           </w:r>
         </w:p>
         <w:p>
@@ -4830,7 +5406,138 @@
             <w:autoSpaceDE w:val="0"/>
             <w:autoSpaceDN w:val="0"/>
             <w:ind w:hanging="480"/>
-            <w:divId w:val="550851998"/>
+            <w:divId w:val="1130366993"/>
+            <w:rPr>
+              <w:color w:val="000000"/>
+            </w:rPr>
+          </w:pPr>
+          <w:proofErr w:type="spellStart"/>
+          <w:r>
+            <w:rPr>
+              <w:color w:val="000000"/>
+            </w:rPr>
+            <w:t>Malkiel</w:t>
+          </w:r>
+          <w:proofErr w:type="spellEnd"/>
+          <w:r>
+            <w:rPr>
+              <w:color w:val="000000"/>
+            </w:rPr>
+            <w:t xml:space="preserve">, B. G. (2003). </w:t>
+          </w:r>
+          <w:proofErr w:type="spellStart"/>
+          <w:r>
+            <w:rPr>
+              <w:i/>
+              <w:iCs/>
+              <w:color w:val="000000"/>
+            </w:rPr>
+            <w:t>The</w:t>
+          </w:r>
+          <w:proofErr w:type="spellEnd"/>
+          <w:r>
+            <w:rPr>
+              <w:i/>
+              <w:iCs/>
+              <w:color w:val="000000"/>
+            </w:rPr>
+            <w:t xml:space="preserve"> </w:t>
+          </w:r>
+          <w:proofErr w:type="spellStart"/>
+          <w:r>
+            <w:rPr>
+              <w:i/>
+              <w:iCs/>
+              <w:color w:val="000000"/>
+            </w:rPr>
+            <w:t>Efficient</w:t>
+          </w:r>
+          <w:proofErr w:type="spellEnd"/>
+          <w:r>
+            <w:rPr>
+              <w:i/>
+              <w:iCs/>
+              <w:color w:val="000000"/>
+            </w:rPr>
+            <w:t xml:space="preserve"> </w:t>
+          </w:r>
+          <w:proofErr w:type="spellStart"/>
+          <w:r>
+            <w:rPr>
+              <w:i/>
+              <w:iCs/>
+              <w:color w:val="000000"/>
+            </w:rPr>
+            <w:t>Market</w:t>
+          </w:r>
+          <w:proofErr w:type="spellEnd"/>
+          <w:r>
+            <w:rPr>
+              <w:i/>
+              <w:iCs/>
+              <w:color w:val="000000"/>
+            </w:rPr>
+            <w:t xml:space="preserve"> </w:t>
+          </w:r>
+          <w:proofErr w:type="spellStart"/>
+          <w:r>
+            <w:rPr>
+              <w:i/>
+              <w:iCs/>
+              <w:color w:val="000000"/>
+            </w:rPr>
+            <w:t>Hypothesis</w:t>
+          </w:r>
+          <w:proofErr w:type="spellEnd"/>
+          <w:r>
+            <w:rPr>
+              <w:i/>
+              <w:iCs/>
+              <w:color w:val="000000"/>
+            </w:rPr>
+            <w:t xml:space="preserve"> and </w:t>
+          </w:r>
+          <w:proofErr w:type="spellStart"/>
+          <w:r>
+            <w:rPr>
+              <w:i/>
+              <w:iCs/>
+              <w:color w:val="000000"/>
+            </w:rPr>
+            <w:t>Its</w:t>
+          </w:r>
+          <w:proofErr w:type="spellEnd"/>
+          <w:r>
+            <w:rPr>
+              <w:i/>
+              <w:iCs/>
+              <w:color w:val="000000"/>
+            </w:rPr>
+            <w:t xml:space="preserve"> </w:t>
+          </w:r>
+          <w:proofErr w:type="spellStart"/>
+          <w:r>
+            <w:rPr>
+              <w:i/>
+              <w:iCs/>
+              <w:color w:val="000000"/>
+            </w:rPr>
+            <w:t>Critics</w:t>
+          </w:r>
+          <w:proofErr w:type="spellEnd"/>
+          <w:r>
+            <w:rPr>
+              <w:color w:val="000000"/>
+            </w:rPr>
+            <w:t>.</w:t>
+          </w:r>
+        </w:p>
+        <w:p>
+          <w:pPr>
+            <w:autoSpaceDE w:val="0"/>
+            <w:autoSpaceDN w:val="0"/>
+            <w:ind w:hanging="480"/>
+            <w:divId w:val="1715693371"/>
             <w:rPr>
               <w:color w:val="000000"/>
             </w:rPr>
@@ -5109,29 +5816,29 @@
           <w:docGrid w:linePitch="326"/>
         </w:sectPr>
       </w:pPr>
-      <w:bookmarkStart w:id="131" w:name="_Toc195670728"/>
-      <w:bookmarkStart w:id="132" w:name="_Toc195684476"/>
-      <w:bookmarkStart w:id="133" w:name="_Toc309047450"/>
-      <w:bookmarkStart w:id="134" w:name="_Toc309047496"/>
-      <w:bookmarkStart w:id="135" w:name="_Toc309047613"/>
+      <w:bookmarkStart w:id="144" w:name="_Toc195670728"/>
+      <w:bookmarkStart w:id="145" w:name="_Toc195684476"/>
+      <w:bookmarkStart w:id="146" w:name="_Toc309047450"/>
+      <w:bookmarkStart w:id="147" w:name="_Toc309047496"/>
+      <w:bookmarkStart w:id="148" w:name="_Toc309047613"/>
     </w:p>
     <w:p>
       <w:pPr>
         <w:pStyle w:val="Nadpis1"/>
       </w:pPr>
-      <w:bookmarkStart w:id="136" w:name="_Toc339279028"/>
-      <w:bookmarkStart w:id="137" w:name="_Toc227589992"/>
+      <w:bookmarkStart w:id="149" w:name="_Toc339279028"/>
+      <w:bookmarkStart w:id="150" w:name="_Toc230542226"/>
       <w:r>
         <w:lastRenderedPageBreak/>
         <w:t>Zoznam príloh</w:t>
       </w:r>
-      <w:bookmarkEnd w:id="131"/>
-      <w:bookmarkEnd w:id="132"/>
-      <w:bookmarkEnd w:id="133"/>
-      <w:bookmarkEnd w:id="134"/>
-      <w:bookmarkEnd w:id="135"/>
-      <w:bookmarkEnd w:id="136"/>
-      <w:bookmarkEnd w:id="137"/>
+      <w:bookmarkEnd w:id="144"/>
+      <w:bookmarkEnd w:id="145"/>
+      <w:bookmarkEnd w:id="146"/>
+      <w:bookmarkEnd w:id="147"/>
+      <w:bookmarkEnd w:id="148"/>
+      <w:bookmarkEnd w:id="149"/>
+      <w:bookmarkEnd w:id="150"/>
       <w:r>
         <w:t xml:space="preserve"> </w:t>
       </w:r>
@@ -9458,6 +10165,7 @@
   <w:style w:type="character" w:default="1" w:styleId="Predvolenpsmoodseku">
     <w:name w:val="Default Paragraph Font"/>
     <w:uiPriority w:val="1"/>
+    <w:semiHidden/>
     <w:unhideWhenUsed/>
   </w:style>
   <w:style w:type="table" w:default="1" w:styleId="Normlnatabuka">
@@ -10832,6 +11540,7 @@
     <w:rsid w:val="00164F01"/>
     <w:rsid w:val="004B68D7"/>
     <w:rsid w:val="005605F5"/>
+    <w:rsid w:val="00583A7E"/>
     <w:rsid w:val="005C3D30"/>
     <w:rsid w:val="00625F5B"/>
     <w:rsid w:val="00631B0A"/>
@@ -10839,6 +11548,7 @@
     <w:rsid w:val="00727177"/>
     <w:rsid w:val="008001EC"/>
     <w:rsid w:val="00894C30"/>
+    <w:rsid w:val="008D1844"/>
     <w:rsid w:val="00B4732D"/>
     <w:rsid w:val="00B8366B"/>
     <w:rsid w:val="00DA74A9"/>
@@ -11606,7 +12316,7 @@
 
 <file path=word/webextensions/taskpanes.xml><?xml version="1.0" encoding="utf-8"?>
 <wetp:taskpanes xmlns:wetp="http://schemas.microsoft.com/office/webextensions/taskpanes/2010/11">
-  <wetp:taskpane dockstate="right" visibility="0" width="408" row="0">
+  <wetp:taskpane dockstate="right" visibility="0" width="350" row="0">
     <wetp:webextensionref xmlns:r="http://schemas.openxmlformats.org/officeDocument/2006/relationships" r:id="rId1"/>
   </wetp:taskpane>
 </wetp:taskpanes>
@@ -11620,8 +12330,8 @@
   </we:alternateReferences>
   <we:properties>
     <we:property name="MENDELEY_BIBLIOGRAPHY_IS_DIRTY" value="false"/>
-    <we:property name="MENDELEY_BIBLIOGRAPHY_LAST_MODIFIED" value="1779477876594"/>
-    <we:property name="MENDELEY_CITATIONS" value="[{&quot;citationID&quot;:&quot;MENDELEY_CITATION_f445dcfc-da19-4caa-a8cf-57a7ddae45ee&quot;,&quot;properties&quot;:{&quot;noteIndex&quot;:0},&quot;isEdited&quot;:false,&quot;manualOverride&quot;:{&quot;isManuallyOverridden&quot;:false,&quot;citeprocText&quot;:&quot;(Hiransha et al., 2018)&quot;,&quot;manualOverrideText&quot;:&quot;&quot;},&quot;citationTag&quot;:&quot;MENDELEY_CITATION_v3_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&quot;,&quot;citationItems&quot;:[{&quot;id&quot;:&quot;9ccf1aa1-1254-3445-bb6e-4b633c72251a&quot;,&quot;itemData&quot;:{&quot;type&quot;:&quot;article-journal&quot;,&quot;id&quot;:&quot;9ccf1aa1-1254-3445-bb6e-4b633c72251a&quot;,&quot;title&quot;:&quot;NSE Stock Market Prediction Using Deep-Learning Models&quot;,&quot;groupId&quot;:&quot;092e372d-c067-3fdb-b3f7-8bafafb41bf5&quot;,&quot;author&quot;:[{&quot;family&quot;:&quot;Hiransha&quot;,&quot;given&quot;:&quot;M.&quot;,&quot;parse-names&quot;:false,&quot;dropping-particle&quot;:&quot;&quot;,&quot;non-dropping-particle&quot;:&quot;&quot;},{&quot;family&quot;:&quot;Gopalakrishnan&quot;,&quot;given&quot;:&quot;E. A.&quot;,&quot;parse-names&quot;:false,&quot;dropping-particle&quot;:&quot;&quot;,&quot;non-dropping-particle&quot;:&quot;&quot;},{&quot;family&quot;:&quot;Menon&quot;,&quot;given&quot;:&quot;Vijay Krishna&quot;,&quot;parse-names&quot;:false,&quot;dropping-particle&quot;:&quot;&quot;,&quot;non-dropping-particle&quot;:&quot;&quot;},{&quot;family&quot;:&quot;Soman&quot;,&quot;given&quot;:&quot;K. P.&quot;,&quot;parse-names&quot;:false,&quot;dropping-particle&quot;:&quot;&quot;,&quot;non-dropping-particle&quot;:&quot;&quot;}],&quot;container-title&quot;:&quot;Procedia Computer Science&quot;,&quot;container-title-short&quot;:&quot;Procedia Comput. Sci.&quot;,&quot;accessed&quot;:{&quot;date-parts&quot;:[[2026,4,29]]},&quot;DOI&quot;:&quot;10.1016/J.PROCS.2018.05.050&quot;,&quot;ISSN&quot;:&quot;1877-0509&quot;,&quot;URL&quot;:&quot;https://www.sciencedirect.com/science/article/pii/S1877050918307828?__cf_chl_tk=U6TCZCqvcyilUU41dh9Js8Ok4cjhAILJlEgc7461JYI-1777485243-1.0.1.1-4saQUybIPsAqa1ar0sQkWKp3rALtB.LEV6dh_t_it.k&quot;,&quot;issued&quot;:{&quot;date-parts&quot;:[[2018,1,1]]},&quot;page&quot;:&quot;1351-1362&quot;,&quot;abstract&quot;:&quot;The neural network, one of the intelligent data mining technique that has been used by researchers in various areas for the past 10 years. Prediction and analysis of stock market data have got an important role in today's economy. The various algorithms used for forecasting can be categorized into linear (AR, MA, ARIMA, ARMA) and non-linear models (ARCH, GARCH, Neural Network). In this paper, we are using four types of deep learning architectures i.e Multilayer Perceptron (MLP), Recurrent Neural Networks (RNN), Long Short-Term Memory (LSTM) and Convolutional Neural Network (CNN) for predicting the stock price of a company based on the historical prices available. Here we are using day-wise closing price of two different stock markets, National Stock Exchange (NSE) of India and New York Stock Exchange (NYSE). The network was trained with the stock price of a single company from NSE and predicted for five different companies from both NSE and NYSE. It has been observed that CNN is outperforming the other models. The network was able to predict for NYSE even though it was trained with NSE data. This was possible because both the stock markets share some common inner dynamics. The results obtained were com- pared with ARIMA model and it has been observed that the neural networks are outperforming the existing linear model (ARIMA).&quot;,&quot;publisher&quot;:&quot;Elsevier&quot;,&quot;volume&quot;:&quot;132&quot;},&quot;isTemporary&quot;:false}]},{&quot;citationID&quot;:&quot;MENDELEY_CITATION_53ec8ca4-926d-45ce-9e2b-95b029699543&quot;,&quot;properties&quot;:{&quot;noteIndex&quot;:0},&quot;isEdited&quot;:false,&quot;manualOverride&quot;:{&quot;isManuallyOverridden&quot;:false,&quot;citeprocText&quot;:&quot;(Fama, 1970)&quot;,&quot;manualOverrideText&quot;:&quot;&quot;},&quot;citationTag&quot;:&quot;MENDELEY_CITATION_v3_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&quot;,&quot;citationItems&quot;:[{&quot;id&quot;:&quot;091e2749-aa60-3c2d-9cc3-1cdad11b5547&quot;,&quot;itemData&quot;:{&quot;type&quot;:&quot;article-journal&quot;,&quot;id&quot;:&quot;091e2749-aa60-3c2d-9cc3-1cdad11b5547&quot;,&quot;title&quot;:&quot;Efficient Capital Markets: A Review of Theory and Empirical Work&quot;,&quot;groupId&quot;:&quot;092e372d-c067-3fdb-b3f7-8bafafb41bf5&quot;,&quot;author&quot;:[{&quot;family&quot;:&quot;Fama&quot;,&quot;given&quot;:&quot;Eugene F.&quot;,&quot;parse-names&quot;:false,&quot;dropping-particle&quot;:&quot;&quot;,&quot;non-dropping-particle&quot;:&quot;&quot;}],&quot;container-title&quot;:&quot;The Journal of Finance&quot;,&quot;container-title-short&quot;:&quot;J. Finance&quot;,&quot;accessed&quot;:{&quot;date-parts&quot;:[[2026,4,29]]},&quot;DOI&quot;:&quot;10.2307/2325486&quot;,&quot;ISSN&quot;:&quot;00221082&quot;,&quot;issued&quot;:{&quot;date-parts&quot;:[[1970,5]]},&quot;page&quot;:&quot;383&quot;,&quot;abstract&quot;:&quot;N/A&quot;,&quot;publisher&quot;:&quot;JSTOR&quot;,&quot;issue&quot;:&quot;2&quot;,&quot;volume&quot;:&quot;25&quot;},&quot;isTemporary&quot;:false}]},{&quot;citationID&quot;:&quot;MENDELEY_CITATION_d73ada41-befa-4e0f-90bd-ae86af98ec82&quot;,&quot;properties&quot;:{&quot;noteIndex&quot;:0},&quot;isEdited&quot;:false,&quot;manualOverride&quot;:{&quot;isManuallyOverridden&quot;:false,&quot;citeprocText&quot;:&quot;(Malkiel, 2003)&quot;,&quot;manualOverrideText&quot;:&quot;&quot;},&quot;citationTag&quot;:&quot;MENDELEY_CITATION_v3_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&quot;,&quot;citationItems&quot;:[{&quot;id&quot;:&quot;1e3d3c72-ca45-32d2-ac4d-18f479bf6e02&quot;,&quot;itemData&quot;:{&quot;type&quot;:&quot;article-journal&quot;,&quot;id&quot;:&quot;1e3d3c72-ca45-32d2-ac4d-18f479bf6e02&quot;,&quot;title&quot;:&quot;The Efficient Market Hypothesis and Its Critics&quot;,&quot;groupId&quot;:&quot;092e372d-c067-3fdb-b3f7-8bafafb41bf5&quot;,&quot;author&quot;:[{&quot;family&quot;:&quot;Malkiel&quot;,&quot;given&quot;:&quot;Burton G&quot;,&quot;parse-names&quot;:false,&quot;dropping-particle&quot;:&quot;&quot;,&quot;non-dropping-particle&quot;:&quot;&quot;}],&quot;accessed&quot;:{&quot;date-parts&quot;:[[2026,4,29]]},&quot;issued&quot;:{&quot;date-parts&quot;:[[2003]]}},&quot;isTemporary&quot;:false}]},{&quot;citationID&quot;:&quot;MENDELEY_CITATION_d823a6e8-196a-49b3-bcc2-27a9685af0e9&quot;,&quot;properties&quot;:{&quot;noteIndex&quot;:0},&quot;isEdited&quot;:false,&quot;manualOverride&quot;:{&quot;isManuallyOverridden&quot;:false,&quot;citeprocText&quot;:&quot;(Levine &amp;#38; Zervos, 1996)&quot;,&quot;manualOverrideText&quot;:&quot;&quot;},&quot;citationTag&quot;:&quot;MENDELEY_CITATION_v3_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&quot;,&quot;citationItems&quot;:[{&quot;id&quot;:&quot;c54459cf-ae7c-3a20-8e06-1752f7983a75&quot;,&quot;itemData&quot;:{&quot;type&quot;:&quot;article-journal&quot;,&quot;id&quot;:&quot;c54459cf-ae7c-3a20-8e06-1752f7983a75&quot;,&quot;title&quot;:&quot;Stock Market Development and Long-Run Growth&quot;,&quot;groupId&quot;:&quot;092e372d-c067-3fdb-b3f7-8bafafb41bf5&quot;,&quot;author&quot;:[{&quot;family&quot;:&quot;Levine&quot;,&quot;given&quot;:&quot;Ross&quot;,&quot;parse-names&quot;:false,&quot;dropping-particle&quot;:&quot;&quot;,&quot;non-dropping-particle&quot;:&quot;&quot;},{&quot;family&quot;:&quot;Zervos&quot;,&quot;given&quot;:&quot;Sara&quot;,&quot;parse-names&quot;:false,&quot;dropping-particle&quot;:&quot;&quot;,&quot;non-dropping-particle&quot;:&quot;&quot;}],&quot;container-title&quot;:&quot;The World Bank Economic Review&quot;,&quot;container-title-short&quot;:&quot;World Bank Econ. Rev.&quot;,&quot;accessed&quot;:{&quot;date-parts&quot;:[[2026,5,6]]},&quot;DOI&quot;:&quot;10.1093/WBER/10.2.323&quot;,&quot;ISSN&quot;:&quot;0258-6770&quot;,&quot;URL&quot;:&quot;https://dx.doi.org/10.1093/wber/10.2.323&quot;,&quot;issued&quot;:{&quot;date-parts&quot;:[[1996,5,1]]},&quot;page&quot;:&quot;323-339&quot;,&quot;abstract&quot;:&quot;Is the financial system important for economic growth? One line of research argues that it is not; another line stresses the importance of the financial system in mobilizing savings, allocating capital, exerting corporate control, and easing risk management. Moreover, some theories provide a conceptual basis for the belief that larger, more efficient stock markets boost economic growth. This article examines whether there is a strong empirical association between stock market development and long-run economic growth. Cross-country growth regressions suggest that the predeter-mined component of stock market development is positively and robustly associated with long-run economic growth.&quot;,&quot;publisher&quot;:&quot;Oxford Academic&quot;,&quot;issue&quot;:&quot;2&quot;,&quot;volume&quot;:&quot;10&quot;},&quot;isTemporary&quot;:false}]},{&quot;citationID&quot;:&quot;MENDELEY_CITATION_597f96f4-553a-44a2-8dd3-addebd32ee68&quot;,&quot;properties&quot;:{&quot;noteIndex&quot;:0},&quot;isEdited&quot;:false,&quot;manualOverride&quot;:{&quot;isManuallyOverridden&quot;:false,&quot;citeprocText&quot;:&quot;(Levine &amp;#38; Zervos, 1996)&quot;,&quot;manualOverrideText&quot;:&quot;&quot;},&quot;citationTag&quot;:&quot;MENDELEY_CITATION_v3_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&quot;,&quot;citationItems&quot;:[{&quot;id&quot;:&quot;c54459cf-ae7c-3a20-8e06-1752f7983a75&quot;,&quot;itemData&quot;:{&quot;type&quot;:&quot;article-journal&quot;,&quot;id&quot;:&quot;c54459cf-ae7c-3a20-8e06-1752f7983a75&quot;,&quot;title&quot;:&quot;Stock Market Development and Long-Run Growth&quot;,&quot;groupId&quot;:&quot;092e372d-c067-3fdb-b3f7-8bafafb41bf5&quot;,&quot;author&quot;:[{&quot;family&quot;:&quot;Levine&quot;,&quot;given&quot;:&quot;Ross&quot;,&quot;parse-names&quot;:false,&quot;dropping-particle&quot;:&quot;&quot;,&quot;non-dropping-particle&quot;:&quot;&quot;},{&quot;family&quot;:&quot;Zervos&quot;,&quot;given&quot;:&quot;Sara&quot;,&quot;parse-names&quot;:false,&quot;dropping-particle&quot;:&quot;&quot;,&quot;non-dropping-particle&quot;:&quot;&quot;}],&quot;container-title&quot;:&quot;The World Bank Economic Review&quot;,&quot;container-title-short&quot;:&quot;World Bank Econ. Rev.&quot;,&quot;accessed&quot;:{&quot;date-parts&quot;:[[2026,5,6]]},&quot;DOI&quot;:&quot;10.1093/WBER/10.2.323&quot;,&quot;ISSN&quot;:&quot;0258-6770&quot;,&quot;URL&quot;:&quot;https://dx.doi.org/10.1093/wber/10.2.323&quot;,&quot;issued&quot;:{&quot;date-parts&quot;:[[1996,5,1]]},&quot;page&quot;:&quot;323-339&quot;,&quot;abstract&quot;:&quot;Is the financial system important for economic growth? One line of research argues that it is not; another line stresses the importance of the financial system in mobilizing savings, allocating capital, exerting corporate control, and easing risk management. Moreover, some theories provide a conceptual basis for the belief that larger, more efficient stock markets boost economic growth. This article examines whether there is a strong empirical association between stock market development and long-run economic growth. Cross-country growth regressions suggest that the predeter-mined component of stock market development is positively and robustly associated with long-run economic growth.&quot;,&quot;publisher&quot;:&quot;Oxford Academic&quot;,&quot;issue&quot;:&quot;2&quot;,&quot;volume&quot;:&quot;10&quot;},&quot;isTemporary&quot;:false}]},{&quot;citationID&quot;:&quot;MENDELEY_CITATION_aa2b6abc-95eb-4667-801f-e1b162858949&quot;,&quot;properties&quot;:{&quot;noteIndex&quot;:0},&quot;isEdited&quot;:false,&quot;manualOverride&quot;:{&quot;isManuallyOverridden&quot;:false,&quot;citeprocText&quot;:&quot;(Shah et al., 2019)&quot;,&quot;manualOverrideText&quot;:&quot;&quot;},&quot;citationTag&quot;:&quot;MENDELEY_CITATION_v3_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&quot;,&quot;citationItems&quot;:[{&quot;id&quot;:&quot;8d1a3d32-6c56-311b-80d4-9313558321ef&quot;,&quot;itemData&quot;:{&quot;type&quot;:&quot;article-journal&quot;,&quot;id&quot;:&quot;8d1a3d32-6c56-311b-80d4-9313558321ef&quot;,&quot;title&quot;:&quot;Stock Market Analysis: A Review and Taxonomy of Prediction Techniques&quot;,&quot;groupId&quot;:&quot;092e372d-c067-3fdb-b3f7-8bafafb41bf5&quot;,&quot;author&quot;:[{&quot;family&quot;:&quot;Shah&quot;,&quot;given&quot;:&quot;Dev&quot;,&quot;parse-names&quot;:false,&quot;dropping-particle&quot;:&quot;&quot;,&quot;non-dropping-particle&quot;:&quot;&quot;},{&quot;family&quot;:&quot;Isah&quot;,&quot;given&quot;:&quot;Haruna&quot;,&quot;parse-names&quot;:false,&quot;dropping-particle&quot;:&quot;&quot;,&quot;non-dropping-particle&quot;:&quot;&quot;},{&quot;family&quot;:&quot;Zulkernine&quot;,&quot;given&quot;:&quot;Farhana&quot;,&quot;parse-names&quot;:false,&quot;dropping-particle&quot;:&quot;&quot;,&quot;non-dropping-particle&quot;:&quot;&quot;}],&quot;container-title&quot;:&quot;International Journal of Financial Studies 2019, Vol. 7, Page 26&quot;,&quot;accessed&quot;:{&quot;date-parts&quot;:[[2026,4,29]]},&quot;DOI&quot;:&quot;10.3390/IJFS7020026&quot;,&quot;ISSN&quot;:&quot;2227-7072&quot;,&quot;URL&quot;:&quot;https://www.mdpi.com/2227-7072/7/2/26/htm&quot;,&quot;issued&quot;:{&quot;date-parts&quot;:[[2019,5,27]]},&quot;page&quot;:&quot;26&quot;,&quot;abstract&quot;:&quot;Stock market prediction has always caught the attention of many analysts and researchers. Popular theories suggest that stock markets are essentially a random walk and it is a fool’s game to try and predict them. Predicting stock prices is a challenging problem in itself because of the number of variables which are involved. In the short term, the market behaves like a voting machine but in the longer term, it acts like a weighing machine and hence there is scope for predicting the market movements for a longer timeframe. Application of machine learning techniques and other algorithms for stock price analysis and forecasting is an area that shows great promise. In this paper, we first provide a concise review of stock markets and taxonomy of stock market prediction methods. We then focus on some of the research achievements in stock analysis and prediction. We discuss technical, fundamental, short- and long-term approaches used for stock analysis. Finally, we present some challenges and research opportunities in this field.&quot;,&quot;publisher&quot;:&quot;Multidisciplinary Digital Publishing Institute&quot;,&quot;issue&quot;:&quot;2&quot;,&quot;volume&quot;:&quot;7&quot;},&quot;isTemporary&quot;:false}]},{&quot;citationID&quot;:&quot;MENDELEY_CITATION_3f021c6d-2661-4bb4-9f03-f17b1b7e7780&quot;,&quot;properties&quot;:{&quot;noteIndex&quot;:0},&quot;isEdited&quot;:false,&quot;manualOverride&quot;:{&quot;isManuallyOverridden&quot;:false,&quot;citeprocText&quot;:&quot;(Shah et al., 2019)&quot;,&quot;manualOverrideText&quot;:&quot;&quot;},&quot;citationTag&quot;:&quot;MENDELEY_CITATION_v3_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&quot;,&quot;citationItems&quot;:[{&quot;id&quot;:&quot;8d1a3d32-6c56-311b-80d4-9313558321ef&quot;,&quot;itemData&quot;:{&quot;type&quot;:&quot;article-journal&quot;,&quot;id&quot;:&quot;8d1a3d32-6c56-311b-80d4-9313558321ef&quot;,&quot;title&quot;:&quot;Stock Market Analysis: A Review and Taxonomy of Prediction Techniques&quot;,&quot;groupId&quot;:&quot;092e372d-c067-3fdb-b3f7-8bafafb41bf5&quot;,&quot;author&quot;:[{&quot;family&quot;:&quot;Shah&quot;,&quot;given&quot;:&quot;Dev&quot;,&quot;parse-names&quot;:false,&quot;dropping-particle&quot;:&quot;&quot;,&quot;non-dropping-particle&quot;:&quot;&quot;},{&quot;family&quot;:&quot;Isah&quot;,&quot;given&quot;:&quot;Haruna&quot;,&quot;parse-names&quot;:false,&quot;dropping-particle&quot;:&quot;&quot;,&quot;non-dropping-particle&quot;:&quot;&quot;},{&quot;family&quot;:&quot;Zulkernine&quot;,&quot;given&quot;:&quot;Farhana&quot;,&quot;parse-names&quot;:false,&quot;dropping-particle&quot;:&quot;&quot;,&quot;non-dropping-particle&quot;:&quot;&quot;}],&quot;container-title&quot;:&quot;International Journal of Financial Studies 2019, Vol. 7, Page 26&quot;,&quot;accessed&quot;:{&quot;date-parts&quot;:[[2026,4,29]]},&quot;DOI&quot;:&quot;10.3390/IJFS7020026&quot;,&quot;ISSN&quot;:&quot;2227-7072&quot;,&quot;URL&quot;:&quot;https://www.mdpi.com/2227-7072/7/2/26/htm&quot;,&quot;issued&quot;:{&quot;date-parts&quot;:[[2019,5,27]]},&quot;page&quot;:&quot;26&quot;,&quot;abstract&quot;:&quot;Stock market prediction has always caught the attention of many analysts and researchers. Popular theories suggest that stock markets are essentially a random walk and it is a fool’s game to try and predict them. Predicting stock prices is a challenging problem in itself because of the number of variables which are involved. In the short term, the market behaves like a voting machine but in the longer term, it acts like a weighing machine and hence there is scope for predicting the market movements for a longer timeframe. Application of machine learning techniques and other algorithms for stock price analysis and forecasting is an area that shows great promise. In this paper, we first provide a concise review of stock markets and taxonomy of stock market prediction methods. We then focus on some of the research achievements in stock analysis and prediction. We discuss technical, fundamental, short- and long-term approaches used for stock analysis. Finally, we present some challenges and research opportunities in this field.&quot;,&quot;publisher&quot;:&quot;Multidisciplinary Digital Publishing Institute&quot;,&quot;issue&quot;:&quot;2&quot;,&quot;volume&quot;:&quot;7&quot;},&quot;isTemporary&quot;:false}]},{&quot;citationID&quot;:&quot;MENDELEY_CITATION_561b67f2-970f-4c32-bc18-f820a0e31dc7&quot;,&quot;properties&quot;:{&quot;noteIndex&quot;:0},&quot;isEdited&quot;:false,&quot;manualOverride&quot;:{&quot;isManuallyOverridden&quot;:false,&quot;citeprocText&quot;:&quot;(Bhowmik &amp;#38; Wang, 2020)&quot;,&quot;manualOverrideText&quot;:&quot;&quot;},&quot;citationTag&quot;:&quot;MENDELEY_CITATION_v3_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&quot;,&quot;citationItems&quot;:[{&quot;id&quot;:&quot;a64d61c2-6b38-3b78-8425-22fba9109072&quot;,&quot;itemData&quot;:{&quot;type&quot;:&quot;article-journal&quot;,&quot;id&quot;:&quot;a64d61c2-6b38-3b78-8425-22fba9109072&quot;,&quot;title&quot;:&quot;Stock Market Volatility and Return Analysis: A Systematic Literature Review&quot;,&quot;groupId&quot;:&quot;092e372d-c067-3fdb-b3f7-8bafafb41bf5&quot;,&quot;author&quot;:[{&quot;family&quot;:&quot;Bhowmik&quot;,&quot;given&quot;:&quot;Roni&quot;,&quot;parse-names&quot;:false,&quot;dropping-particle&quot;:&quot;&quot;,&quot;non-dropping-particle&quot;:&quot;&quot;},{&quot;family&quot;:&quot;Wang&quot;,&quot;given&quot;:&quot;Shouyang&quot;,&quot;parse-names&quot;:false,&quot;dropping-particle&quot;:&quot;&quot;,&quot;non-dropping-particle&quot;:&quot;&quot;}],&quot;container-title&quot;:&quot;Entropy&quot;,&quot;accessed&quot;:{&quot;date-parts&quot;:[[2026,5,11]]},&quot;DOI&quot;:&quot;10.3390/E22050522&quot;,&quot;ISSN&quot;:&quot;10994300&quot;,&quot;PMID&quot;:&quot;33286294&quot;,&quot;URL&quot;:&quot;https://pmc.ncbi.nlm.nih.gov/articles/PMC7517016/&quot;,&quot;issued&quot;:{&quot;date-parts&quot;:[[2020,5,1]]},&quot;page&quot;:&quot;522&quot;,&quot;abstract&quot;:&quot;In the field of business research method, a literature review is more relevant than ever. Even though there has been lack of integrity and inflexibility in traditional literature reviews with questions being raised about the quality and trustworthiness of these types of reviews. This research provides a literature review using a systematic database to examine and cross-reference snowballing. In this paper, previous studies featuring a generalized autoregressive conditional heteroskedastic (GARCH) family-based model stock market return and volatility have also been reviewed. The stock market plays a pivotal role in today's world economic activities, named a \&quot;barometer\&quot; and \&quot;alarm\&quot; for economic and financial activities in a country or region. In order to prevent uncertainty and risk in the stock market, it is particularly important to measure effectively the volatility of stock index returns. However, the main purpose of this review is to examine effective GARCH models recommended for performing market returns and volatilities analysis. The secondary purpose of this review study is to conduct a content analysis of return and volatility literature reviews over a period of 12 years (2008-2019) and in 50 different papers. The study found that there has been a significant change in research work within the past 10 years and most of researchers have worked for developing stock markets.&quot;,&quot;publisher&quot;:&quot;MDPI AG&quot;,&quot;issue&quot;:&quot;5&quot;,&quot;volume&quot;:&quot;22&quot;},&quot;isTemporary&quot;:false}]},{&quot;citationID&quot;:&quot;MENDELEY_CITATION_fbdf081d-acc2-4588-a10c-c38ca93b777b&quot;,&quot;properties&quot;:{&quot;noteIndex&quot;:0},&quot;isEdited&quot;:false,&quot;manualOverride&quot;:{&quot;isManuallyOverridden&quot;:false,&quot;citeprocText&quot;:&quot;(Granger &amp;#38; Poon, 2002)&quot;,&quot;manualOverrideText&quot;:&quot;&quot;},&quot;citationTag&quot;:&quot;MENDELEY_CITATION_v3_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&quot;,&quot;citationItems&quot;:[{&quot;id&quot;:&quot;b3fac26e-02d5-3c65-b1ac-9b1261682811&quot;,&quot;itemData&quot;:{&quot;type&quot;:&quot;article-journal&quot;,&quot;id&quot;:&quot;b3fac26e-02d5-3c65-b1ac-9b1261682811&quot;,&quot;title&quot;:&quot;Forecasting Volatility in Financial Markets: A Review (Revised Edition)&quot;,&quot;groupId&quot;:&quot;092e372d-c067-3fdb-b3f7-8bafafb41bf5&quot;,&quot;author&quot;:[{&quot;family&quot;:&quot;Granger&quot;,&quot;given&quot;:&quot;Clive W. J.&quot;,&quot;parse-names&quot;:false,&quot;dropping-particle&quot;:&quot;&quot;,&quot;non-dropping-particle&quot;:&quot;&quot;},{&quot;family&quot;:&quot;Poon&quot;,&quot;given&quot;:&quot;Ser-Huang&quot;,&quot;parse-names&quot;:false,&quot;dropping-particle&quot;:&quot;&quot;,&quot;non-dropping-particle&quot;:&quot;&quot;}],&quot;container-title&quot;:&quot;SSRN Electronic Journal&quot;,&quot;accessed&quot;:{&quot;date-parts&quot;:[[2026,5,11]]},&quot;DOI&quot;:&quot;10.2139/SSRN.331800&quot;,&quot;URL&quot;:&quot;https://papers.ssrn.com/abstract=331800&quot;,&quot;issued&quot;:{&quot;date-parts&quot;:[[2002,9,18]]},&quot;abstract&quot;:&quot;Financial market volatility is an important input for investment, option pricing and financial market regulation. In this review article, we compare the volatility forecasting findings in 93 papers published and written in the last two decades. This article is written for general readers in Economics, and its emphasis is on forecasting instead of modelling. We separate the literature into two main streams; the first consists of research papers that formulate volatility forecasts based on historical price information only, while the second includes research papers that make use of volatility implied in option prices.    Provided in this paper as well are volatility definitions, insights into problematic issues of forecast evaluation, the effect of data frequency on volatility forecast accuracy, measurement of \&quot;actual\&quot; volatility, and the confounding effect of extreme values on volatility forecasting performance. We compare volatility forecasting results across different asset classes, and markets in different geographical regions. Suggestions are made for future research.&quot;,&quot;publisher&quot;:&quot;Elsevier BV&quot;},&quot;isTemporary&quot;:false}]},{&quot;citationID&quot;:&quot;MENDELEY_CITATION_9e6b5f0d-12ef-4c86-8dfe-a3a2121b613b&quot;,&quot;properties&quot;:{&quot;noteIndex&quot;:0},&quot;isEdited&quot;:false,&quot;manualOverride&quot;:{&quot;isManuallyOverridden&quot;:false,&quot;citeprocText&quot;:&quot;(Granger &amp;#38; Poon, 2002)&quot;,&quot;manualOverrideText&quot;:&quot;&quot;},&quot;citationTag&quot;:&quot;MENDELEY_CITATION_v3_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&quot;,&quot;citationItems&quot;:[{&quot;id&quot;:&quot;b3fac26e-02d5-3c65-b1ac-9b1261682811&quot;,&quot;itemData&quot;:{&quot;type&quot;:&quot;article-journal&quot;,&quot;id&quot;:&quot;b3fac26e-02d5-3c65-b1ac-9b1261682811&quot;,&quot;title&quot;:&quot;Forecasting Volatility in Financial Markets: A Review (Revised Edition)&quot;,&quot;groupId&quot;:&quot;092e372d-c067-3fdb-b3f7-8bafafb41bf5&quot;,&quot;author&quot;:[{&quot;family&quot;:&quot;Granger&quot;,&quot;given&quot;:&quot;Clive W. J.&quot;,&quot;parse-names&quot;:false,&quot;dropping-particle&quot;:&quot;&quot;,&quot;non-dropping-particle&quot;:&quot;&quot;},{&quot;family&quot;:&quot;Poon&quot;,&quot;given&quot;:&quot;Ser-Huang&quot;,&quot;parse-names&quot;:false,&quot;dropping-particle&quot;:&quot;&quot;,&quot;non-dropping-particle&quot;:&quot;&quot;}],&quot;container-title&quot;:&quot;SSRN Electronic Journal&quot;,&quot;accessed&quot;:{&quot;date-parts&quot;:[[2026,5,11]]},&quot;DOI&quot;:&quot;10.2139/SSRN.331800&quot;,&quot;URL&quot;:&quot;https://papers.ssrn.com/abstract=331800&quot;,&quot;issued&quot;:{&quot;date-parts&quot;:[[2002,9,18]]},&quot;abstract&quot;:&quot;Financial market volatility is an important input for investment, option pricing and financial market regulation. In this review article, we compare the volatility forecasting findings in 93 papers published and written in the last two decades. This article is written for general readers in Economics, and its emphasis is on forecasting instead of modelling. We separate the literature into two main streams; the first consists of research papers that formulate volatility forecasts based on historical price information only, while the second includes research papers that make use of volatility implied in option prices.    Provided in this paper as well are volatility definitions, insights into problematic issues of forecast evaluation, the effect of data frequency on volatility forecast accuracy, measurement of \&quot;actual\&quot; volatility, and the confounding effect of extreme values on volatility forecasting performance. We compare volatility forecasting results across different asset classes, and markets in different geographical regions. Suggestions are made for future research.&quot;,&quot;publisher&quot;:&quot;Elsevier BV&quot;},&quot;isTemporary&quot;:false}]},{&quot;citationID&quot;:&quot;MENDELEY_CITATION_ab1897df-4cb5-40ff-b6ac-23f8a1686409&quot;,&quot;properties&quot;:{&quot;noteIndex&quot;:0},&quot;isEdited&quot;:false,&quot;manualOverride&quot;:{&quot;isManuallyOverridden&quot;:false,&quot;citeprocText&quot;:&quot;(Degiannakis &amp;#38; Xekalaki, 2004)&quot;,&quot;manualOverrideText&quot;:&quot;&quot;},&quot;citationTag&quot;:&quot;MENDELEY_CITATION_v3_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&quot;,&quot;citationItems&quot;:[{&quot;id&quot;:&quot;e7aa9298-cd46-3749-b86d-5b0b63c1d98e&quot;,&quot;itemData&quot;:{&quot;type&quot;:&quot;article-journal&quot;,&quot;id&quot;:&quot;e7aa9298-cd46-3749-b86d-5b0b63c1d98e&quot;,&quot;title&quot;:&quot;Autoregressive Conditional Heteroscedasticity (ARCH) Models: A Review&quot;,&quot;groupId&quot;:&quot;092e372d-c067-3fdb-b3f7-8bafafb41bf5&quot;,&quot;author&quot;:[{&quot;family&quot;:&quot;Degiannakis&quot;,&quot;given&quot;:&quot;Stavros&quot;,&quot;parse-names&quot;:false,&quot;dropping-particle&quot;:&quot;&quot;,&quot;non-dropping-particle&quot;:&quot;&quot;},{&quot;family&quot;:&quot;Xekalaki&quot;,&quot;given&quot;:&quot;Evdokia&quot;,&quot;parse-names&quot;:false,&quot;dropping-particle&quot;:&quot;&quot;,&quot;non-dropping-particle&quot;:&quot;&quot;}],&quot;container-title&quot;:&quot;Quality Technology &amp; Quantitative Management&quot;,&quot;container-title-short&quot;:&quot;Qual. Technol. Quant. Manag.&quot;,&quot;accessed&quot;:{&quot;date-parts&quot;:[[2026,5,22]]},&quot;DOI&quot;:&quot;10.1080/16843703.2004.11673078&quot;,&quot;URL&quot;:&quot;https://www.tandfonline.com/doi/abs/10.1080/16843703.2004.11673078&quot;,&quot;issued&quot;:{&quot;date-parts&quot;:[[2004,1]]},&quot;page&quot;:&quot;271-324&quot;,&quot;abstract&quot;:&quot;Autoregressive Conditional Heteroscedasticity (ARCH) models have successfully been employed in order to predict asset return volatility. Predicting volatility is of great importance in pricing financial derivatives, selecting portfolios, measuring and managing investment risk more accurately. In this paper, a number of univariate and multivariate ARCH models, their estimating methods and the characteristics of financial time series, which are captured by volatility models, are presented. The number of possible conditional volatility formulations is vast. Therefore, a systematic presentation of the models that have been considered in the ARCH literature can be useful in guiding one's choice of a model for exploiting future volatility, with applications in financial markets.&quot;,&quot;publisher&quot;:&quot;Taylor &amp; Francis&quot;,&quot;issue&quot;:&quot;2&quot;,&quot;volume&quot;:&quot;1&quot;},&quot;isTemporary&quot;:false}]}]"/>
+    <we:property name="MENDELEY_BIBLIOGRAPHY_LAST_MODIFIED" value="1779643605756"/>
+    <we:property name="MENDELEY_CITATIONS" value="[{&quot;citationID&quot;:&quot;MENDELEY_CITATION_f445dcfc-da19-4caa-a8cf-57a7ddae45ee&quot;,&quot;properties&quot;:{&quot;noteIndex&quot;:0},&quot;isEdited&quot;:false,&quot;manualOverride&quot;:{&quot;isManuallyOverridden&quot;:false,&quot;citeprocText&quot;:&quot;(Hiransha et al., 2018)&quot;,&quot;manualOverrideText&quot;:&quot;&quot;},&quot;citationTag&quot;:&quot;MENDELEY_CITATION_v3_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&quot;,&quot;citationItems&quot;:[{&quot;id&quot;:&quot;9ccf1aa1-1254-3445-bb6e-4b633c72251a&quot;,&quot;itemData&quot;:{&quot;type&quot;:&quot;article-journal&quot;,&quot;id&quot;:&quot;9ccf1aa1-1254-3445-bb6e-4b633c72251a&quot;,&quot;title&quot;:&quot;NSE Stock Market Prediction Using Deep-Learning Models&quot;,&quot;groupId&quot;:&quot;092e372d-c067-3fdb-b3f7-8bafafb41bf5&quot;,&quot;author&quot;:[{&quot;family&quot;:&quot;Hiransha&quot;,&quot;given&quot;:&quot;M.&quot;,&quot;parse-names&quot;:false,&quot;dropping-particle&quot;:&quot;&quot;,&quot;non-dropping-particle&quot;:&quot;&quot;},{&quot;family&quot;:&quot;Gopalakrishnan&quot;,&quot;given&quot;:&quot;E. A.&quot;,&quot;parse-names&quot;:false,&quot;dropping-particle&quot;:&quot;&quot;,&quot;non-dropping-particle&quot;:&quot;&quot;},{&quot;family&quot;:&quot;Menon&quot;,&quot;given&quot;:&quot;Vijay Krishna&quot;,&quot;parse-names&quot;:false,&quot;dropping-particle&quot;:&quot;&quot;,&quot;non-dropping-particle&quot;:&quot;&quot;},{&quot;family&quot;:&quot;Soman&quot;,&quot;given&quot;:&quot;K. P.&quot;,&quot;parse-names&quot;:false,&quot;dropping-particle&quot;:&quot;&quot;,&quot;non-dropping-particle&quot;:&quot;&quot;}],&quot;container-title&quot;:&quot;Procedia Computer Science&quot;,&quot;container-title-short&quot;:&quot;Procedia Comput. Sci.&quot;,&quot;accessed&quot;:{&quot;date-parts&quot;:[[2026,4,29]]},&quot;DOI&quot;:&quot;10.1016/J.PROCS.2018.05.050&quot;,&quot;ISSN&quot;:&quot;1877-0509&quot;,&quot;URL&quot;:&quot;https://www.sciencedirect.com/science/article/pii/S1877050918307828?__cf_chl_tk=U6TCZCqvcyilUU41dh9Js8Ok4cjhAILJlEgc7461JYI-1777485243-1.0.1.1-4saQUybIPsAqa1ar0sQkWKp3rALtB.LEV6dh_t_it.k&quot;,&quot;issued&quot;:{&quot;date-parts&quot;:[[2018,1,1]]},&quot;page&quot;:&quot;1351-1362&quot;,&quot;abstract&quot;:&quot;The neural network, one of the intelligent data mining technique that has been used by researchers in various areas for the past 10 years. Prediction and analysis of stock market data have got an important role in today's economy. The various algorithms used for forecasting can be categorized into linear (AR, MA, ARIMA, ARMA) and non-linear models (ARCH, GARCH, Neural Network). In this paper, we are using four types of deep learning architectures i.e Multilayer Perceptron (MLP), Recurrent Neural Networks (RNN), Long Short-Term Memory (LSTM) and Convolutional Neural Network (CNN) for predicting the stock price of a company based on the historical prices available. Here we are using day-wise closing price of two different stock markets, National Stock Exchange (NSE) of India and New York Stock Exchange (NYSE). The network was trained with the stock price of a single company from NSE and predicted for five different companies from both NSE and NYSE. It has been observed that CNN is outperforming the other models. The network was able to predict for NYSE even though it was trained with NSE data. This was possible because both the stock markets share some common inner dynamics. The results obtained were com- pared with ARIMA model and it has been observed that the neural networks are outperforming the existing linear model (ARIMA).&quot;,&quot;publisher&quot;:&quot;Elsevier&quot;,&quot;volume&quot;:&quot;132&quot;},&quot;isTemporary&quot;:false}]},{&quot;citationID&quot;:&quot;MENDELEY_CITATION_53ec8ca4-926d-45ce-9e2b-95b029699543&quot;,&quot;properties&quot;:{&quot;noteIndex&quot;:0},&quot;isEdited&quot;:false,&quot;manualOverride&quot;:{&quot;isManuallyOverridden&quot;:false,&quot;citeprocText&quot;:&quot;(Fama, 1970)&quot;,&quot;manualOverrideText&quot;:&quot;&quot;},&quot;citationTag&quot;:&quot;MENDELEY_CITATION_v3_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&quot;,&quot;citationItems&quot;:[{&quot;id&quot;:&quot;091e2749-aa60-3c2d-9cc3-1cdad11b5547&quot;,&quot;itemData&quot;:{&quot;type&quot;:&quot;article-journal&quot;,&quot;id&quot;:&quot;091e2749-aa60-3c2d-9cc3-1cdad11b5547&quot;,&quot;title&quot;:&quot;Efficient Capital Markets: A Review of Theory and Empirical Work&quot;,&quot;groupId&quot;:&quot;092e372d-c067-3fdb-b3f7-8bafafb41bf5&quot;,&quot;author&quot;:[{&quot;family&quot;:&quot;Fama&quot;,&quot;given&quot;:&quot;Eugene F.&quot;,&quot;parse-names&quot;:false,&quot;dropping-particle&quot;:&quot;&quot;,&quot;non-dropping-particle&quot;:&quot;&quot;}],&quot;container-title&quot;:&quot;The Journal of Finance&quot;,&quot;container-title-short&quot;:&quot;J. Finance&quot;,&quot;accessed&quot;:{&quot;date-parts&quot;:[[2026,4,29]]},&quot;DOI&quot;:&quot;10.2307/2325486&quot;,&quot;ISSN&quot;:&quot;00221082&quot;,&quot;issued&quot;:{&quot;date-parts&quot;:[[1970,5]]},&quot;page&quot;:&quot;383&quot;,&quot;abstract&quot;:&quot;N/A&quot;,&quot;publisher&quot;:&quot;JSTOR&quot;,&quot;issue&quot;:&quot;2&quot;,&quot;volume&quot;:&quot;25&quot;},&quot;isTemporary&quot;:false}]},{&quot;citationID&quot;:&quot;MENDELEY_CITATION_d73ada41-befa-4e0f-90bd-ae86af98ec82&quot;,&quot;properties&quot;:{&quot;noteIndex&quot;:0},&quot;isEdited&quot;:false,&quot;manualOverride&quot;:{&quot;isManuallyOverridden&quot;:false,&quot;citeprocText&quot;:&quot;(Malkiel, 2003)&quot;,&quot;manualOverrideText&quot;:&quot;&quot;},&quot;citationTag&quot;:&quot;MENDELEY_CITATION_v3_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&quot;,&quot;citationItems&quot;:[{&quot;id&quot;:&quot;1e3d3c72-ca45-32d2-ac4d-18f479bf6e02&quot;,&quot;itemData&quot;:{&quot;type&quot;:&quot;article-journal&quot;,&quot;id&quot;:&quot;1e3d3c72-ca45-32d2-ac4d-18f479bf6e02&quot;,&quot;title&quot;:&quot;The Efficient Market Hypothesis and Its Critics&quot;,&quot;groupId&quot;:&quot;092e372d-c067-3fdb-b3f7-8bafafb41bf5&quot;,&quot;author&quot;:[{&quot;family&quot;:&quot;Malkiel&quot;,&quot;given&quot;:&quot;Burton G&quot;,&quot;parse-names&quot;:false,&quot;dropping-particle&quot;:&quot;&quot;,&quot;non-dropping-particle&quot;:&quot;&quot;}],&quot;accessed&quot;:{&quot;date-parts&quot;:[[2026,4,29]]},&quot;issued&quot;:{&quot;date-parts&quot;:[[2003]]}},&quot;isTemporary&quot;:false}]},{&quot;citationID&quot;:&quot;MENDELEY_CITATION_d823a6e8-196a-49b3-bcc2-27a9685af0e9&quot;,&quot;properties&quot;:{&quot;noteIndex&quot;:0},&quot;isEdited&quot;:false,&quot;manualOverride&quot;:{&quot;isManuallyOverridden&quot;:false,&quot;citeprocText&quot;:&quot;(Levine &amp;#38; Zervos, 1996)&quot;,&quot;manualOverrideText&quot;:&quot;&quot;},&quot;citationTag&quot;:&quot;MENDELEY_CITATION_v3_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&quot;,&quot;citationItems&quot;:[{&quot;id&quot;:&quot;c54459cf-ae7c-3a20-8e06-1752f7983a75&quot;,&quot;itemData&quot;:{&quot;type&quot;:&quot;article-journal&quot;,&quot;id&quot;:&quot;c54459cf-ae7c-3a20-8e06-1752f7983a75&quot;,&quot;title&quot;:&quot;Stock Market Development and Long-Run Growth&quot;,&quot;groupId&quot;:&quot;092e372d-c067-3fdb-b3f7-8bafafb41bf5&quot;,&quot;author&quot;:[{&quot;family&quot;:&quot;Levine&quot;,&quot;given&quot;:&quot;Ross&quot;,&quot;parse-names&quot;:false,&quot;dropping-particle&quot;:&quot;&quot;,&quot;non-dropping-particle&quot;:&quot;&quot;},{&quot;family&quot;:&quot;Zervos&quot;,&quot;given&quot;:&quot;Sara&quot;,&quot;parse-names&quot;:false,&quot;dropping-particle&quot;:&quot;&quot;,&quot;non-dropping-particle&quot;:&quot;&quot;}],&quot;container-title&quot;:&quot;The World Bank Economic Review&quot;,&quot;container-title-short&quot;:&quot;World Bank Econ. Rev.&quot;,&quot;accessed&quot;:{&quot;date-parts&quot;:[[2026,5,6]]},&quot;DOI&quot;:&quot;10.1093/WBER/10.2.323&quot;,&quot;ISSN&quot;:&quot;0258-6770&quot;,&quot;URL&quot;:&quot;https://dx.doi.org/10.1093/wber/10.2.323&quot;,&quot;issued&quot;:{&quot;date-parts&quot;:[[1996,5,1]]},&quot;page&quot;:&quot;323-339&quot;,&quot;abstract&quot;:&quot;Is the financial system important for economic growth? One line of research argues that it is not; another line stresses the importance of the financial system in mobilizing savings, allocating capital, exerting corporate control, and easing risk management. Moreover, some theories provide a conceptual basis for the belief that larger, more efficient stock markets boost economic growth. This article examines whether there is a strong empirical association between stock market development and long-run economic growth. Cross-country growth regressions suggest that the predeter-mined component of stock market development is positively and robustly associated with long-run economic growth.&quot;,&quot;publisher&quot;:&quot;Oxford Academic&quot;,&quot;issue&quot;:&quot;2&quot;,&quot;volume&quot;:&quot;10&quot;},&quot;isTemporary&quot;:false}]},{&quot;citationID&quot;:&quot;MENDELEY_CITATION_597f96f4-553a-44a2-8dd3-addebd32ee68&quot;,&quot;properties&quot;:{&quot;noteIndex&quot;:0},&quot;isEdited&quot;:false,&quot;manualOverride&quot;:{&quot;isManuallyOverridden&quot;:false,&quot;citeprocText&quot;:&quot;(Levine &amp;#38; Zervos, 1996)&quot;,&quot;manualOverrideText&quot;:&quot;&quot;},&quot;citationTag&quot;:&quot;MENDELEY_CITATION_v3_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&quot;,&quot;citationItems&quot;:[{&quot;id&quot;:&quot;c54459cf-ae7c-3a20-8e06-1752f7983a75&quot;,&quot;itemData&quot;:{&quot;type&quot;:&quot;article-journal&quot;,&quot;id&quot;:&quot;c54459cf-ae7c-3a20-8e06-1752f7983a75&quot;,&quot;title&quot;:&quot;Stock Market Development and Long-Run Growth&quot;,&quot;groupId&quot;:&quot;092e372d-c067-3fdb-b3f7-8bafafb41bf5&quot;,&quot;author&quot;:[{&quot;family&quot;:&quot;Levine&quot;,&quot;given&quot;:&quot;Ross&quot;,&quot;parse-names&quot;:false,&quot;dropping-particle&quot;:&quot;&quot;,&quot;non-dropping-particle&quot;:&quot;&quot;},{&quot;family&quot;:&quot;Zervos&quot;,&quot;given&quot;:&quot;Sara&quot;,&quot;parse-names&quot;:false,&quot;dropping-particle&quot;:&quot;&quot;,&quot;non-dropping-particle&quot;:&quot;&quot;}],&quot;container-title&quot;:&quot;The World Bank Economic Review&quot;,&quot;container-title-short&quot;:&quot;World Bank Econ. Rev.&quot;,&quot;accessed&quot;:{&quot;date-parts&quot;:[[2026,5,6]]},&quot;DOI&quot;:&quot;10.1093/WBER/10.2.323&quot;,&quot;ISSN&quot;:&quot;0258-6770&quot;,&quot;URL&quot;:&quot;https://dx.doi.org/10.1093/wber/10.2.323&quot;,&quot;issued&quot;:{&quot;date-parts&quot;:[[1996,5,1]]},&quot;page&quot;:&quot;323-339&quot;,&quot;abstract&quot;:&quot;Is the financial system important for economic growth? One line of research argues that it is not; another line stresses the importance of the financial system in mobilizing savings, allocating capital, exerting corporate control, and easing risk management. Moreover, some theories provide a conceptual basis for the belief that larger, more efficient stock markets boost economic growth. This article examines whether there is a strong empirical association between stock market development and long-run economic growth. Cross-country growth regressions suggest that the predeter-mined component of stock market development is positively and robustly associated with long-run economic growth.&quot;,&quot;publisher&quot;:&quot;Oxford Academic&quot;,&quot;issue&quot;:&quot;2&quot;,&quot;volume&quot;:&quot;10&quot;},&quot;isTemporary&quot;:false}]},{&quot;citationID&quot;:&quot;MENDELEY_CITATION_aa2b6abc-95eb-4667-801f-e1b162858949&quot;,&quot;properties&quot;:{&quot;noteIndex&quot;:0},&quot;isEdited&quot;:false,&quot;manualOverride&quot;:{&quot;isManuallyOverridden&quot;:false,&quot;citeprocText&quot;:&quot;(Shah et al., 2019)&quot;,&quot;manualOverrideText&quot;:&quot;&quot;},&quot;citationTag&quot;:&quot;MENDELEY_CITATION_v3_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&quot;,&quot;citationItems&quot;:[{&quot;id&quot;:&quot;8d1a3d32-6c56-311b-80d4-9313558321ef&quot;,&quot;itemData&quot;:{&quot;type&quot;:&quot;article-journal&quot;,&quot;id&quot;:&quot;8d1a3d32-6c56-311b-80d4-9313558321ef&quot;,&quot;title&quot;:&quot;Stock Market Analysis: A Review and Taxonomy of Prediction Techniques&quot;,&quot;groupId&quot;:&quot;092e372d-c067-3fdb-b3f7-8bafafb41bf5&quot;,&quot;author&quot;:[{&quot;family&quot;:&quot;Shah&quot;,&quot;given&quot;:&quot;Dev&quot;,&quot;parse-names&quot;:false,&quot;dropping-particle&quot;:&quot;&quot;,&quot;non-dropping-particle&quot;:&quot;&quot;},{&quot;family&quot;:&quot;Isah&quot;,&quot;given&quot;:&quot;Haruna&quot;,&quot;parse-names&quot;:false,&quot;dropping-particle&quot;:&quot;&quot;,&quot;non-dropping-particle&quot;:&quot;&quot;},{&quot;family&quot;:&quot;Zulkernine&quot;,&quot;given&quot;:&quot;Farhana&quot;,&quot;parse-names&quot;:false,&quot;dropping-particle&quot;:&quot;&quot;,&quot;non-dropping-particle&quot;:&quot;&quot;}],&quot;container-title&quot;:&quot;International Journal of Financial Studies 2019, Vol. 7, Page 26&quot;,&quot;accessed&quot;:{&quot;date-parts&quot;:[[2026,4,29]]},&quot;DOI&quot;:&quot;10.3390/IJFS7020026&quot;,&quot;ISSN&quot;:&quot;2227-7072&quot;,&quot;URL&quot;:&quot;https://www.mdpi.com/2227-7072/7/2/26/htm&quot;,&quot;issued&quot;:{&quot;date-parts&quot;:[[2019,5,27]]},&quot;page&quot;:&quot;26&quot;,&quot;abstract&quot;:&quot;Stock market prediction has always caught the attention of many analysts and researchers. Popular theories suggest that stock markets are essentially a random walk and it is a fool’s game to try and predict them. Predicting stock prices is a challenging problem in itself because of the number of variables which are involved. In the short term, the market behaves like a voting machine but in the longer term, it acts like a weighing machine and hence there is scope for predicting the market movements for a longer timeframe. Application of machine learning techniques and other algorithms for stock price analysis and forecasting is an area that shows great promise. In this paper, we first provide a concise review of stock markets and taxonomy of stock market prediction methods. We then focus on some of the research achievements in stock analysis and prediction. We discuss technical, fundamental, short- and long-term approaches used for stock analysis. Finally, we present some challenges and research opportunities in this field.&quot;,&quot;publisher&quot;:&quot;Multidisciplinary Digital Publishing Institute&quot;,&quot;issue&quot;:&quot;2&quot;,&quot;volume&quot;:&quot;7&quot;},&quot;isTemporary&quot;:false}]},{&quot;citationID&quot;:&quot;MENDELEY_CITATION_3f021c6d-2661-4bb4-9f03-f17b1b7e7780&quot;,&quot;properties&quot;:{&quot;noteIndex&quot;:0},&quot;isEdited&quot;:false,&quot;manualOverride&quot;:{&quot;isManuallyOverridden&quot;:false,&quot;citeprocText&quot;:&quot;(Shah et al., 2019)&quot;,&quot;manualOverrideText&quot;:&quot;&quot;},&quot;citationTag&quot;:&quot;MENDELEY_CITATION_v3_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&quot;,&quot;citationItems&quot;:[{&quot;id&quot;:&quot;8d1a3d32-6c56-311b-80d4-9313558321ef&quot;,&quot;itemData&quot;:{&quot;type&quot;:&quot;article-journal&quot;,&quot;id&quot;:&quot;8d1a3d32-6c56-311b-80d4-9313558321ef&quot;,&quot;title&quot;:&quot;Stock Market Analysis: A Review and Taxonomy of Prediction Techniques&quot;,&quot;groupId&quot;:&quot;092e372d-c067-3fdb-b3f7-8bafafb41bf5&quot;,&quot;author&quot;:[{&quot;family&quot;:&quot;Shah&quot;,&quot;given&quot;:&quot;Dev&quot;,&quot;parse-names&quot;:false,&quot;dropping-particle&quot;:&quot;&quot;,&quot;non-dropping-particle&quot;:&quot;&quot;},{&quot;family&quot;:&quot;Isah&quot;,&quot;given&quot;:&quot;Haruna&quot;,&quot;parse-names&quot;:false,&quot;dropping-particle&quot;:&quot;&quot;,&quot;non-dropping-particle&quot;:&quot;&quot;},{&quot;family&quot;:&quot;Zulkernine&quot;,&quot;given&quot;:&quot;Farhana&quot;,&quot;parse-names&quot;:false,&quot;dropping-particle&quot;:&quot;&quot;,&quot;non-dropping-particle&quot;:&quot;&quot;}],&quot;container-title&quot;:&quot;International Journal of Financial Studies 2019, Vol. 7, Page 26&quot;,&quot;accessed&quot;:{&quot;date-parts&quot;:[[2026,4,29]]},&quot;DOI&quot;:&quot;10.3390/IJFS7020026&quot;,&quot;ISSN&quot;:&quot;2227-7072&quot;,&quot;URL&quot;:&quot;https://www.mdpi.com/2227-7072/7/2/26/htm&quot;,&quot;issued&quot;:{&quot;date-parts&quot;:[[2019,5,27]]},&quot;page&quot;:&quot;26&quot;,&quot;abstract&quot;:&quot;Stock market prediction has always caught the attention of many analysts and researchers. Popular theories suggest that stock markets are essentially a random walk and it is a fool’s game to try and predict them. Predicting stock prices is a challenging problem in itself because of the number of variables which are involved. In the short term, the market behaves like a voting machine but in the longer term, it acts like a weighing machine and hence there is scope for predicting the market movements for a longer timeframe. Application of machine learning techniques and other algorithms for stock price analysis and forecasting is an area that shows great promise. In this paper, we first provide a concise review of stock markets and taxonomy of stock market prediction methods. We then focus on some of the research achievements in stock analysis and prediction. We discuss technical, fundamental, short- and long-term approaches used for stock analysis. Finally, we present some challenges and research opportunities in this field.&quot;,&quot;publisher&quot;:&quot;Multidisciplinary Digital Publishing Institute&quot;,&quot;issue&quot;:&quot;2&quot;,&quot;volume&quot;:&quot;7&quot;},&quot;isTemporary&quot;:false}]},{&quot;citationID&quot;:&quot;MENDELEY_CITATION_561b67f2-970f-4c32-bc18-f820a0e31dc7&quot;,&quot;properties&quot;:{&quot;noteIndex&quot;:0},&quot;isEdited&quot;:false,&quot;manualOverride&quot;:{&quot;isManuallyOverridden&quot;:false,&quot;citeprocText&quot;:&quot;(Bhowmik &amp;#38; Wang, 2020)&quot;,&quot;manualOverrideText&quot;:&quot;&quot;},&quot;citationTag&quot;:&quot;MENDELEY_CITATION_v3_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&quot;,&quot;citationItems&quot;:[{&quot;id&quot;:&quot;a64d61c2-6b38-3b78-8425-22fba9109072&quot;,&quot;itemData&quot;:{&quot;type&quot;:&quot;article-journal&quot;,&quot;id&quot;:&quot;a64d61c2-6b38-3b78-8425-22fba9109072&quot;,&quot;title&quot;:&quot;Stock Market Volatility and Return Analysis: A Systematic Literature Review&quot;,&quot;groupId&quot;:&quot;092e372d-c067-3fdb-b3f7-8bafafb41bf5&quot;,&quot;author&quot;:[{&quot;family&quot;:&quot;Bhowmik&quot;,&quot;given&quot;:&quot;Roni&quot;,&quot;parse-names&quot;:false,&quot;dropping-particle&quot;:&quot;&quot;,&quot;non-dropping-particle&quot;:&quot;&quot;},{&quot;family&quot;:&quot;Wang&quot;,&quot;given&quot;:&quot;Shouyang&quot;,&quot;parse-names&quot;:false,&quot;dropping-particle&quot;:&quot;&quot;,&quot;non-dropping-particle&quot;:&quot;&quot;}],&quot;container-title&quot;:&quot;Entropy&quot;,&quot;accessed&quot;:{&quot;date-parts&quot;:[[2026,5,11]]},&quot;DOI&quot;:&quot;10.3390/E22050522&quot;,&quot;ISSN&quot;:&quot;10994300&quot;,&quot;PMID&quot;:&quot;33286294&quot;,&quot;URL&quot;:&quot;https://pmc.ncbi.nlm.nih.gov/articles/PMC7517016/&quot;,&quot;issued&quot;:{&quot;date-parts&quot;:[[2020,5,1]]},&quot;page&quot;:&quot;522&quot;,&quot;abstract&quot;:&quot;In the field of business research method, a literature review is more relevant than ever. Even though there has been lack of integrity and inflexibility in traditional literature reviews with questions being raised about the quality and trustworthiness of these types of reviews. This research provides a literature review using a systematic database to examine and cross-reference snowballing. In this paper, previous studies featuring a generalized autoregressive conditional heteroskedastic (GARCH) family-based model stock market return and volatility have also been reviewed. The stock market plays a pivotal role in today's world economic activities, named a \&quot;barometer\&quot; and \&quot;alarm\&quot; for economic and financial activities in a country or region. In order to prevent uncertainty and risk in the stock market, it is particularly important to measure effectively the volatility of stock index returns. However, the main purpose of this review is to examine effective GARCH models recommended for performing market returns and volatilities analysis. The secondary purpose of this review study is to conduct a content analysis of return and volatility literature reviews over a period of 12 years (2008-2019) and in 50 different papers. The study found that there has been a significant change in research work within the past 10 years and most of researchers have worked for developing stock markets.&quot;,&quot;publisher&quot;:&quot;MDPI AG&quot;,&quot;issue&quot;:&quot;5&quot;,&quot;volume&quot;:&quot;22&quot;},&quot;isTemporary&quot;:false}]},{&quot;citationID&quot;:&quot;MENDELEY_CITATION_fbdf081d-acc2-4588-a10c-c38ca93b777b&quot;,&quot;properties&quot;:{&quot;noteIndex&quot;:0},&quot;isEdited&quot;:false,&quot;manualOverride&quot;:{&quot;isManuallyOverridden&quot;:false,&quot;citeprocText&quot;:&quot;(Granger &amp;#38; Poon, 2002)&quot;,&quot;manualOverrideText&quot;:&quot;&quot;},&quot;citationTag&quot;:&quot;MENDELEY_CITATION_v3_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&quot;,&quot;citationItems&quot;:[{&quot;id&quot;:&quot;b3fac26e-02d5-3c65-b1ac-9b1261682811&quot;,&quot;itemData&quot;:{&quot;type&quot;:&quot;article-journal&quot;,&quot;id&quot;:&quot;b3fac26e-02d5-3c65-b1ac-9b1261682811&quot;,&quot;title&quot;:&quot;Forecasting Volatility in Financial Markets: A Review (Revised Edition)&quot;,&quot;groupId&quot;:&quot;092e372d-c067-3fdb-b3f7-8bafafb41bf5&quot;,&quot;author&quot;:[{&quot;family&quot;:&quot;Granger&quot;,&quot;given&quot;:&quot;Clive W. J.&quot;,&quot;parse-names&quot;:false,&quot;dropping-particle&quot;:&quot;&quot;,&quot;non-dropping-particle&quot;:&quot;&quot;},{&quot;family&quot;:&quot;Poon&quot;,&quot;given&quot;:&quot;Ser-Huang&quot;,&quot;parse-names&quot;:false,&quot;dropping-particle&quot;:&quot;&quot;,&quot;non-dropping-particle&quot;:&quot;&quot;}],&quot;container-title&quot;:&quot;SSRN Electronic Journal&quot;,&quot;accessed&quot;:{&quot;date-parts&quot;:[[2026,5,11]]},&quot;DOI&quot;:&quot;10.2139/SSRN.331800&quot;,&quot;URL&quot;:&quot;https://papers.ssrn.com/abstract=331800&quot;,&quot;issued&quot;:{&quot;date-parts&quot;:[[2002,9,18]]},&quot;abstract&quot;:&quot;Financial market volatility is an important input for investment, option pricing and financial market regulation. In this review article, we compare the volatility forecasting findings in 93 papers published and written in the last two decades. This article is written for general readers in Economics, and its emphasis is on forecasting instead of modelling. We separate the literature into two main streams; the first consists of research papers that formulate volatility forecasts based on historical price information only, while the second includes research papers that make use of volatility implied in option prices.    Provided in this paper as well are volatility definitions, insights into problematic issues of forecast evaluation, the effect of data frequency on volatility forecast accuracy, measurement of \&quot;actual\&quot; volatility, and the confounding effect of extreme values on volatility forecasting performance. We compare volatility forecasting results across different asset classes, and markets in different geographical regions. Suggestions are made for future research.&quot;,&quot;publisher&quot;:&quot;Elsevier BV&quot;},&quot;isTemporary&quot;:false}]},{&quot;citationID&quot;:&quot;MENDELEY_CITATION_9e6b5f0d-12ef-4c86-8dfe-a3a2121b613b&quot;,&quot;properties&quot;:{&quot;noteIndex&quot;:0},&quot;isEdited&quot;:false,&quot;manualOverride&quot;:{&quot;isManuallyOverridden&quot;:false,&quot;citeprocText&quot;:&quot;(Granger &amp;#38; Poon, 2002)&quot;,&quot;manualOverrideText&quot;:&quot;&quot;},&quot;citationTag&quot;:&quot;MENDELEY_CITATION_v3_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&quot;,&quot;citationItems&quot;:[{&quot;id&quot;:&quot;b3fac26e-02d5-3c65-b1ac-9b1261682811&quot;,&quot;itemData&quot;:{&quot;type&quot;:&quot;article-journal&quot;,&quot;id&quot;:&quot;b3fac26e-02d5-3c65-b1ac-9b1261682811&quot;,&quot;title&quot;:&quot;Forecasting Volatility in Financial Markets: A Review (Revised Edition)&quot;,&quot;groupId&quot;:&quot;092e372d-c067-3fdb-b3f7-8bafafb41bf5&quot;,&quot;author&quot;:[{&quot;family&quot;:&quot;Granger&quot;,&quot;given&quot;:&quot;Clive W. J.&quot;,&quot;parse-names&quot;:false,&quot;dropping-particle&quot;:&quot;&quot;,&quot;non-dropping-particle&quot;:&quot;&quot;},{&quot;family&quot;:&quot;Poon&quot;,&quot;given&quot;:&quot;Ser-Huang&quot;,&quot;parse-names&quot;:false,&quot;dropping-particle&quot;:&quot;&quot;,&quot;non-dropping-particle&quot;:&quot;&quot;}],&quot;container-title&quot;:&quot;SSRN Electronic Journal&quot;,&quot;accessed&quot;:{&quot;date-parts&quot;:[[2026,5,11]]},&quot;DOI&quot;:&quot;10.2139/SSRN.331800&quot;,&quot;URL&quot;:&quot;https://papers.ssrn.com/abstract=331800&quot;,&quot;issued&quot;:{&quot;date-parts&quot;:[[2002,9,18]]},&quot;abstract&quot;:&quot;Financial market volatility is an important input for investment, option pricing and financial market regulation. In this review article, we compare the volatility forecasting findings in 93 papers published and written in the last two decades. This article is written for general readers in Economics, and its emphasis is on forecasting instead of modelling. We separate the literature into two main streams; the first consists of research papers that formulate volatility forecasts based on historical price information only, while the second includes research papers that make use of volatility implied in option prices.    Provided in this paper as well are volatility definitions, insights into problematic issues of forecast evaluation, the effect of data frequency on volatility forecast accuracy, measurement of \&quot;actual\&quot; volatility, and the confounding effect of extreme values on volatility forecasting performance. We compare volatility forecasting results across different asset classes, and markets in different geographical regions. Suggestions are made for future research.&quot;,&quot;publisher&quot;:&quot;Elsevier BV&quot;},&quot;isTemporary&quot;:false}]},{&quot;citationID&quot;:&quot;MENDELEY_CITATION_ab1897df-4cb5-40ff-b6ac-23f8a1686409&quot;,&quot;properties&quot;:{&quot;noteIndex&quot;:0},&quot;isEdited&quot;:false,&quot;manualOverride&quot;:{&quot;isManuallyOverridden&quot;:false,&quot;citeprocText&quot;:&quot;(Degiannakis &amp;#38; Xekalaki, 2004)&quot;,&quot;manualOverrideText&quot;:&quot;&quot;},&quot;citationTag&quot;:&quot;MENDELEY_CITATION_v3_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&quot;,&quot;citationItems&quot;:[{&quot;id&quot;:&quot;e7aa9298-cd46-3749-b86d-5b0b63c1d98e&quot;,&quot;itemData&quot;:{&quot;type&quot;:&quot;article-journal&quot;,&quot;id&quot;:&quot;e7aa9298-cd46-3749-b86d-5b0b63c1d98e&quot;,&quot;title&quot;:&quot;Autoregressive Conditional Heteroscedasticity (ARCH) Models: A Review&quot;,&quot;groupId&quot;:&quot;092e372d-c067-3fdb-b3f7-8bafafb41bf5&quot;,&quot;author&quot;:[{&quot;family&quot;:&quot;Degiannakis&quot;,&quot;given&quot;:&quot;Stavros&quot;,&quot;parse-names&quot;:false,&quot;dropping-particle&quot;:&quot;&quot;,&quot;non-dropping-particle&quot;:&quot;&quot;},{&quot;family&quot;:&quot;Xekalaki&quot;,&quot;given&quot;:&quot;Evdokia&quot;,&quot;parse-names&quot;:false,&quot;dropping-particle&quot;:&quot;&quot;,&quot;non-dropping-particle&quot;:&quot;&quot;}],&quot;container-title&quot;:&quot;Quality Technology &amp; Quantitative Management&quot;,&quot;container-title-short&quot;:&quot;Qual. Technol. Quant. Manag.&quot;,&quot;accessed&quot;:{&quot;date-parts&quot;:[[2026,5,22]]},&quot;DOI&quot;:&quot;10.1080/16843703.2004.11673078&quot;,&quot;URL&quot;:&quot;https://www.tandfonline.com/doi/abs/10.1080/16843703.2004.11673078&quot;,&quot;issued&quot;:{&quot;date-parts&quot;:[[2004,1]]},&quot;page&quot;:&quot;271-324&quot;,&quot;abstract&quot;:&quot;Autoregressive Conditional Heteroscedasticity (ARCH) models have successfully been employed in order to predict asset return volatility. Predicting volatility is of great importance in pricing financial derivatives, selecting portfolios, measuring and managing investment risk more accurately. In this paper, a number of univariate and multivariate ARCH models, their estimating methods and the characteristics of financial time series, which are captured by volatility models, are presented. The number of possible conditional volatility formulations is vast. Therefore, a systematic presentation of the models that have been considered in the ARCH literature can be useful in guiding one's choice of a model for exploiting future volatility, with applications in financial markets.&quot;,&quot;publisher&quot;:&quot;Taylor &amp; Francis&quot;,&quot;issue&quot;:&quot;2&quot;,&quot;volume&quot;:&quot;1&quot;},&quot;isTemporary&quot;:false}]},{&quot;citationID&quot;:&quot;MENDELEY_CITATION_02c5d2c2-967e-4aa7-92d9-3ab98f4fe8c0&quot;,&quot;properties&quot;:{&quot;noteIndex&quot;:0},&quot;isEdited&quot;:false,&quot;manualOverride&quot;:{&quot;isManuallyOverridden&quot;:false,&quot;citeprocText&quot;:&quot;(Engle, 2001)&quot;,&quot;manualOverrideText&quot;:&quot;&quot;},&quot;citationTag&quot;:&quot;MENDELEY_CITATION_v3_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&quot;,&quot;citationItems&quot;:[{&quot;id&quot;:&quot;4f79c79b-58ab-3218-a819-62e6762e5d5b&quot;,&quot;itemData&quot;:{&quot;type&quot;:&quot;article-journal&quot;,&quot;id&quot;:&quot;4f79c79b-58ab-3218-a819-62e6762e5d5b&quot;,&quot;title&quot;:&quot;GARCH 101: The Use of ARCH/GARCH Models in Applied Econometrics&quot;,&quot;groupId&quot;:&quot;092e372d-c067-3fdb-b3f7-8bafafb41bf5&quot;,&quot;author&quot;:[{&quot;family&quot;:&quot;Engle&quot;,&quot;given&quot;:&quot;Robert&quot;,&quot;parse-names&quot;:false,&quot;dropping-particle&quot;:&quot;&quot;,&quot;non-dropping-particle&quot;:&quot;&quot;}],&quot;container-title&quot;:&quot;Journal of Economic Perspectives&quot;,&quot;accessed&quot;:{&quot;date-parts&quot;:[[2026,5,22]]},&quot;DOI&quot;:&quot;10.1257/JEP.15.4.157&quot;,&quot;ISSN&quot;:&quot;0895-3309&quot;,&quot;issued&quot;:{&quot;date-parts&quot;:[[2001]]},&quot;page&quot;:&quot;157-168&quot;,&quot;abstract&quot;:&quot;T he great workhorse of applied econometrics is the least squares model. This is a natural choice, because applied econometricians are typically called upon to determine how much one variable will change in response to a change in some other variable. Increasingly however, econometricians are being asked to forecast and analyze the size of the errors of the model. In this case, the questions are about volatility, and the standard tools have become the ARCH/ GARCH models. The basic version of the least squares model assumes that the expected value of all error terms, when squared, is the same at any given point. This assumption is called homoskedasticity, and it is this assumption that is the focus of ARCH/ GARCH models. Data in which the variances of the error terms are not equal, in which the error terms may reasonably be expected to be larger for some points or ranges of the data than for others, are said to suffer from heteroskedasticity. The standard warning is that in the presence of heteroskedasticity, the regression coefficients for an ordinary least squares regression are still unbiased, but the standard errors and confidence intervals estimated by conventional procedures will be too narrow, giving a false sense of precision. Instead of considering this as a problem to be corrected, ARCH and GARCH models treat heteroskedasticity as a variance to be modeled. As a result, not only are the deficiencies of least squares corrected, but a prediction is computed for the variance of each error term. This prediction turns out often to be of interest, particularly in applications in finance.&quot;,&quot;publisher&quot;:&quot;American Economic Association&quot;,&quot;issue&quot;:&quot;4&quot;,&quot;volume&quot;:&quot;15&quot;,&quot;container-title-short&quot;:&quot;&quot;},&quot;isTemporary&quot;:false}]}]"/>
     <we:property name="MENDELEY_CITATIONS_STYLE" value="{&quot;id&quot;:&quot;https://www.zotero.org/styles/apa&quot;,&quot;title&quot;:&quot;APA Style 7th edition&quot;,&quot;format&quot;:&quot;author-date&quot;,&quot;defaultLocale&quot;:null,&quot;isLocaleCodeValid&quot;:true}"/>
   </we:properties>
   <we:bindings/>

</xml_diff>